<commit_message>
More report Writing and CSV functionality
Also changed input files from part of solution to folder on desktop the program makes
</commit_message>
<xml_diff>
--- a/Rapport/Hovedopgave Rapport.docx
+++ b/Rapport/Hovedopgave Rapport.docx
@@ -322,16 +322,102 @@
     </w:p>
     <w:p>
       <w:pPr>
+        <w:rPr>
+          <w:rFonts w:asciiTheme="majorHAnsi" w:eastAsiaTheme="majorEastAsia" w:hAnsiTheme="majorHAnsi" w:cstheme="majorBidi"/>
+          <w:color w:val="0F4761" w:themeColor="accent1" w:themeShade="BF"/>
+          <w:sz w:val="40"/>
+          <w:szCs w:val="40"/>
+        </w:rPr>
+      </w:pPr>
+      <w:r>
+        <w:br w:type="page"/>
+      </w:r>
+    </w:p>
+    <w:p>
+      <w:pPr>
         <w:pStyle w:val="Heading1"/>
       </w:pPr>
       <w:r>
+        <w:lastRenderedPageBreak/>
         <w:t>Problemdomæne</w:t>
+      </w:r>
+    </w:p>
+    <w:p>
+      <w:r>
+        <w:t xml:space="preserve">Når man gerne vil have sit produkt ud i verden, kræver det en god strategi. En stor del af ens strategi er grundet i hvilket produkt man laver. Hvis man laver en køkkensvamp, er ens målgruppe en gennemsnitlig person. Men den kunne også være et industrielt køkken. Man kan dermed sige at man kan sælge få svampe til mange mennesker, eller mange svampe til få institutioner. Dette er det samme problem som GoFact også har siddet med. De har et software som er godt til at sænke spild, og øge vækst for tøjbutikker. Men </w:t>
+      </w:r>
+      <w:r>
+        <w:t xml:space="preserve">hvem skal man fokusere på? Hvis man kunne tilkoble alt og alle til systemet ville man kunne gøre begge nemt, men det er ikke sådan det virker for GoFact, på grund af deres ”kom som </w:t>
+      </w:r>
+      <w:proofErr w:type="gramStart"/>
+      <w:r>
+        <w:t>i</w:t>
+      </w:r>
+      <w:proofErr w:type="gramEnd"/>
+      <w:r>
+        <w:t xml:space="preserve"> er” mentalitet. Det gør det nemmere for nye kunder at tilkoble GoFact fra kundernes side, men for GoFact skal de vælge hvilke kunder de tager ind med lidt omhu, da det tager GoFact en del mandtimer for at få tilkoblet en ny kunde. Det er også der deres største udgift ligger, da deres abonnement model gør at de ikke skal tænke mere på en kunde efter de er opsat. </w:t>
+      </w:r>
+    </w:p>
+    <w:p>
+      <w:r>
+        <w:t xml:space="preserve">Det gør det lidt akavet for GoFact. De har et godt produkt, som de har bevis på at de sparer butikker mange penge </w:t>
+      </w:r>
+      <w:proofErr w:type="gramStart"/>
+      <w:r>
+        <w:t>hvert måned</w:t>
+      </w:r>
+      <w:proofErr w:type="gramEnd"/>
+      <w:r>
+        <w:t>, og mindsker tøj-spild. Der er også mange butikker som gerne vil blive en del af GoFact systemet, men da det ikke er alle der ville kunne få lige så stor værdi af det, kan det være at nogle går fra efter det hele er opsat. Det er et stort problem for GoFact hvis en kunde går fra, da de i opstarten af en ny kunde laver meget ”gratis” arbejde, i det at de ikke tager penge for opsætning, bare den månedlige pris. Det betyder at hvis en kunde tager 250 timer at få sat op, og de går af efter første måned, kunne GoFact tabe mange penge, da de tjener tabet op i de følgende måneder.</w:t>
+      </w:r>
+    </w:p>
+    <w:p>
+      <w:r>
+        <w:t>Kunderne kan nemlig gå fra for flere årsager. Det kunne være at de ikke ville bruge systemet alligevel hvis det bare ikke går nemt ind i deres IT Pipeline. Hvis de ikke kan se en tydelig værdi i de første måneder.</w:t>
+      </w:r>
+      <w:r>
+        <w:t xml:space="preserve"> Hvis deres budget ikke har plads til en ekstra IT-system. Eller hvis de skærer ned i mængden af eksterne systemer. </w:t>
+      </w:r>
+    </w:p>
+    <w:p>
+      <w:r>
+        <w:t xml:space="preserve">Den sidste lyder ikke så mulig, men for nylig havde GoFact en stor kunde som de var i gang med at få ind i deres system. De havde snakket frem og tilbage med forskellige personer og afdelinger hos denne store kunde, i over et års tid. Det havde været et kæmpe tab for GoFact, men hvis de kunne få det hele til at virke, havde de fået en massiv kunde ind, og ville have tjent mange penge hver måned som resultat. I dette års tid havde der været skrevet mange linjer kode. Skrevet mange custom løsninger til lige netop denne kunde. Men de endte med at rydde op i deres eksterne IT-systemer, og dermed var alt det arbejde fra GoFacts’ side ligegyldigt. </w:t>
+      </w:r>
+    </w:p>
+    <w:p>
+      <w:r>
+        <w:br w:type="page"/>
+      </w:r>
+    </w:p>
+    <w:p>
+      <w:r>
+        <w:lastRenderedPageBreak/>
+        <w:t xml:space="preserve">Det var en kæmpe sats, som ikke betalte sig alligevel. Og det er her deres nuværende business strategi fejler. Hvis de kan få deres store kunder ind ad døren, er det en kæmpe succes. Men hvad hvis de ikke kan det? Hvad hvis kunden går fra for ingen skyld af GoFact? Deres strategi gør at hver kunde er meget vigtige for dem, og dermed kan hver eneste kunde der går fra være et kæmpe tab for dem. Man kan sige at de er meget følsomme for ændringer i markedet, og det kan ses som et problem. </w:t>
+      </w:r>
+    </w:p>
+    <w:p>
+      <w:r>
+        <w:t xml:space="preserve">Så hvad kan et fix til dette problem være? Få flere kunder ind. Få mange, mindre, kunder ind ad døren, så den kollektive mængde </w:t>
+      </w:r>
+      <w:r>
+        <w:t xml:space="preserve">kunne gøre tab mindre vigtige. Det ville give en sikkerhed hvis en stor kunde går fra, da de stadig har mange forskellige kunder som ikke ville gå fra dem på samme tid. Der kunne stadig være mange kunder der går fra, hvis en ekstern ekstrem handling sker (som en anden Corona virus, </w:t>
+      </w:r>
+      <w:proofErr w:type="spellStart"/>
+      <w:r>
+        <w:t>ect</w:t>
+      </w:r>
+      <w:proofErr w:type="spellEnd"/>
+      <w:r>
+        <w:t>.). Men det ville give en sikkerhed i normale tider som de ikke pt har.</w:t>
+      </w:r>
+    </w:p>
+    <w:p>
+      <w:r>
+        <w:t>Men så kommer vi tilbage til deres hovedproblem. Hvordan får man flere kunder ind, når man allerede bruger alle mænd til at få kunder ind? Man kigger på hvor tiden går hen. På GoFact er hoveddelen af tiden brugt på at skrive custom pipelines til de individuelle kunder. Men en stor del af tiden går også til at evaluere, og snakke med potentielle kunder, for at se hvem der kunne have størst chance for at blive efter</w:t>
       </w:r>
     </w:p>
     <w:p/>
     <w:p/>
-    <w:p/>
-    <w:p/>
     <w:p>
       <w:pPr>
         <w:pStyle w:val="Heading1"/>
@@ -375,12 +461,12 @@
           <w:numId w:val="1"/>
         </w:numPr>
         <w:rPr>
-          <w:highlight w:val="yellow"/>
-        </w:rPr>
-      </w:pPr>
-      <w:r>
-        <w:rPr>
-          <w:highlight w:val="yellow"/>
+          <w:highlight w:val="green"/>
+        </w:rPr>
+      </w:pPr>
+      <w:r>
+        <w:rPr>
+          <w:highlight w:val="green"/>
         </w:rPr>
         <w:t>Intro</w:t>
       </w:r>
@@ -393,12 +479,12 @@
           <w:numId w:val="1"/>
         </w:numPr>
         <w:rPr>
-          <w:highlight w:val="yellow"/>
-        </w:rPr>
-      </w:pPr>
-      <w:r>
-        <w:rPr>
-          <w:highlight w:val="yellow"/>
+          <w:highlight w:val="green"/>
+        </w:rPr>
+      </w:pPr>
+      <w:r>
+        <w:rPr>
+          <w:highlight w:val="green"/>
         </w:rPr>
         <w:t>Kort introduktion</w:t>
       </w:r>
@@ -411,12 +497,12 @@
           <w:numId w:val="1"/>
         </w:numPr>
         <w:rPr>
-          <w:highlight w:val="yellow"/>
-        </w:rPr>
-      </w:pPr>
-      <w:r>
-        <w:rPr>
-          <w:highlight w:val="yellow"/>
+          <w:highlight w:val="green"/>
+        </w:rPr>
+      </w:pPr>
+      <w:r>
+        <w:rPr>
+          <w:highlight w:val="green"/>
         </w:rPr>
         <w:t>Problemformulering</w:t>
       </w:r>
@@ -429,12 +515,12 @@
           <w:numId w:val="1"/>
         </w:numPr>
         <w:rPr>
-          <w:highlight w:val="yellow"/>
-        </w:rPr>
-      </w:pPr>
-      <w:r>
-        <w:rPr>
-          <w:highlight w:val="yellow"/>
+          <w:highlight w:val="green"/>
+        </w:rPr>
+      </w:pPr>
+      <w:r>
+        <w:rPr>
+          <w:highlight w:val="green"/>
         </w:rPr>
         <w:t>Afgrænsning</w:t>
       </w:r>
@@ -447,18 +533,18 @@
           <w:numId w:val="1"/>
         </w:numPr>
         <w:rPr>
-          <w:highlight w:val="yellow"/>
-        </w:rPr>
-      </w:pPr>
-      <w:r>
-        <w:rPr>
-          <w:highlight w:val="yellow"/>
+          <w:highlight w:val="green"/>
+        </w:rPr>
+      </w:pPr>
+      <w:r>
+        <w:rPr>
+          <w:highlight w:val="green"/>
         </w:rPr>
         <w:t>2 Sider</w:t>
       </w:r>
       <w:r>
         <w:rPr>
-          <w:highlight w:val="yellow"/>
+          <w:highlight w:val="green"/>
         </w:rPr>
         <w:t xml:space="preserve"> mål</w:t>
       </w:r>
@@ -471,12 +557,12 @@
           <w:numId w:val="1"/>
         </w:numPr>
         <w:rPr>
-          <w:highlight w:val="yellow"/>
-        </w:rPr>
-      </w:pPr>
-      <w:r>
-        <w:rPr>
-          <w:highlight w:val="yellow"/>
+          <w:highlight w:val="green"/>
+        </w:rPr>
+      </w:pPr>
+      <w:r>
+        <w:rPr>
+          <w:highlight w:val="green"/>
         </w:rPr>
         <w:t>2.6 sider skrevet</w:t>
       </w:r>
@@ -550,31 +636,31 @@
         </w:numPr>
       </w:pPr>
       <w:r>
+        <w:t>Problemdomæne</w:t>
+      </w:r>
+    </w:p>
+    <w:p>
+      <w:pPr>
+        <w:pStyle w:val="ListParagraph"/>
+        <w:numPr>
+          <w:ilvl w:val="1"/>
+          <w:numId w:val="1"/>
+        </w:numPr>
+      </w:pPr>
+      <w:r>
+        <w:t>Husk: Censor og vejleder kender det ikke!</w:t>
+      </w:r>
+    </w:p>
+    <w:p>
+      <w:pPr>
+        <w:pStyle w:val="ListParagraph"/>
+        <w:numPr>
+          <w:ilvl w:val="1"/>
+          <w:numId w:val="1"/>
+        </w:numPr>
+      </w:pPr>
+      <w:r>
         <w:lastRenderedPageBreak/>
-        <w:t>Problemdomæne</w:t>
-      </w:r>
-    </w:p>
-    <w:p>
-      <w:pPr>
-        <w:pStyle w:val="ListParagraph"/>
-        <w:numPr>
-          <w:ilvl w:val="1"/>
-          <w:numId w:val="1"/>
-        </w:numPr>
-      </w:pPr>
-      <w:r>
-        <w:t>Husk: Censor og vejleder kender det ikke!</w:t>
-      </w:r>
-    </w:p>
-    <w:p>
-      <w:pPr>
-        <w:pStyle w:val="ListParagraph"/>
-        <w:numPr>
-          <w:ilvl w:val="1"/>
-          <w:numId w:val="1"/>
-        </w:numPr>
-      </w:pPr>
-      <w:r>
         <w:t xml:space="preserve">Kravspecifikation </w:t>
       </w:r>
     </w:p>
@@ -1473,71 +1559,71 @@
         <w:rPr>
           <w:lang w:val="en-US"/>
         </w:rPr>
+        <w:t xml:space="preserve">Ser </w:t>
+      </w:r>
+      <w:proofErr w:type="spellStart"/>
+      <w:r>
+        <w:rPr>
+          <w:lang w:val="en-US"/>
+        </w:rPr>
+        <w:t>fremad</w:t>
+      </w:r>
+      <w:proofErr w:type="spellEnd"/>
+      <w:r>
+        <w:rPr>
+          <w:lang w:val="en-US"/>
+        </w:rPr>
+        <w:t>.</w:t>
+      </w:r>
+    </w:p>
+    <w:p>
+      <w:pPr>
+        <w:pStyle w:val="ListParagraph"/>
+        <w:numPr>
+          <w:ilvl w:val="2"/>
+          <w:numId w:val="1"/>
+        </w:numPr>
+        <w:rPr>
+          <w:lang w:val="en-US"/>
+        </w:rPr>
+      </w:pPr>
+      <w:r>
+        <w:rPr>
+          <w:lang w:val="en-US"/>
+        </w:rPr>
+        <w:t xml:space="preserve">Hold det </w:t>
+      </w:r>
+      <w:proofErr w:type="spellStart"/>
+      <w:r>
+        <w:rPr>
+          <w:lang w:val="en-US"/>
+        </w:rPr>
+        <w:t>kort</w:t>
+      </w:r>
+      <w:proofErr w:type="spellEnd"/>
+      <w:r>
+        <w:rPr>
+          <w:lang w:val="en-US"/>
+        </w:rPr>
+        <w:t>.</w:t>
+      </w:r>
+    </w:p>
+    <w:p>
+      <w:pPr>
+        <w:pStyle w:val="ListParagraph"/>
+        <w:numPr>
+          <w:ilvl w:val="2"/>
+          <w:numId w:val="1"/>
+        </w:numPr>
+        <w:rPr>
+          <w:lang w:val="en-US"/>
+        </w:rPr>
+      </w:pPr>
+      <w:r>
+        <w:rPr>
+          <w:lang w:val="en-US"/>
+        </w:rPr>
         <w:lastRenderedPageBreak/>
-        <w:t xml:space="preserve">Ser </w:t>
-      </w:r>
-      <w:proofErr w:type="spellStart"/>
-      <w:r>
-        <w:rPr>
-          <w:lang w:val="en-US"/>
-        </w:rPr>
-        <w:t>fremad</w:t>
-      </w:r>
-      <w:proofErr w:type="spellEnd"/>
-      <w:r>
-        <w:rPr>
-          <w:lang w:val="en-US"/>
-        </w:rPr>
-        <w:t>.</w:t>
-      </w:r>
-    </w:p>
-    <w:p>
-      <w:pPr>
-        <w:pStyle w:val="ListParagraph"/>
-        <w:numPr>
-          <w:ilvl w:val="2"/>
-          <w:numId w:val="1"/>
-        </w:numPr>
-        <w:rPr>
-          <w:lang w:val="en-US"/>
-        </w:rPr>
-      </w:pPr>
-      <w:r>
-        <w:rPr>
-          <w:lang w:val="en-US"/>
-        </w:rPr>
-        <w:t xml:space="preserve">Hold det </w:t>
-      </w:r>
-      <w:proofErr w:type="spellStart"/>
-      <w:r>
-        <w:rPr>
-          <w:lang w:val="en-US"/>
-        </w:rPr>
-        <w:t>kort</w:t>
-      </w:r>
-      <w:proofErr w:type="spellEnd"/>
-      <w:r>
-        <w:rPr>
-          <w:lang w:val="en-US"/>
-        </w:rPr>
-        <w:t>.</w:t>
-      </w:r>
-    </w:p>
-    <w:p>
-      <w:pPr>
-        <w:pStyle w:val="ListParagraph"/>
-        <w:numPr>
-          <w:ilvl w:val="2"/>
-          <w:numId w:val="1"/>
-        </w:numPr>
-        <w:rPr>
-          <w:lang w:val="en-US"/>
-        </w:rPr>
-      </w:pPr>
-      <w:r>
-        <w:rPr>
-          <w:lang w:val="en-US"/>
-        </w:rPr>
         <w:t xml:space="preserve">Ca. 1 </w:t>
       </w:r>
       <w:r>
@@ -3291,6 +3377,7 @@
   <w:style w:type="character" w:default="1" w:styleId="DefaultParagraphFont">
     <w:name w:val="Default Paragraph Font"/>
     <w:uiPriority w:val="1"/>
+    <w:semiHidden/>
     <w:unhideWhenUsed/>
   </w:style>
   <w:style w:type="table" w:default="1" w:styleId="TableNormal">

</xml_diff>

<commit_message>
Sorting within each size now too
</commit_message>
<xml_diff>
--- a/Rapport/Hovedopgave Rapport.docx
+++ b/Rapport/Hovedopgave Rapport.docx
@@ -420,9 +420,23 @@
     <w:p/>
     <w:p>
       <w:pPr>
+        <w:rPr>
+          <w:rFonts w:asciiTheme="majorHAnsi" w:eastAsiaTheme="majorEastAsia" w:hAnsiTheme="majorHAnsi" w:cstheme="majorBidi"/>
+          <w:color w:val="0F4761" w:themeColor="accent1" w:themeShade="BF"/>
+          <w:sz w:val="40"/>
+          <w:szCs w:val="40"/>
+        </w:rPr>
+      </w:pPr>
+      <w:r>
+        <w:br w:type="page"/>
+      </w:r>
+    </w:p>
+    <w:p>
+      <w:pPr>
         <w:pStyle w:val="Heading1"/>
       </w:pPr>
       <w:r>
+        <w:lastRenderedPageBreak/>
         <w:t>Afsnit og længde</w:t>
       </w:r>
     </w:p>
@@ -660,7 +674,6 @@
         </w:numPr>
       </w:pPr>
       <w:r>
-        <w:lastRenderedPageBreak/>
         <w:t xml:space="preserve">Kravspecifikation </w:t>
       </w:r>
     </w:p>
@@ -1149,6 +1162,7 @@
         </w:numPr>
       </w:pPr>
       <w:r>
+        <w:lastRenderedPageBreak/>
         <w:t>Beskriv og argumenter for designvalg.</w:t>
       </w:r>
       <w:r>
@@ -1623,7 +1637,6 @@
         <w:rPr>
           <w:lang w:val="en-US"/>
         </w:rPr>
-        <w:lastRenderedPageBreak/>
         <w:t xml:space="preserve">Ca. 1 </w:t>
       </w:r>
       <w:r>

</xml_diff>

<commit_message>
added multi color support for console
</commit_message>
<xml_diff>
--- a/Rapport/Hovedopgave Rapport.docx
+++ b/Rapport/Hovedopgave Rapport.docx
@@ -414,6 +414,141 @@
     <w:p>
       <w:r>
         <w:t>Men så kommer vi tilbage til deres hovedproblem. Hvordan får man flere kunder ind, når man allerede bruger alle mænd til at få kunder ind? Man kigger på hvor tiden går hen. På GoFact er hoveddelen af tiden brugt på at skrive custom pipelines til de individuelle kunder. Men en stor del af tiden går også til at evaluere, og snakke med potentielle kunder, for at se hvem der kunne have størst chance for at blive efter</w:t>
+      </w:r>
+      <w:r>
+        <w:t xml:space="preserve">. Hvis man kunne sænke denne tid, kunne man optimere hvor mange kunder man kan få ind ad døren på et år. </w:t>
+      </w:r>
+    </w:p>
+    <w:p>
+      <w:r>
+        <w:t>Med mindre butikker som ikke har for fastlagte IT-</w:t>
+      </w:r>
+      <w:proofErr w:type="gramStart"/>
+      <w:r>
+        <w:t>systemer</w:t>
+      </w:r>
+      <w:proofErr w:type="gramEnd"/>
+      <w:r>
+        <w:t xml:space="preserve"> kunne man også sige at de skal ændre deres data til en ”simplere” version af GoFact systemet, som ikke er custom lavet til dem. Man kunne give denne version en billigere pris, da GoFact ikke skal gøre noget for at få en ekstra kunde ind ad døren. Det ville også være mere attraktivt til små kunder at det er billigere for dem.</w:t>
+      </w:r>
+    </w:p>
+    <w:p>
+      <w:r>
+        <w:t xml:space="preserve">Dette er dog ikke hvad der er fokus på her. Vi </w:t>
+      </w:r>
+      <w:proofErr w:type="gramStart"/>
+      <w:r>
+        <w:t>fokusere</w:t>
+      </w:r>
+      <w:proofErr w:type="gramEnd"/>
+      <w:r>
+        <w:t xml:space="preserve"> på at sælge ideen til kunder. Vi skal dermed komme frem til et produkt der nemt kan vise hvad GoFact kan gøre for kunder. Det skal kunne hurtigt highlighte i en praktisk måde, hvad GoFact kan gøre for kunderne.</w:t>
+      </w:r>
+      <w:r>
+        <w:t xml:space="preserve"> For det kan vi kigge på hvad vores produkt skal kunne gøre, hvordan vi ville udføre dem, og hvad vi vælger at skære fra. </w:t>
+      </w:r>
+    </w:p>
+    <w:p>
+      <w:r>
+        <w:t xml:space="preserve">Det er også vigtigt at vi skærer funktioner fra, da vi prøver at sælge </w:t>
+      </w:r>
+      <w:proofErr w:type="gramStart"/>
+      <w:r>
+        <w:t>hoved ideen</w:t>
+      </w:r>
+      <w:proofErr w:type="gramEnd"/>
+      <w:r>
+        <w:t xml:space="preserve"> på GoFact. Det er en bedre salgs-pitch at komme med en god grund til at bruge en, i stedet for mange små. Da folk nemmere kan have små vigtige ting i hovedet, end mange små, mindre vigtige ting.</w:t>
+      </w:r>
+    </w:p>
+    <w:p>
+      <w:r>
+        <w:br w:type="page"/>
+      </w:r>
+    </w:p>
+    <w:p>
+      <w:pPr>
+        <w:pStyle w:val="Heading3"/>
+      </w:pPr>
+      <w:r>
+        <w:lastRenderedPageBreak/>
+        <w:t>Hvordan har vi tænkt os at vælge hvad produktet skal kunne?</w:t>
+      </w:r>
+    </w:p>
+    <w:p>
+      <w:r>
+        <w:t xml:space="preserve"> </w:t>
+      </w:r>
+      <w:r>
+        <w:t>Når man vælger hvad et produkt skal kunne, og hvad den ikke skal kunne, kan man bruge værktøjer til at hjælpe med dette. Det værktøj vi har tænkt os at gå frem med her hedder MoSCoW modellen. Den simplificerer hvad et produkt skal have for at det er en MVP (Minimal Viable Produkt) og hvad der gør den mere fuldendt. Ved at bruge MoSCoW modellen kan man også se nemt hvad man fravælger, og hvad man optimistisk håber man kan få i sit produkt inden en deadline.</w:t>
+      </w:r>
+    </w:p>
+    <w:p>
+      <w:r>
+        <w:rPr>
+          <w:highlight w:val="yellow"/>
+        </w:rPr>
+        <w:t>MoSCoW står for</w:t>
+      </w:r>
+    </w:p>
+    <w:p>
+      <w:r>
+        <w:t>Vi har tænkt os her at vise denne MoSCoW model som vi har udfyldt den, og dernæst gå ned i dybere detalje med hvert valg og fravalg betyder.</w:t>
+      </w:r>
+    </w:p>
+    <w:p>
+      <w:pPr>
+        <w:pStyle w:val="Heading2"/>
+      </w:pPr>
+      <w:r>
+        <w:t>MoSCoW</w:t>
+      </w:r>
+    </w:p>
+    <w:p>
+      <w:pPr>
+        <w:pStyle w:val="Heading3"/>
+      </w:pPr>
+      <w:r>
+        <w:t>Must Have</w:t>
+      </w:r>
+    </w:p>
+    <w:p>
+      <w:pPr>
+        <w:pStyle w:val="Heading3"/>
+      </w:pPr>
+      <w:proofErr w:type="spellStart"/>
+      <w:r>
+        <w:t>Should</w:t>
+      </w:r>
+      <w:proofErr w:type="spellEnd"/>
+      <w:r>
+        <w:t xml:space="preserve"> Have</w:t>
+      </w:r>
+    </w:p>
+    <w:p>
+      <w:pPr>
+        <w:pStyle w:val="Heading3"/>
+      </w:pPr>
+      <w:proofErr w:type="spellStart"/>
+      <w:r>
+        <w:t>Could</w:t>
+      </w:r>
+      <w:proofErr w:type="spellEnd"/>
+      <w:r>
+        <w:t xml:space="preserve"> have</w:t>
+      </w:r>
+    </w:p>
+    <w:p>
+      <w:pPr>
+        <w:pStyle w:val="Heading3"/>
+      </w:pPr>
+      <w:proofErr w:type="spellStart"/>
+      <w:r>
+        <w:t>Wont</w:t>
+      </w:r>
+      <w:proofErr w:type="spellEnd"/>
+      <w:r>
+        <w:t xml:space="preserve"> have</w:t>
       </w:r>
     </w:p>
     <w:p/>
@@ -3238,7 +3373,6 @@
     <w:next w:val="Normal"/>
     <w:link w:val="Heading3Char"/>
     <w:uiPriority w:val="9"/>
-    <w:semiHidden/>
     <w:unhideWhenUsed/>
     <w:qFormat/>
     <w:rsid w:val="0096029D"/>
@@ -3445,7 +3579,6 @@
     <w:basedOn w:val="DefaultParagraphFont"/>
     <w:link w:val="Heading3"/>
     <w:uiPriority w:val="9"/>
-    <w:semiHidden/>
     <w:rsid w:val="0096029D"/>
     <w:rPr>
       <w:rFonts w:eastAsiaTheme="majorEastAsia" w:cstheme="majorBidi"/>

</xml_diff>

<commit_message>
Fixed build and file names
</commit_message>
<xml_diff>
--- a/Rapport/Hovedopgave Rapport.docx
+++ b/Rapport/Hovedopgave Rapport.docx
@@ -46,42 +46,10 @@
         <w:t xml:space="preserve">er en af de store områder af global opvarmning. </w:t>
       </w:r>
       <w:r>
-        <w:t xml:space="preserve">Man kunne sige til kunderne der køber tøj, at de skulle genbruge, og købe mindre tøj. Men det bliver ikke en god løsning, da det kun vil have en lille indflydelse, og tøjet ville stadig blive produceret, men bare ikke solgt. Problemet kræver en løsning så tæt på starten af kæden som muligt. Fabrikkerne laver tøj efter hvad en butik bestiller, og en butik bestiller efter det data de har. Hvis de har solgt godt på en </w:t>
-      </w:r>
-      <w:proofErr w:type="gramStart"/>
-      <w:r>
-        <w:t>trøje</w:t>
-      </w:r>
-      <w:proofErr w:type="gramEnd"/>
-      <w:r>
-        <w:t xml:space="preserve"> vil de bestille flere hjem. Men hvordan ved de hvad der sælger godt? Hvordan ved de hvor mange de skal bestille hjem, for at optimere hvor meget de kan sælge, og hvor lidt de smider ud? Det er et komplekst problem, der kræver en masse dataindsamling, håndtering og kommunikation. Man kunne løse problemet i en butik med en blyant, papir og en masse mandtimer til at tælle hvert produkt, men det bryder ned i en større butik, og som en del af en kæde. Det er der GoFact kommer ind. De håndterer det data tøjbutikker har om deres salg, lager og </w:t>
-      </w:r>
-      <w:r>
-        <w:t>katalog. Og med de data kommer med forslag om hvor mange der skal købes af et stykke tøj, og om der eventuelt kunne byttes om på lager mellem butikker i samme kæde, for at mindske spild. Det er nemt for butikker at bruge GoFact, da de har et motto der hedder ”</w:t>
-      </w:r>
-      <w:proofErr w:type="spellStart"/>
-      <w:r>
-        <w:t>come</w:t>
-      </w:r>
-      <w:proofErr w:type="spellEnd"/>
-      <w:r>
-        <w:t xml:space="preserve"> as </w:t>
-      </w:r>
-      <w:proofErr w:type="spellStart"/>
-      <w:r>
-        <w:t>you</w:t>
-      </w:r>
-      <w:proofErr w:type="spellEnd"/>
-      <w:r>
-        <w:t xml:space="preserve"> </w:t>
-      </w:r>
-      <w:proofErr w:type="spellStart"/>
-      <w:r>
-        <w:t>are</w:t>
-      </w:r>
-      <w:proofErr w:type="spellEnd"/>
-      <w:r>
-        <w:t xml:space="preserve">”, som betyder at den måde den individuelle butik opbevarer data er godt nok, og man bare skal sende ind hvad man har. Dette betyder at GoFact skriver </w:t>
+        <w:t xml:space="preserve">Man kunne sige til kunderne der køber tøj, at de skulle genbruge, og købe mindre tøj. Men det bliver ikke en god løsning, da det kun vil have en lille indflydelse, og tøjet ville stadig blive produceret, men bare ikke solgt. Problemet kræver en løsning så tæt på starten af kæden som muligt. Fabrikkerne laver tøj efter hvad en butik bestiller, og en butik bestiller efter det data de har. Hvis de har solgt godt på en trøje vil de bestille flere hjem. Men hvordan ved de hvad der sælger godt? Hvordan ved de hvor mange de skal bestille hjem, for at optimere hvor meget de kan sælge, og hvor lidt de smider ud? Det er et komplekst problem, der kræver en masse dataindsamling, håndtering og kommunikation. Man kunne løse problemet i en butik med en blyant, papir og en masse mandtimer til at tælle hvert produkt, men det bryder ned i en større butik, og som en del af en kæde. Det er der GoFact kommer ind. De håndterer det data tøjbutikker har om deres salg, lager og </w:t>
+      </w:r>
+      <w:r>
+        <w:t xml:space="preserve">katalog. Og med de data kommer med forslag om hvor mange der skal købes af et stykke tøj, og om der eventuelt kunne byttes om på lager mellem butikker i samme kæde, for at mindske spild. Det er nemt for butikker at bruge GoFact, da de har et motto der hedder ”come as you are”, som betyder at den måde den individuelle butik opbevarer data er godt nok, og man bare skal sende ind hvad man har. Dette betyder at GoFact skriver </w:t>
       </w:r>
       <w:r>
         <w:t>individualise</w:t>
@@ -138,44 +106,15 @@
     </w:p>
     <w:p>
       <w:r>
-        <w:t xml:space="preserve">Der er mange ting man kunne have med for at vise hvad GoFacts’ system kan, men det er ikke alle der er vigtige for at sælge produktet til en kunde. GoFact har features som lager tracking, bestilling, ”hot-meter” (som er hvor varmt et produkt er. Det er udregnet ud fra hvor lang tid det har været på salg, og hvor mange der er solgt). Disse features er </w:t>
-      </w:r>
-      <w:proofErr w:type="spellStart"/>
-      <w:r>
-        <w:t>nice</w:t>
-      </w:r>
-      <w:proofErr w:type="spellEnd"/>
-      <w:r>
-        <w:t xml:space="preserve">-to-haves, og er ikke grunddelen. Så dem har jeg ikke tænkt mig at fokusere på. </w:t>
-      </w:r>
-    </w:p>
-    <w:p>
-      <w:proofErr w:type="spellStart"/>
-      <w:r>
-        <w:t>Hoved-delen</w:t>
-      </w:r>
-      <w:proofErr w:type="spellEnd"/>
-      <w:r>
-        <w:t xml:space="preserve"> af deres system er optælling af salg. Et resume af hvad der ren faktisk er solgt. </w:t>
-      </w:r>
-      <w:r>
-        <w:t>Planen for programmet er at få en salgsfil ind, lave noget data håndtering på det og komme med et sorteret resultat, som er en forkortet version af det rod som er en salgsfil. En salgsfil er hvad deres POS system, (point of sale) skriver til ved hver transaktion. Det er ”</w:t>
-      </w:r>
-      <w:proofErr w:type="gramStart"/>
-      <w:r>
-        <w:t>denne produkt</w:t>
-      </w:r>
-      <w:proofErr w:type="gramEnd"/>
-      <w:r>
-        <w:t xml:space="preserve">, med disse </w:t>
-      </w:r>
-      <w:proofErr w:type="gramStart"/>
-      <w:r>
-        <w:t>info</w:t>
-      </w:r>
-      <w:proofErr w:type="gramEnd"/>
-      <w:r>
-        <w:t xml:space="preserve">, blev solgt x antal gange”. Hvis det samme produkt bliver solgt to gange på en dag, kommer der to linjer med samme data. Det er dette der kan gøre det svært at læse, da man ikke nemt kan se hvor mange af et slags produkt der blev solgt. </w:t>
+        <w:t xml:space="preserve">Der er mange ting man kunne have med for at vise hvad GoFacts’ system kan, men det er ikke alle der er vigtige for at sælge produktet til en kunde. GoFact har features som lager tracking, bestilling, ”hot-meter” (som er hvor varmt et produkt er. Det er udregnet ud fra hvor lang tid det har været på salg, og hvor mange der er solgt). Disse features er nice-to-haves, og er ikke grunddelen. Så dem har jeg ikke tænkt mig at fokusere på. </w:t>
+      </w:r>
+    </w:p>
+    <w:p>
+      <w:r>
+        <w:t xml:space="preserve">Hoved-delen af deres system er optælling af salg. Et resume af hvad der ren faktisk er solgt. </w:t>
+      </w:r>
+      <w:r>
+        <w:t xml:space="preserve">Planen for programmet er at få en salgsfil ind, lave noget data håndtering på det og komme med et sorteret resultat, som er en forkortet version af det rod som er en salgsfil. En salgsfil er hvad deres POS system, (point of sale) skriver til ved hver transaktion. Det er ”denne produkt, med disse info, blev solgt x antal gange”. Hvis det samme produkt bliver solgt to gange på en dag, kommer der to linjer med samme data. Det er dette der kan gøre det svært at læse, da man ikke nemt kan se hvor mange af et slags produkt der blev solgt. </w:t>
       </w:r>
     </w:p>
     <w:p>
@@ -183,34 +122,19 @@
         <w:t xml:space="preserve">GoFact </w:t>
       </w:r>
       <w:r>
-        <w:t xml:space="preserve">starter med kundens data. Det er her problemet med deres data som er </w:t>
-      </w:r>
-      <w:proofErr w:type="gramStart"/>
-      <w:r>
-        <w:t>anderledes</w:t>
-      </w:r>
-      <w:proofErr w:type="gramEnd"/>
-      <w:r>
-        <w:t xml:space="preserve"> kommer ind i billedet. </w:t>
-      </w:r>
-      <w:r>
-        <w:t xml:space="preserve">Det er et problem at ændre deres data hvis det skal gøres automatisk, men i denne applikation gør vi det en gang, og det er dermed et mindre problem. I denne applikation tager vi en salgsfil og kører igennem vores system. Det betyder at vi </w:t>
-      </w:r>
-      <w:proofErr w:type="gramStart"/>
-      <w:r>
-        <w:t>ændre</w:t>
-      </w:r>
-      <w:proofErr w:type="gramEnd"/>
-      <w:r>
-        <w:t xml:space="preserve"> data til at passe hvad programmet forventer. Dette gør at man ikke skal bruge mandtimer til at ændre eller skrive kode som oversætter det for en, men vi ”bare” skal gøre det selv. Det er hurtigere at ændre overskrifter i en </w:t>
-      </w:r>
-      <w:proofErr w:type="gramStart"/>
-      <w:r>
-        <w:t>CSV fil</w:t>
-      </w:r>
-      <w:proofErr w:type="gramEnd"/>
-      <w:r>
-        <w:t xml:space="preserve"> end det er at skrive en oversætter til den. Dette gør også at man ikke skal være bange for at kunden bruger test-systemet i stedet for hoved-systemet, da det ikke er bygget til at være effektivt uden en fast bruger.</w:t>
+        <w:t xml:space="preserve">starter med kundens data. Det er her problemet med deres data som er anderledes kommer ind i billedet. </w:t>
+      </w:r>
+      <w:r>
+        <w:t xml:space="preserve">Det er et problem at ændre deres data hvis det skal gøres automatisk, men i denne applikation gør vi det en gang, og det er dermed et mindre problem. I denne applikation tager vi en salgsfil og kører igennem vores system. Det betyder at vi ændre data til at passe hvad programmet forventer. Dette gør at man ikke skal bruge </w:t>
+      </w:r>
+      <w:r>
+        <w:t>ressource</w:t>
+      </w:r>
+      <w:r>
+        <w:t xml:space="preserve">r </w:t>
+      </w:r>
+      <w:r>
+        <w:t>til at ændre eller skrive kode som oversætter det for en, men vi ”bare” skal gøre det selv. Det er hurtigere at ændre overskrifter i en CSV fil end det er at skrive en oversætter til den. Dette gør også at man ikke skal være bange for at kunden bruger test-systemet i stedet for hoved-systemet, da det ikke er bygget til at være effektivt uden en fast bruger.</w:t>
       </w:r>
     </w:p>
     <w:p>
@@ -221,15 +145,7 @@
     <w:p>
       <w:r>
         <w:lastRenderedPageBreak/>
-        <w:t xml:space="preserve">Vi holder os også fra datoer. I kundens fil de kommer </w:t>
-      </w:r>
-      <w:proofErr w:type="gramStart"/>
-      <w:r>
-        <w:t>med</w:t>
-      </w:r>
-      <w:proofErr w:type="gramEnd"/>
-      <w:r>
-        <w:t xml:space="preserve"> kan der være salg for 3 år siden, eller for 2 uger siden. Det ville være svært at give et fuldendt billede hvis man siger til kunden at det er salg for hele måneden, hvis der kun er salg for 2 uger. Så det sænker forvirring med programmet her hvis vi siger ”Det data der kommer ind, bliver sorteret og talt”. </w:t>
+        <w:t xml:space="preserve">Vi holder os også fra datoer. I kundens fil de kommer med kan der være salg for 3 år siden, eller for 2 uger siden. Det ville være svært at give et fuldendt billede hvis man siger til kunden at det er salg for hele måneden, hvis der kun er salg for 2 uger. Så det sænker forvirring med programmet her hvis vi siger ”Det data der kommer ind, bliver sorteret og talt”. </w:t>
       </w:r>
     </w:p>
     <w:p>
@@ -253,15 +169,7 @@
     </w:p>
     <w:p>
       <w:r>
-        <w:t xml:space="preserve">GoFact er som sagt et data håndterings firma, men ikke til AI eller lign. De indsamler data for kunder, sortere og forkorter det, og giver kunder et bedre overblik. De startede med at skulle have noget kode ud </w:t>
-      </w:r>
-      <w:proofErr w:type="gramStart"/>
-      <w:r>
-        <w:t>af</w:t>
-      </w:r>
-      <w:proofErr w:type="gramEnd"/>
-      <w:r>
-        <w:t xml:space="preserve"> døren hurtigt, og det resulterede i at deres backend er lidt af et rod, og indeholder en del spildte udregninger. Hver gang en ny kunde kommer ind skal deres data også gennemtjekkes for at se om der er nogle mærkelige fejl som de ikke selv har lagt mærke til. Det kan være ting som at have sin </w:t>
+        <w:t xml:space="preserve">GoFact er som sagt et data håndterings firma, men ikke til AI eller lign. De indsamler data for kunder, sortere og forkorter det, og giver kunder et bedre overblik. De startede med at skulle have noget kode ud af døren hurtigt, og det resulterede i at deres backend er lidt af et rod, og indeholder en del spildte udregninger. Hver gang en ny kunde kommer ind skal deres data også gennemtjekkes for at se om der er nogle mærkelige fejl som de ikke selv har lagt mærke til. Det kan være ting som at have sin </w:t>
       </w:r>
       <w:r>
         <w:t>delimiter</w:t>
@@ -277,15 +185,7 @@
     </w:p>
     <w:p>
       <w:r>
-        <w:t xml:space="preserve">Det meste af GoFacts’ udviklings-timer kommer fra at udvikle nye funktioner. Deres salgs-model er en abonnement system, som betyder at de fortsat tjener penge på kode de har skrevet før. Dermed giver det mere mening at skrive ny kode, end at opdatere gammel kode hvis det ikke kræver det. Det betyder også at deres system forbliver nyt, da der kommer nye features og andre </w:t>
-      </w:r>
-      <w:proofErr w:type="spellStart"/>
-      <w:r>
-        <w:t>nice</w:t>
-      </w:r>
-      <w:proofErr w:type="spellEnd"/>
-      <w:r>
-        <w:t xml:space="preserve">-to-haves som gør at kunder forbliver kunder hos GoFact. Hver kunde har også direkte adgang til enden CTO Morten V.G. eller CEO Henning H. som betyder at når der er problemer føler kunden at deres stemme bliver hørt. Dette giver kun mening for dem da der ikke er mange problemer med deres produkt. Hvis der var problemer ofte, ville de ikke lavet andet, men det er ikke ofte at der kommer noget frem. </w:t>
+        <w:t xml:space="preserve">Det meste af GoFacts’ udviklings-timer kommer fra at udvikle nye funktioner. Deres salgs-model er en abonnement system, som betyder at de fortsat tjener penge på kode de har skrevet før. Dermed giver det mere mening at skrive ny kode, end at opdatere gammel kode hvis det ikke kræver det. Det betyder også at deres system forbliver nyt, da der kommer nye features og andre nice-to-haves som gør at kunder forbliver kunder hos GoFact. Hver kunde har også direkte adgang til enden CTO Morten V.G. eller CEO Henning H. som betyder at når der er problemer føler kunden at deres stemme bliver hørt. Dette giver kun mening for dem da der ikke er mange problemer med deres produkt. Hvis der var problemer ofte, ville de ikke lavet andet, men det er ikke ofte at der kommer noget frem. </w:t>
       </w:r>
     </w:p>
     <w:p>
@@ -301,15 +201,7 @@
     <w:p>
       <w:r>
         <w:lastRenderedPageBreak/>
-        <w:t xml:space="preserve">Det giver også nogle gange mere mening for større kæder at bruge GoFact, </w:t>
-      </w:r>
-      <w:proofErr w:type="gramStart"/>
-      <w:r>
-        <w:t>en mindre kæder</w:t>
-      </w:r>
-      <w:proofErr w:type="gramEnd"/>
-      <w:r>
-        <w:t>, da de også har nogle features som hjælper mere hvis man har flere butikker der snakker sammen. En af dem er en ”bytte forslag” system. Det kigger kort sagt på et produkt, og hvor det bliver solgt mest henne. Det kunne være en striktrøje som sælger mere inde i Herning end i Brande. I stedet for at butikken i Herning køber flere nye trøjer, kan de tage nogle af dem butikken i Brande sidder med. Dette gør at de forskellige butikker ikke har spild af det tøj de ikke kunne få solgt. Det er her at hvis man er en lille kunde ville man ikke have andre butikker at kunne bytte med.</w:t>
+        <w:t>Det giver også nogle gange mere mening for større kæder at bruge GoFact, en mindre kæder, da de også har nogle features som hjælper mere hvis man har flere butikker der snakker sammen. En af dem er en ”bytte forslag” system. Det kigger kort sagt på et produkt, og hvor det bliver solgt mest henne. Det kunne være en striktrøje som sælger mere inde i Herning end i Brande. I stedet for at butikken i Herning køber flere nye trøjer, kan de tage nogle af dem butikken i Brande sidder med. Dette gør at de forskellige butikker ikke har spild af det tøj de ikke kunne få solgt. Det er her at hvis man er en lille kunde ville man ikke have andre butikker at kunne bytte med.</w:t>
       </w:r>
       <w:r>
         <w:t xml:space="preserve"> Det er også en af grundende til at det ikke er en af de features fra GoFact som kommer med i vores light version, da det er bygget til de små, nye kunder.</w:t>
@@ -347,28 +239,12 @@
         <w:t xml:space="preserve">Når man gerne vil have sit produkt ud i verden, kræver det en god strategi. En stor del af ens strategi er grundet i hvilket produkt man laver. Hvis man laver en køkkensvamp, er ens målgruppe en gennemsnitlig person. Men den kunne også være et industrielt køkken. Man kan dermed sige at man kan sælge få svampe til mange mennesker, eller mange svampe til få institutioner. Dette er det samme problem som GoFact også har siddet med. De har et software som er godt til at sænke spild, og øge vækst for tøjbutikker. Men </w:t>
       </w:r>
       <w:r>
-        <w:t xml:space="preserve">hvem skal man fokusere på? Hvis man kunne tilkoble alt og alle til systemet ville man kunne gøre begge nemt, men det er ikke sådan det virker for GoFact, på grund af deres ”kom som </w:t>
-      </w:r>
-      <w:proofErr w:type="gramStart"/>
-      <w:r>
-        <w:t>i</w:t>
-      </w:r>
-      <w:proofErr w:type="gramEnd"/>
-      <w:r>
-        <w:t xml:space="preserve"> er” mentalitet. Det gør det nemmere for nye kunder at tilkoble GoFact fra kundernes side, men for GoFact skal de vælge hvilke kunder de tager ind med lidt omhu, da det tager GoFact en del mandtimer for at få tilkoblet en ny kunde. Det er også der deres største udgift ligger, da deres abonnement model gør at de ikke skal tænke mere på en kunde efter de er opsat. </w:t>
-      </w:r>
-    </w:p>
-    <w:p>
-      <w:r>
-        <w:t xml:space="preserve">Det gør det lidt akavet for GoFact. De har et godt produkt, som de har bevis på at de sparer butikker mange penge </w:t>
-      </w:r>
-      <w:proofErr w:type="gramStart"/>
-      <w:r>
-        <w:t>hvert måned</w:t>
-      </w:r>
-      <w:proofErr w:type="gramEnd"/>
-      <w:r>
-        <w:t>, og mindsker tøj-spild. Der er også mange butikker som gerne vil blive en del af GoFact systemet, men da det ikke er alle der ville kunne få lige så stor værdi af det, kan det være at nogle går fra efter det hele er opsat. Det er et stort problem for GoFact hvis en kunde går fra, da de i opstarten af en ny kunde laver meget ”gratis” arbejde, i det at de ikke tager penge for opsætning, bare den månedlige pris. Det betyder at hvis en kunde tager 250 timer at få sat op, og de går af efter første måned, kunne GoFact tabe mange penge, da de tjener tabet op i de følgende måneder.</w:t>
+        <w:t xml:space="preserve">hvem skal man fokusere på? Hvis man kunne tilkoble alt og alle til systemet ville man kunne gøre begge nemt, men det er ikke sådan det virker for GoFact, på grund af deres ”kom som i er” mentalitet. Det gør det nemmere for nye kunder at tilkoble GoFact fra kundernes side, men for GoFact skal de vælge hvilke kunder de tager ind med lidt omhu, da det tager GoFact en del mandtimer for at få tilkoblet en ny kunde. Det er også der deres største udgift ligger, da deres abonnement model gør at de ikke skal tænke mere på en kunde efter de er opsat. </w:t>
+      </w:r>
+    </w:p>
+    <w:p>
+      <w:r>
+        <w:t>Det gør det lidt akavet for GoFact. De har et godt produkt, som de har bevis på at de sparer butikker mange penge hvert måned, og mindsker tøj-spild. Der er også mange butikker som gerne vil blive en del af GoFact systemet, men da det ikke er alle der ville kunne få lige så stor værdi af det, kan det være at nogle går fra efter det hele er opsat. Det er et stort problem for GoFact hvis en kunde går fra, da de i opstarten af en ny kunde laver meget ”gratis” arbejde, i det at de ikke tager penge for opsætning, bare den månedlige pris. Det betyder at hvis en kunde tager 250 timer at få sat op, og de går af efter første måned, kunne GoFact tabe mange penge, da de tjener tabet op i de følgende måneder.</w:t>
       </w:r>
     </w:p>
     <w:p>
@@ -400,15 +276,7 @@
         <w:t xml:space="preserve">Så hvad kan et fix til dette problem være? Få flere kunder ind. Få mange, mindre, kunder ind ad døren, så den kollektive mængde </w:t>
       </w:r>
       <w:r>
-        <w:t xml:space="preserve">kunne gøre tab mindre vigtige. Det ville give en sikkerhed hvis en stor kunde går fra, da de stadig har mange forskellige kunder som ikke ville gå fra dem på samme tid. Der kunne stadig være mange kunder der går fra, hvis en ekstern ekstrem handling sker (som en anden Corona virus, </w:t>
-      </w:r>
-      <w:proofErr w:type="spellStart"/>
-      <w:r>
-        <w:t>ect</w:t>
-      </w:r>
-      <w:proofErr w:type="spellEnd"/>
-      <w:r>
-        <w:t>.). Men det ville give en sikkerhed i normale tider som de ikke pt har.</w:t>
+        <w:t>kunne gøre tab mindre vigtige. Det ville give en sikkerhed hvis en stor kunde går fra, da de stadig har mange forskellige kunder som ikke ville gå fra dem på samme tid. Der kunne stadig være mange kunder der går fra, hvis en ekstern ekstrem handling sker (som en anden Corona virus, ect.). Men det ville give en sikkerhed i normale tider som de ikke pt har.</w:t>
       </w:r>
     </w:p>
     <w:p>
@@ -421,28 +289,12 @@
     </w:p>
     <w:p>
       <w:r>
-        <w:t>Med mindre butikker som ikke har for fastlagte IT-</w:t>
-      </w:r>
-      <w:proofErr w:type="gramStart"/>
-      <w:r>
-        <w:t>systemer</w:t>
-      </w:r>
-      <w:proofErr w:type="gramEnd"/>
-      <w:r>
-        <w:t xml:space="preserve"> kunne man også sige at de skal ændre deres data til en ”simplere” version af GoFact systemet, som ikke er custom lavet til dem. Man kunne give denne version en billigere pris, da GoFact ikke skal gøre noget for at få en ekstra kunde ind ad døren. Det ville også være mere attraktivt til små kunder at det er billigere for dem.</w:t>
-      </w:r>
-    </w:p>
-    <w:p>
-      <w:r>
-        <w:t xml:space="preserve">Dette er dog ikke hvad der er fokus på her. Vi </w:t>
-      </w:r>
-      <w:proofErr w:type="gramStart"/>
-      <w:r>
-        <w:t>fokusere</w:t>
-      </w:r>
-      <w:proofErr w:type="gramEnd"/>
-      <w:r>
-        <w:t xml:space="preserve"> på at sælge ideen til kunder. Vi skal dermed komme frem til et produkt der nemt kan vise hvad GoFact kan gøre for kunder. Det skal kunne hurtigt highlighte i en praktisk måde, hvad GoFact kan gøre for kunderne.</w:t>
+        <w:t>Med mindre butikker som ikke har for fastlagte IT-systemer kunne man også sige at de skal ændre deres data til en ”simplere” version af GoFact systemet, som ikke er custom lavet til dem. Man kunne give denne version en billigere pris, da GoFact ikke skal gøre noget for at få en ekstra kunde ind ad døren. Det ville også være mere attraktivt til små kunder at det er billigere for dem.</w:t>
+      </w:r>
+    </w:p>
+    <w:p>
+      <w:r>
+        <w:t>Dette er dog ikke hvad der er fokus på her. Vi fokusere på at sælge ideen til kunder. Vi skal dermed komme frem til et produkt der nemt kan vise hvad GoFact kan gøre for kunder. Det skal kunne hurtigt highlighte i en praktisk måde, hvad GoFact kan gøre for kunderne.</w:t>
       </w:r>
       <w:r>
         <w:t xml:space="preserve"> For det kan vi kigge på hvad vores produkt skal kunne gøre, hvordan vi ville udføre dem, og hvad vi vælger at skære fra. </w:t>
@@ -450,15 +302,7 @@
     </w:p>
     <w:p>
       <w:r>
-        <w:t xml:space="preserve">Det er også vigtigt at vi skærer funktioner fra, da vi prøver at sælge </w:t>
-      </w:r>
-      <w:proofErr w:type="gramStart"/>
-      <w:r>
-        <w:t>hoved ideen</w:t>
-      </w:r>
-      <w:proofErr w:type="gramEnd"/>
-      <w:r>
-        <w:t xml:space="preserve"> på GoFact. Det er en bedre salgs-pitch at komme med en god grund til at bruge en, i stedet for mange små. Da folk nemmere kan have små vigtige ting i hovedet, end mange små, mindre vigtige ting.</w:t>
+        <w:t>Det er også vigtigt at vi skærer funktioner fra, da vi prøver at sælge hoved ideen på GoFact. Det er en bedre salgs-pitch at komme med en god grund til at bruge en, i stedet for mange små. Da folk nemmere kan have små vigtige ting i hovedet, end mange små, mindre vigtige ting.</w:t>
       </w:r>
     </w:p>
     <w:p>
@@ -480,29 +324,315 @@
         <w:t xml:space="preserve"> </w:t>
       </w:r>
       <w:r>
-        <w:t>Når man vælger hvad et produkt skal kunne, og hvad den ikke skal kunne, kan man bruge værktøjer til at hjælpe med dette. Det værktøj vi har tænkt os at gå frem med her hedder MoSCoW modellen. Den simplificerer hvad et produkt skal have for at det er en MVP (Minimal Viable Produkt) og hvad der gør den mere fuldendt. Ved at bruge MoSCoW modellen kan man også se nemt hvad man fravælger, og hvad man optimistisk håber man kan få i sit produkt inden en deadline.</w:t>
-      </w:r>
-    </w:p>
-    <w:p>
-      <w:r>
-        <w:rPr>
-          <w:highlight w:val="yellow"/>
+        <w:t xml:space="preserve">Når man vælger hvad et produkt skal kunne, og hvad den ikke skal kunne, kan man bruge værktøjer til at hjælpe med dette. Det værktøj vi har tænkt os at gå frem med her hedder MoSCoW modellen. Den simplificerer hvad et produkt skal have for at det er en MVP (Minimal Viable Produkt) og hvad der gør den mere fuldendt. Ved at bruge MoSCoW modellen kan man også se nemt hvad man fravælger, og hvad man optimistisk håber man kan få i sit produkt </w:t>
+      </w:r>
+      <w:r>
+        <w:t>inden en deadline.</w:t>
+      </w:r>
+    </w:p>
+    <w:p>
+      <w:r>
+        <w:rPr>
+          <w:lang w:val="en-US"/>
         </w:rPr>
         <w:t>MoSCoW står for</w:t>
       </w:r>
+      <w:r>
+        <w:rPr>
+          <w:lang w:val="en-US"/>
+        </w:rPr>
+        <w:t xml:space="preserve"> ”Must have, Should have, Could have, Wont have”. </w:t>
+      </w:r>
+      <w:r>
+        <w:t xml:space="preserve">Det er en metode at skrive </w:t>
+      </w:r>
+      <w:r>
+        <w:t>hårde og bløde krav med lidt mere specifikation. I stedet for at sige ”det her er hvad den skal have, og dette er hvad den ikke skal have” siger man ”dette er vigtigst, så dette, hvis vi har ekstra tid så dette. Og her er en masse vi ikke vil have med”. Det giver mere nuance og hjælper udviklere med at fokusere på vigtige features, i stedet for ”</w:t>
+      </w:r>
+      <w:r>
+        <w:t>Quality of Life</w:t>
+      </w:r>
+      <w:r>
+        <w:t xml:space="preserve">” features. </w:t>
+      </w:r>
     </w:p>
     <w:p>
       <w:r>
         <w:t>Vi har tænkt os her at vise denne MoSCoW model som vi har udfyldt den, og dernæst gå ned i dybere detalje med hvert valg og fravalg betyder.</w:t>
       </w:r>
+      <w:r>
+        <w:t xml:space="preserve"> Wont have kunne have en masse tilfældige ting i sig, men vi har prøvet at holde det relevant til GoFact, og denne light version af det.</w:t>
+      </w:r>
     </w:p>
     <w:p>
       <w:pPr>
         <w:pStyle w:val="Heading2"/>
-      </w:pPr>
-      <w:r>
+        <w:rPr>
+          <w:lang w:val="en-US"/>
+        </w:rPr>
+      </w:pPr>
+      <w:r>
+        <w:rPr>
+          <w:lang w:val="en-US"/>
+        </w:rPr>
+        <w:t>MoSCoW – Simpel</w:t>
+      </w:r>
+    </w:p>
+    <w:p>
+      <w:pPr>
+        <w:rPr>
+          <w:b/>
+          <w:bCs/>
+          <w:lang w:val="en-US"/>
+        </w:rPr>
+      </w:pPr>
+      <w:r>
+        <w:rPr>
+          <w:b/>
+          <w:bCs/>
+          <w:lang w:val="en-US"/>
+        </w:rPr>
+        <w:t>Must Have</w:t>
+      </w:r>
+    </w:p>
+    <w:p>
+      <w:pPr>
+        <w:pStyle w:val="ListParagraph"/>
+        <w:numPr>
+          <w:ilvl w:val="0"/>
+          <w:numId w:val="8"/>
+        </w:numPr>
+      </w:pPr>
+      <w:r>
+        <w:t>Loade en kundes fil nemt</w:t>
+      </w:r>
+    </w:p>
+    <w:p>
+      <w:pPr>
+        <w:pStyle w:val="ListParagraph"/>
+        <w:numPr>
+          <w:ilvl w:val="0"/>
+          <w:numId w:val="8"/>
+        </w:numPr>
+      </w:pPr>
+      <w:r>
+        <w:t>Lave udregninger på data</w:t>
+      </w:r>
+    </w:p>
+    <w:p>
+      <w:pPr>
+        <w:pStyle w:val="ListParagraph"/>
+        <w:numPr>
+          <w:ilvl w:val="0"/>
+          <w:numId w:val="8"/>
+        </w:numPr>
+      </w:pPr>
+      <w:r>
+        <w:t>Sortere efter industri standart og højeste salg</w:t>
+      </w:r>
+    </w:p>
+    <w:p>
+      <w:pPr>
+        <w:pStyle w:val="ListParagraph"/>
+        <w:numPr>
+          <w:ilvl w:val="0"/>
+          <w:numId w:val="8"/>
+        </w:numPr>
+      </w:pPr>
+      <w:r>
+        <w:t>Vise resultatet nemt</w:t>
+      </w:r>
+    </w:p>
+    <w:p>
+      <w:pPr>
+        <w:rPr>
+          <w:b/>
+          <w:bCs/>
+          <w:lang w:val="en-US"/>
+        </w:rPr>
+      </w:pPr>
+      <w:r>
+        <w:rPr>
+          <w:b/>
+          <w:bCs/>
+          <w:lang w:val="en-US"/>
+        </w:rPr>
+        <w:t>Should Have</w:t>
+      </w:r>
+    </w:p>
+    <w:p>
+      <w:pPr>
+        <w:pStyle w:val="ListParagraph"/>
+        <w:numPr>
+          <w:ilvl w:val="0"/>
+          <w:numId w:val="15"/>
+        </w:numPr>
+      </w:pPr>
+      <w:r>
+        <w:t>Syntetisk data</w:t>
+      </w:r>
+    </w:p>
+    <w:p>
+      <w:pPr>
+        <w:pStyle w:val="ListParagraph"/>
+        <w:numPr>
+          <w:ilvl w:val="0"/>
+          <w:numId w:val="15"/>
+        </w:numPr>
+      </w:pPr>
+      <w:r>
+        <w:t>Support til flere filer på en gang</w:t>
+      </w:r>
+    </w:p>
+    <w:p>
+      <w:pPr>
+        <w:pStyle w:val="ListParagraph"/>
+        <w:numPr>
+          <w:ilvl w:val="0"/>
+          <w:numId w:val="15"/>
+        </w:numPr>
+      </w:pPr>
+      <w:r>
+        <w:t>Fejl håndtering</w:t>
+      </w:r>
+    </w:p>
+    <w:p>
+      <w:pPr>
+        <w:rPr>
+          <w:b/>
+          <w:bCs/>
+          <w:lang w:val="en-US"/>
+        </w:rPr>
+      </w:pPr>
+      <w:r>
+        <w:rPr>
+          <w:b/>
+          <w:bCs/>
+          <w:lang w:val="en-US"/>
+        </w:rPr>
+        <w:t>Could Have</w:t>
+      </w:r>
+    </w:p>
+    <w:p>
+      <w:pPr>
+        <w:pStyle w:val="ListParagraph"/>
+        <w:numPr>
+          <w:ilvl w:val="0"/>
+          <w:numId w:val="17"/>
+        </w:numPr>
+      </w:pPr>
+      <w:r>
+        <w:t>Flere farver I konsollen til at øge læsbarhed</w:t>
+      </w:r>
+    </w:p>
+    <w:p>
+      <w:pPr>
+        <w:pStyle w:val="ListParagraph"/>
+        <w:numPr>
+          <w:ilvl w:val="0"/>
+          <w:numId w:val="17"/>
+        </w:numPr>
+      </w:pPr>
+      <w:r>
+        <w:t xml:space="preserve"> En hurtigere måde at ændre filen på en manuel arbejde</w:t>
+      </w:r>
+    </w:p>
+    <w:p>
+      <w:pPr>
+        <w:rPr>
+          <w:b/>
+          <w:bCs/>
+          <w:lang w:val="en-US"/>
+        </w:rPr>
+      </w:pPr>
+      <w:r>
+        <w:rPr>
+          <w:b/>
+          <w:bCs/>
+          <w:lang w:val="en-US"/>
+        </w:rPr>
+        <w:t>Wont Have</w:t>
+      </w:r>
+    </w:p>
+    <w:p>
+      <w:pPr>
+        <w:pStyle w:val="ListParagraph"/>
+        <w:numPr>
+          <w:ilvl w:val="0"/>
+          <w:numId w:val="18"/>
+        </w:numPr>
+        <w:rPr>
+          <w:lang w:val="en-US"/>
+        </w:rPr>
+      </w:pPr>
+      <w:r>
+        <w:rPr>
+          <w:lang w:val="en-US"/>
+        </w:rPr>
+        <w:t>GUI</w:t>
+      </w:r>
+    </w:p>
+    <w:p>
+      <w:pPr>
+        <w:pStyle w:val="ListParagraph"/>
+        <w:numPr>
+          <w:ilvl w:val="0"/>
+          <w:numId w:val="18"/>
+        </w:numPr>
+        <w:rPr>
+          <w:lang w:val="en-US"/>
+        </w:rPr>
+      </w:pPr>
+      <w:r>
+        <w:rPr>
+          <w:lang w:val="en-US"/>
+        </w:rPr>
+        <w:t>Advanced GoFact Features</w:t>
+      </w:r>
+    </w:p>
+    <w:p>
+      <w:pPr>
+        <w:rPr>
+          <w:rFonts w:asciiTheme="majorHAnsi" w:eastAsiaTheme="majorEastAsia" w:hAnsiTheme="majorHAnsi" w:cstheme="majorBidi"/>
+          <w:color w:val="0F4761" w:themeColor="accent1" w:themeShade="BF"/>
+          <w:sz w:val="32"/>
+          <w:szCs w:val="32"/>
+          <w:lang w:val="en-US"/>
+        </w:rPr>
+      </w:pPr>
+      <w:r>
+        <w:rPr>
+          <w:lang w:val="en-US"/>
+        </w:rPr>
+        <w:br w:type="page"/>
+      </w:r>
+    </w:p>
+    <w:p>
+      <w:pPr>
+        <w:pStyle w:val="Heading2"/>
+        <w:rPr>
+          <w:lang w:val="en-US"/>
+        </w:rPr>
+      </w:pPr>
+      <w:r>
+        <w:rPr>
+          <w:lang w:val="en-US"/>
+        </w:rPr>
+        <w:lastRenderedPageBreak/>
         <w:t>MoSCoW</w:t>
       </w:r>
+      <w:r>
+        <w:rPr>
+          <w:lang w:val="en-US"/>
+        </w:rPr>
+        <w:t xml:space="preserve"> - </w:t>
+      </w:r>
+      <w:r>
+        <w:rPr>
+          <w:lang w:val="en-US"/>
+        </w:rPr>
+        <w:t>uddybet</w:t>
+      </w:r>
     </w:p>
     <w:p>
       <w:pPr>
@@ -513,42 +643,647 @@
       </w:r>
     </w:p>
     <w:p>
+      <w:r>
+        <w:t>For at sige at v</w:t>
+      </w:r>
+      <w:r>
+        <w:t xml:space="preserve">i har en light version af GoFacts’ system, skal vi have hoveddelen på plads. Programmet skal kunne tælle salg sammen, sortere data på en måde der gør det nemt for kunden at se hvad der har solgt. For at komme </w:t>
+      </w:r>
+      <w:r>
+        <w:t>dertil</w:t>
+      </w:r>
+      <w:r>
+        <w:t xml:space="preserve"> har vi følgende punkt-liste af features programmet skal kunne.</w:t>
+      </w:r>
+    </w:p>
+    <w:p>
+      <w:pPr>
+        <w:pStyle w:val="ListParagraph"/>
+        <w:rPr>
+          <w:b/>
+          <w:bCs/>
+        </w:rPr>
+      </w:pPr>
+      <w:r>
+        <w:rPr>
+          <w:b/>
+          <w:bCs/>
+        </w:rPr>
+        <w:t>Loade en kundes fil nemt</w:t>
+      </w:r>
+    </w:p>
+    <w:p>
+      <w:pPr>
+        <w:pStyle w:val="ListParagraph"/>
+        <w:rPr>
+          <w:b/>
+          <w:bCs/>
+        </w:rPr>
+      </w:pPr>
+      <w:r>
+        <w:rPr>
+          <w:b/>
+          <w:bCs/>
+        </w:rPr>
+        <w:t>Lave udregninger på data</w:t>
+      </w:r>
+    </w:p>
+    <w:p>
+      <w:pPr>
+        <w:pStyle w:val="ListParagraph"/>
+        <w:rPr>
+          <w:b/>
+          <w:bCs/>
+        </w:rPr>
+      </w:pPr>
+      <w:r>
+        <w:rPr>
+          <w:b/>
+          <w:bCs/>
+        </w:rPr>
+        <w:t>Sortere efter industri standart og højeste salg</w:t>
+      </w:r>
+    </w:p>
+    <w:p>
+      <w:pPr>
+        <w:pStyle w:val="ListParagraph"/>
+        <w:rPr>
+          <w:b/>
+          <w:bCs/>
+        </w:rPr>
+      </w:pPr>
+      <w:r>
+        <w:rPr>
+          <w:b/>
+          <w:bCs/>
+        </w:rPr>
+        <w:t>Vise resultatet nemt</w:t>
+      </w:r>
+    </w:p>
+    <w:p>
+      <w:pPr>
+        <w:rPr>
+          <w:b/>
+          <w:bCs/>
+        </w:rPr>
+      </w:pPr>
+      <w:r>
+        <w:t>Nu når vi har de 4 hoved kriterier på plads, lad os så dykke lidt dybere ind i dem for at se hvad de ren faktisk betyder.</w:t>
+      </w:r>
+    </w:p>
+    <w:p>
+      <w:pPr>
+        <w:rPr>
+          <w:b/>
+          <w:bCs/>
+        </w:rPr>
+      </w:pPr>
+      <w:r>
+        <w:rPr>
+          <w:b/>
+          <w:bCs/>
+        </w:rPr>
+        <w:t>Nr</w:t>
+      </w:r>
+      <w:r>
+        <w:rPr>
+          <w:b/>
+          <w:bCs/>
+        </w:rPr>
+        <w:t>.</w:t>
+      </w:r>
+      <w:r>
+        <w:rPr>
+          <w:b/>
+          <w:bCs/>
+        </w:rPr>
+        <w:t xml:space="preserve"> 1 Loade en kundes fil nemt</w:t>
+      </w:r>
+    </w:p>
+    <w:p>
+      <w:r>
+        <w:t>Når vi snakker om onboarding af nye kunder, skal vi gøre det så nemt for dem så muligt at se vores vision, og hvad vi kan gøre for dem. Selvom vi snakker om en lightweight version kun skabt til at sælge en vision, er det stadig vigtigt for os at det er så nemt som muligt. Vores produkt har funktion at sælge en vision. Og hvis vores salgs pitch er svær at bruge, reflektere det ikke godt på den fulde version. Det er dermed vigtigt at vores version er ligeså nem, hvis ikke nemmere at bruge end det fulde produkt. Men hvad er ”nemt” at bruge? Det fylde system kører data automatisk ind, så hvis vores ”nemhed” kriterie går imod manuel vs. Automatisk, kommer vi til at fejle på dette punkt uanset hvad. Så hvad kan vi gøre for at det er nemt? Genbruge systemer kunderne allerede kender til. Vores input til vores system skal bruge indbyggede</w:t>
+      </w:r>
+      <w:r>
+        <w:t xml:space="preserve"> filnavigation</w:t>
+      </w:r>
+      <w:r>
+        <w:t xml:space="preserve">, og ikke noget custom lavet. Så i stedet for at have en GUI eller en anden løsning som man kunne blive forvirret over, skal vi ligge en fil ind i en mappe tydeligt navngivet ”input”. Det ville være det nemmeste at fortælle en kunde. ”lig den eller de ønskede filer ind i denne mappe og kør programmet”. Mappen bliver lavet på ens skrivebord, som er der hvor de fleste mennesker opbevarer deres ”vigtige” applikationer. Så vores </w:t>
+      </w:r>
+      <w:r>
+        <w:t>input bliver så</w:t>
+      </w:r>
+      <w:r>
+        <w:t xml:space="preserve"> tydeligt </w:t>
+      </w:r>
+      <w:r>
+        <w:t xml:space="preserve">og nemt </w:t>
+      </w:r>
+      <w:r>
+        <w:t xml:space="preserve">som muligt. </w:t>
+      </w:r>
+    </w:p>
+    <w:p>
+      <w:pPr>
+        <w:rPr>
+          <w:b/>
+          <w:bCs/>
+        </w:rPr>
+      </w:pPr>
+      <w:r>
+        <w:rPr>
+          <w:b/>
+          <w:bCs/>
+        </w:rPr>
+        <w:t>Nr</w:t>
+      </w:r>
+      <w:r>
+        <w:rPr>
+          <w:b/>
+          <w:bCs/>
+        </w:rPr>
+        <w:t>.</w:t>
+      </w:r>
+      <w:r>
+        <w:rPr>
+          <w:b/>
+          <w:bCs/>
+        </w:rPr>
+        <w:t xml:space="preserve"> 2 Lave udregninger på data</w:t>
+      </w:r>
+    </w:p>
+    <w:p>
+      <w:r>
+        <w:t xml:space="preserve">Når vi har data inde i vores system, skal vi også gøre noget ved det. GoFact laver mange forskellige udregninger på deres data. Men da vi bare skal sælge vores vision for hvad vores software kunne bruges til, kan vi holde os til nogle af de grundfunktioner som gør GoFact specielle. </w:t>
+      </w:r>
+    </w:p>
+    <w:p/>
+    <w:p>
+      <w:r>
+        <w:lastRenderedPageBreak/>
+        <w:t xml:space="preserve">Det mest essentielle er at fortælle en hvor mange salg hver genstand har haft. Dette gør det nemt for en butik at se hvad der sælger, og hvad der ikke gør. Det vigtigste step er dermed en optælling af kundens rå data. For </w:t>
+      </w:r>
+      <w:r>
+        <w:t xml:space="preserve">at gøre det, skal vi vide hvordan sådan en fil ser ud. </w:t>
+      </w:r>
+      <w:r>
+        <w:t xml:space="preserve">De indeholder en identifikator til et produkt. Det kaldes en EAN-kode. Der er også hvor mange produkter der var i salget, samt for hvor meget det hele kostede. Det er de vigtigste data for os, men vi kommer også til at mangle noget mere da vi ikke har et kæmpe katalog af </w:t>
+      </w:r>
+      <w:r>
+        <w:t>EAN-koder</w:t>
+      </w:r>
+      <w:r>
+        <w:t xml:space="preserve"> og de produkter de peger hen til.</w:t>
+      </w:r>
+    </w:p>
+    <w:p>
+      <w:r>
+        <w:t>For at få den samme funktionalitet ud af vores program som GoFact, skal vi tilføje nogle felter som nogle gange er der, og andre gange ikke. (igen snakker vi om systemer som ikke er standardiseret) De felter vi tilføjer som oftest ikke er med i disse typer filer er ”CostPrice”. Altså hvor meget kostede varen. Vi tilføjer også en ”SalesPrice” felt, som er hvad en af disse produkter sælges for. Det sidste felt vi tilføjer er et ”gross profit” felt. Det er den totale mængde profit der kom af salget. Det er dette man kigger mest på når man ser hvilke produkter man skal fokusere på, men man kigger også på antal solgte, da det er de varer folk køber mest, er der mest potentielle på dem.</w:t>
+      </w:r>
+    </w:p>
+    <w:p>
+      <w:pPr>
+        <w:rPr>
+          <w:b/>
+          <w:bCs/>
+        </w:rPr>
+      </w:pPr>
+      <w:r>
+        <w:rPr>
+          <w:b/>
+          <w:bCs/>
+        </w:rPr>
+        <w:t>Nr</w:t>
+      </w:r>
+      <w:r>
+        <w:rPr>
+          <w:b/>
+          <w:bCs/>
+        </w:rPr>
+        <w:t>.</w:t>
+      </w:r>
+      <w:r>
+        <w:rPr>
+          <w:b/>
+          <w:bCs/>
+        </w:rPr>
+        <w:t xml:space="preserve"> 3 </w:t>
+      </w:r>
+      <w:r>
+        <w:rPr>
+          <w:b/>
+          <w:bCs/>
+        </w:rPr>
+        <w:t>Sortere efter industri standart og højeste salg</w:t>
+      </w:r>
+    </w:p>
+    <w:p>
+      <w:r>
+        <w:t>Vi skal vise data på en måde som gør det nemt for kunden at se hvad der er solgt, og hvor meget. Oftest sortere man efter størrelse indenfor hvert produkt.</w:t>
+      </w:r>
+      <w:r>
+        <w:t xml:space="preserve"> Men vi skal også have højeste salg først, da det er dem vi skal vise til kunden. </w:t>
+      </w:r>
+    </w:p>
+    <w:p>
+      <w:r>
+        <w:t xml:space="preserve">Vi ender med en mærkelig blanding af industri standarten, og min egen version, da jeg ikke har et katalog af produkter, bliver hver EAN kode et helt unikt produkt, hvor man oftest ville have en række af EAN koder der er ”samme” produkt, men en anden størrelse eller anden farve. Det betyder at i mit program bliver der sorteret efter </w:t>
+      </w:r>
+      <w:r>
+        <w:rPr>
+          <w:i/>
+          <w:iCs/>
+        </w:rPr>
+        <w:t>alle</w:t>
+      </w:r>
+      <w:r>
+        <w:t xml:space="preserve"> størrelser, og indenfor samme størrelse, antal salg. Det er ikke helt som man gør i den virkelige verden, men for at få det til at passe til den virkelige verden ville jeg skulle have rigtig data, i stedet for data jeg selv laver.</w:t>
+      </w:r>
+    </w:p>
+    <w:p>
+      <w:pPr>
+        <w:rPr>
+          <w:b/>
+          <w:bCs/>
+        </w:rPr>
+      </w:pPr>
+      <w:r>
+        <w:rPr>
+          <w:b/>
+          <w:bCs/>
+        </w:rPr>
+        <w:t>Nr</w:t>
+      </w:r>
+      <w:r>
+        <w:rPr>
+          <w:b/>
+          <w:bCs/>
+        </w:rPr>
+        <w:t>.</w:t>
+      </w:r>
+      <w:r>
+        <w:rPr>
+          <w:b/>
+          <w:bCs/>
+        </w:rPr>
+        <w:t xml:space="preserve"> 4 Vise resultatet nemt</w:t>
+      </w:r>
+    </w:p>
+    <w:p>
+      <w:r>
+        <w:t xml:space="preserve">For at sælge </w:t>
+      </w:r>
+      <w:r>
+        <w:t xml:space="preserve">firmaet til en kunde, skal det være nemt for kunden at forstå hvad de kigger på. De fleste mennesker har erfaring med Excel, og det er også ofte det salgs mennesker bruger. Derfor skal vi kunne udskrive vores resultat i Excel. Det ville være det nemmeste at forstå for en gennemsnitlig person, men hvis vi ender med en kunde der har lidt mere faglig viden, kan vi udskrive det i JSON. Det er også et meget kendt format, men det kræver oftest at man har med noget IT at gøre for at man har set det før. Så hvis man skulle overbevise IT afdelingen hos en kunde ville det være smart med denne mulighed. </w:t>
+      </w:r>
+    </w:p>
+    <w:p>
+      <w:r>
+        <w:t>Vi beholder også den originale fil, da det kunne være data kunden ikke vil miste. Derfor skriver vi en ny fil med output, og putter det ind i en anden mappe så kunden ikke bliver forvirret over hvilken fil er ny.</w:t>
+      </w:r>
+    </w:p>
+    <w:p>
       <w:pPr>
         <w:pStyle w:val="Heading3"/>
       </w:pPr>
-      <w:proofErr w:type="spellStart"/>
-      <w:r>
-        <w:t>Should</w:t>
-      </w:r>
-      <w:proofErr w:type="spellEnd"/>
-      <w:r>
-        <w:t xml:space="preserve"> Have</w:t>
-      </w:r>
-    </w:p>
+      <w:r>
+        <w:lastRenderedPageBreak/>
+        <w:t>Should Have</w:t>
+      </w:r>
+    </w:p>
+    <w:p>
+      <w:r>
+        <w:t xml:space="preserve">Nu er vi i ”should have” og her handler det om ”Hvad skal vores program have, for at det er lidt mere end bare minimum”.  </w:t>
+      </w:r>
+      <w:r>
+        <w:t>Jeg vil gerne have disse funktioner i programmet, så det er mere end bare det mindste der ville være acceptabelt.</w:t>
+      </w:r>
+    </w:p>
+    <w:p>
+      <w:pPr>
+        <w:rPr>
+          <w:b/>
+          <w:bCs/>
+        </w:rPr>
+      </w:pPr>
+      <w:r>
+        <w:rPr>
+          <w:b/>
+          <w:bCs/>
+        </w:rPr>
+        <w:t>Nr</w:t>
+      </w:r>
+      <w:r>
+        <w:rPr>
+          <w:b/>
+          <w:bCs/>
+        </w:rPr>
+        <w:t>.</w:t>
+      </w:r>
+      <w:r>
+        <w:rPr>
+          <w:b/>
+          <w:bCs/>
+        </w:rPr>
+        <w:t xml:space="preserve"> 1 Syntetisk data</w:t>
+      </w:r>
+    </w:p>
+    <w:p>
+      <w:r>
+        <w:t>Jeg kan desværre ikke bruge en rigtig fil, da kunderne hos GoFact forventer at ingen ser deres data. Men jeg kan lave mine egne, som indeholder noget ens, men ikke det helt samme, som de rigtige filer. Dette er blandt andet for at være sikker på at jeg ikke giver noget væk jeg ikke må, men også for at fjerne unødvendige felter som kun ville tilføje mere manuelt arbejde, men ingen ekstra funktionalitet.</w:t>
+      </w:r>
+    </w:p>
+    <w:p>
+      <w:r>
+        <w:t xml:space="preserve">Det handler ikke om personfølsomme informationer, men det er en brud på GoFacts’ regler. Det betyder at jeg ikke kan bruge en rigtig fil, men jeg kan tage inspiration fra dem til at skrive min egne. </w:t>
+      </w:r>
+    </w:p>
+    <w:p>
+      <w:r>
+        <w:t xml:space="preserve">For at teste forskellige kombinationer, og vise at det bliver gjort live foran kunden, skriver vi noget kode som </w:t>
+      </w:r>
+      <w:r>
+        <w:rPr>
+          <w:i/>
+          <w:iCs/>
+        </w:rPr>
+        <w:t>automatisk laver forskellige produkter</w:t>
+      </w:r>
+      <w:r>
+        <w:rPr>
+          <w:i/>
+          <w:iCs/>
+        </w:rPr>
+        <w:t xml:space="preserve">. </w:t>
+      </w:r>
+      <w:r>
+        <w:t>Det skal indeholde en tilfældig blanding af EAN-koder, Størrelser og priser. Det skal ikke være helt tilfældigt, da vi skal have mulighed for at sælge den samme vare flere gange. For at få begge disse krav laver vi en liste over produkter, og når vi ”laver et salg” i vores fil, vælger vi en af disse forskellige produkter. Det betyder at vi laver nye produkter en gang ved hver gang vi kører programmet, og derefter genbruger dem vi har lavet.</w:t>
+      </w:r>
+    </w:p>
+    <w:p>
+      <w:r>
+        <w:t xml:space="preserve">På denne måde har vi de felter vi skal bruge for at programmet kører, uden at bryde nogle Terms of Service, og vi har noget kunden kan se hvis de ikke gider at bruge deres egne data. </w:t>
+      </w:r>
+    </w:p>
+    <w:p>
+      <w:pPr>
+        <w:rPr>
+          <w:b/>
+          <w:bCs/>
+        </w:rPr>
+      </w:pPr>
+      <w:r>
+        <w:rPr>
+          <w:b/>
+          <w:bCs/>
+        </w:rPr>
+        <w:t>Nr</w:t>
+      </w:r>
+      <w:r>
+        <w:rPr>
+          <w:b/>
+          <w:bCs/>
+        </w:rPr>
+        <w:t>.</w:t>
+      </w:r>
+      <w:r>
+        <w:rPr>
+          <w:b/>
+          <w:bCs/>
+        </w:rPr>
+        <w:t xml:space="preserve"> 2 </w:t>
+      </w:r>
+      <w:r>
+        <w:rPr>
+          <w:b/>
+          <w:bCs/>
+        </w:rPr>
+        <w:t>Support til flere filer på en gang</w:t>
+      </w:r>
+    </w:p>
+    <w:p>
+      <w:r>
+        <w:t xml:space="preserve">Programmet vil ikke have noget dato felt, da det kan være at kunden ikke har filen adskilt efter dato, og vi ville samle data som ikke skulle samles. Så hvis en kunde har en ny fil per måned, eller hvad nu end de har, skal vi kunne køre flere filer på en gang. Dette er for at gøre det nemmere at vise programmet. </w:t>
+      </w:r>
+    </w:p>
+    <w:p>
+      <w:pPr>
+        <w:rPr>
+          <w:b/>
+          <w:bCs/>
+        </w:rPr>
+      </w:pPr>
+      <w:r>
+        <w:rPr>
+          <w:b/>
+          <w:bCs/>
+        </w:rPr>
+        <w:br w:type="page"/>
+      </w:r>
+    </w:p>
+    <w:p>
+      <w:pPr>
+        <w:rPr>
+          <w:b/>
+          <w:bCs/>
+        </w:rPr>
+      </w:pPr>
+      <w:r>
+        <w:rPr>
+          <w:b/>
+          <w:bCs/>
+        </w:rPr>
+        <w:lastRenderedPageBreak/>
+        <w:t>Nr. 3 Fejl håndtering</w:t>
+      </w:r>
+    </w:p>
+    <w:p>
+      <w:r>
+        <w:t xml:space="preserve">Når der er en fejl i GoFacts’ system, bliver det sagt videre til kunden så de kan fixe det. Der er selvfølgelig fejl-beskeder inde i GoFacts’ system internt, men hvis det er noget kunden, har brug for at vide bliver det givet til dem. Vores program skal også nemt kunne forklare hvad der er galt. Et nemt eksempel på noget der kunne have været gået galt, er hvis den delimeter der bliver brugt i filen er det samme som decimal tegnet. Det ville resultere i flere rækker i dataen end der er i headeren. Dette ville ødelægge programmet, men potentielt ikke på en måde der ville crashe systemet. Det ville betyde at en outputfil ville stadig blive lavet, men det ville være forkert. Hvis vi viser det til en kunde uden de kan se hvad der er gået galt, tænker de at vi ikke har et produkt der virker. Derfor skal vi have tjeks til at se om noget i denne stil sker, så vi kan fixe det foran kunden og prøve igen, uden at de tænker at vores system ikke virker. </w:t>
+      </w:r>
+    </w:p>
+    <w:p/>
     <w:p>
       <w:pPr>
         <w:pStyle w:val="Heading3"/>
       </w:pPr>
-      <w:proofErr w:type="spellStart"/>
-      <w:r>
-        <w:t>Could</w:t>
-      </w:r>
-      <w:proofErr w:type="spellEnd"/>
-      <w:r>
-        <w:t xml:space="preserve"> have</w:t>
+      <w:r>
+        <w:t>Could have</w:t>
+      </w:r>
+    </w:p>
+    <w:p>
+      <w:r>
+        <w:t>Når vi snakker om could have, snakker vi om ideer. Jo, Must have og Should have er også ideer, men de skal være der for at programmet er en succes. Men could have er mere frit. Hvis vi havde uendeligt tid og ressourcer kunne vi lave alt på listen, men disse ting er mindre vigtige end resten. Hvis de ikke når at blive lavet gør det ikke noget, da vi stadig har det program vi ville have.</w:t>
+      </w:r>
+    </w:p>
+    <w:p>
+      <w:pPr>
+        <w:ind w:left="360"/>
+        <w:rPr>
+          <w:b/>
+          <w:bCs/>
+        </w:rPr>
+      </w:pPr>
+      <w:r>
+        <w:rPr>
+          <w:b/>
+          <w:bCs/>
+        </w:rPr>
+        <w:t>Nr. 1 Flere farver I konsollen til at øge læsbarhed</w:t>
+      </w:r>
+    </w:p>
+    <w:p>
+      <w:r>
+        <w:t>De fleste mennesker er ikke vant til konsol applikationer. Derfor skal vi prøve at gøre det så nemt for dem som muligt</w:t>
+      </w:r>
+    </w:p>
+    <w:p>
+      <w:pPr>
+        <w:ind w:left="360"/>
+        <w:rPr>
+          <w:b/>
+          <w:bCs/>
+        </w:rPr>
+      </w:pPr>
+      <w:r>
+        <w:rPr>
+          <w:b/>
+          <w:bCs/>
+        </w:rPr>
+        <w:t>Nr. 2 En hurtigere måde at ændre filen på en manuel arbejde</w:t>
+      </w:r>
+    </w:p>
+    <w:p>
+      <w:r>
+        <w:t>Måden vi har vores program til at være hurtigere end GoFacts’ system er at vi går ud fra at vi ved hvad der er i headerne. Måden dette skulle ske var at vi manuelt tjekkede den data der var i filen før vi kørte den igennem programmet. Men man kunne have en konsol interface hvor man kunne angive header navne, eller hvilken række nummer som den værdi havde. Dette er et blødere krav, og betyder ikke at programmet skal have det. Men det ville være en rar feature hvis den havde.</w:t>
+      </w:r>
+    </w:p>
+    <w:p>
+      <w:pPr>
+        <w:rPr>
+          <w:b/>
+          <w:bCs/>
+        </w:rPr>
+      </w:pPr>
+    </w:p>
+    <w:p>
+      <w:pPr>
+        <w:rPr>
+          <w:rFonts w:eastAsiaTheme="majorEastAsia" w:cstheme="majorBidi"/>
+          <w:color w:val="0F4761" w:themeColor="accent1" w:themeShade="BF"/>
+          <w:sz w:val="28"/>
+          <w:szCs w:val="28"/>
+        </w:rPr>
+      </w:pPr>
+      <w:r>
+        <w:br w:type="page"/>
       </w:r>
     </w:p>
     <w:p>
       <w:pPr>
         <w:pStyle w:val="Heading3"/>
-      </w:pPr>
-      <w:proofErr w:type="spellStart"/>
-      <w:r>
-        <w:t>Wont</w:t>
-      </w:r>
-      <w:proofErr w:type="spellEnd"/>
-      <w:r>
-        <w:t xml:space="preserve"> have</w:t>
+        <w:rPr>
+          <w:lang w:val="en-US"/>
+        </w:rPr>
+      </w:pPr>
+      <w:r>
+        <w:rPr>
+          <w:lang w:val="en-US"/>
+        </w:rPr>
+        <w:lastRenderedPageBreak/>
+        <w:t>Wont have</w:t>
+      </w:r>
+    </w:p>
+    <w:p>
+      <w:r>
+        <w:t xml:space="preserve">Wont have er </w:t>
+      </w:r>
+      <w:r>
+        <w:t xml:space="preserve">sektionen hvor vi afskærer features fra programmet. Det er ting som man kunne have med, hvis man havde ingen grænse på tid eller ressourcer. Det er også her hvor man kan fjerner features som ikke ville bidrage til programmet men tager tid at implementere, eller i værste tilfælde trække fokus fra vigtige områder. </w:t>
+      </w:r>
+    </w:p>
+    <w:p>
+      <w:pPr>
+        <w:pStyle w:val="ListParagraph"/>
+        <w:numPr>
+          <w:ilvl w:val="0"/>
+          <w:numId w:val="23"/>
+        </w:numPr>
+        <w:rPr>
+          <w:lang w:val="en-US"/>
+        </w:rPr>
+      </w:pPr>
+      <w:r>
+        <w:rPr>
+          <w:lang w:val="en-US"/>
+        </w:rPr>
+        <w:t>GUI</w:t>
+      </w:r>
+    </w:p>
+    <w:p>
+      <w:pPr>
+        <w:pStyle w:val="ListParagraph"/>
+        <w:numPr>
+          <w:ilvl w:val="0"/>
+          <w:numId w:val="23"/>
+        </w:numPr>
+        <w:rPr>
+          <w:lang w:val="en-US"/>
+        </w:rPr>
+      </w:pPr>
+      <w:r>
+        <w:rPr>
+          <w:lang w:val="en-US"/>
+        </w:rPr>
+        <w:t>Advanced GoFact Features</w:t>
+      </w:r>
+    </w:p>
+    <w:p>
+      <w:pPr>
+        <w:rPr>
+          <w:b/>
+          <w:bCs/>
+        </w:rPr>
+      </w:pPr>
+      <w:r>
+        <w:rPr>
+          <w:b/>
+          <w:bCs/>
+        </w:rPr>
+        <w:t xml:space="preserve">Nr. 1 Graphical user interface </w:t>
+      </w:r>
+    </w:p>
+    <w:p>
+      <w:r>
+        <w:t xml:space="preserve">Noget som man i første tilfælde kunne tænke ville være en god ting at have med i sit program, ville være en grafisk brugergrænseflade. Det er ofte hvad man er vandt til når man bruger et program, og hvis mit mål er at gøre det så nemt for brugeren som muligt, hvorfor vælger jeg så ikke at have det med i mit program? </w:t>
+      </w:r>
+    </w:p>
+    <w:p>
+      <w:r>
+        <w:t xml:space="preserve">Simplicitet. Der er mange problemer man kommer ind i når man har en GUI, og det er heller ikke alle applikationer der kræver en. Mit programs input er filer i en folder. Det er ikke komplekst eller kræver andet input, og dermed kunne man spørge ”Hvad skulle en GUI i dette program vise?” </w:t>
+      </w:r>
+    </w:p>
+    <w:p>
+      <w:r>
+        <w:t>Status over hvor langt den er i processen? Programmet er meget hurtigt, og når næsten altid at være færdig så snart man trykker på start.</w:t>
+      </w:r>
+    </w:p>
+    <w:p>
+      <w:r>
+        <w:t>Input? Hvorfor have input på en GUI man også skal lære, hvis man allerede bruger filsystemer ofte?</w:t>
+      </w:r>
+    </w:p>
+    <w:p>
+      <w:r>
+        <w:t xml:space="preserve">Mit program kræver ikke en GUI, da den ikke ville bruge den. Så hvorfor involvere grafisk design, testing af UI </w:t>
+      </w:r>
+      <w:r>
+        <w:t>og en masse programmering, for en feature som ikke ville bidrage til funktionen af produktet? Det er derfor jeg har valgt ikke at have en GUI til mit program. Programmet er simpelt, og det ville kun forvirrer med at have en GUI.</w:t>
+      </w:r>
+    </w:p>
+    <w:p>
+      <w:r>
+        <w:t xml:space="preserve">Nr. 2 Advan </w:t>
       </w:r>
     </w:p>
     <w:p/>
@@ -1338,15 +2073,7 @@
         </w:numPr>
       </w:pPr>
       <w:r>
-        <w:t>Men ikke teori om mønstre (</w:t>
-      </w:r>
-      <w:proofErr w:type="gramStart"/>
-      <w:r>
-        <w:t>med mindre</w:t>
-      </w:r>
-      <w:proofErr w:type="gramEnd"/>
-      <w:r>
-        <w:t xml:space="preserve"> de er nye).</w:t>
+        <w:t>Men ikke teori om mønstre (med mindre de er nye).</w:t>
       </w:r>
       <w:r>
         <w:rPr>
@@ -1364,15 +2091,7 @@
         </w:numPr>
       </w:pPr>
       <w:r>
-        <w:t xml:space="preserve">Eksempler på interessante dele af </w:t>
-      </w:r>
-      <w:proofErr w:type="spellStart"/>
-      <w:r>
-        <w:t>implementationen</w:t>
-      </w:r>
-      <w:proofErr w:type="spellEnd"/>
-      <w:r>
-        <w:t>.</w:t>
+        <w:t>Eksempler på interessante dele af implementationen.</w:t>
       </w:r>
       <w:r>
         <w:rPr>
@@ -1508,7 +2227,6 @@
           <w:lang w:val="en-US"/>
         </w:rPr>
       </w:pPr>
-      <w:proofErr w:type="spellStart"/>
       <w:r>
         <w:rPr>
           <w:b/>
@@ -1517,7 +2235,6 @@
         </w:rPr>
         <w:t>Konklusion</w:t>
       </w:r>
-      <w:proofErr w:type="spellEnd"/>
     </w:p>
     <w:p>
       <w:pPr>
@@ -1542,61 +2259,11 @@
           <w:lang w:val="en-US"/>
         </w:rPr>
       </w:pPr>
-      <w:proofErr w:type="spellStart"/>
-      <w:r>
-        <w:rPr>
-          <w:lang w:val="en-US"/>
-        </w:rPr>
-        <w:t>Opsummerer</w:t>
-      </w:r>
-      <w:proofErr w:type="spellEnd"/>
-      <w:r>
-        <w:rPr>
-          <w:lang w:val="en-US"/>
-        </w:rPr>
-        <w:t xml:space="preserve"> </w:t>
-      </w:r>
-      <w:proofErr w:type="spellStart"/>
-      <w:r>
-        <w:rPr>
-          <w:lang w:val="en-US"/>
-        </w:rPr>
-        <w:t>resultater</w:t>
-      </w:r>
-      <w:proofErr w:type="spellEnd"/>
-      <w:r>
-        <w:rPr>
-          <w:lang w:val="en-US"/>
-        </w:rPr>
-        <w:t xml:space="preserve"> </w:t>
-      </w:r>
-      <w:proofErr w:type="spellStart"/>
-      <w:r>
-        <w:rPr>
-          <w:lang w:val="en-US"/>
-        </w:rPr>
-        <w:t>og</w:t>
-      </w:r>
-      <w:proofErr w:type="spellEnd"/>
-      <w:r>
-        <w:rPr>
-          <w:lang w:val="en-US"/>
-        </w:rPr>
-        <w:t xml:space="preserve"> </w:t>
-      </w:r>
-      <w:proofErr w:type="spellStart"/>
-      <w:r>
-        <w:rPr>
-          <w:lang w:val="en-US"/>
-        </w:rPr>
-        <w:t>slutninger</w:t>
-      </w:r>
-      <w:proofErr w:type="spellEnd"/>
-      <w:r>
-        <w:rPr>
-          <w:lang w:val="en-US"/>
-        </w:rPr>
-        <w:t>.</w:t>
+      <w:r>
+        <w:rPr>
+          <w:lang w:val="en-US"/>
+        </w:rPr>
+        <w:t>Opsummerer resultater og slutninger.</w:t>
       </w:r>
     </w:p>
     <w:p>
@@ -1610,61 +2277,11 @@
           <w:lang w:val="en-US"/>
         </w:rPr>
       </w:pPr>
-      <w:proofErr w:type="spellStart"/>
-      <w:r>
-        <w:rPr>
-          <w:lang w:val="en-US"/>
-        </w:rPr>
-        <w:t>Understøttes</w:t>
-      </w:r>
-      <w:proofErr w:type="spellEnd"/>
-      <w:r>
-        <w:rPr>
-          <w:lang w:val="en-US"/>
-        </w:rPr>
-        <w:t xml:space="preserve"> </w:t>
-      </w:r>
-      <w:proofErr w:type="spellStart"/>
-      <w:r>
-        <w:rPr>
-          <w:lang w:val="en-US"/>
-        </w:rPr>
-        <w:t>af</w:t>
-      </w:r>
-      <w:proofErr w:type="spellEnd"/>
-      <w:r>
-        <w:rPr>
-          <w:lang w:val="en-US"/>
-        </w:rPr>
-        <w:t xml:space="preserve"> </w:t>
-      </w:r>
-      <w:proofErr w:type="spellStart"/>
-      <w:r>
-        <w:rPr>
-          <w:lang w:val="en-US"/>
-        </w:rPr>
-        <w:t>rapportens</w:t>
-      </w:r>
-      <w:proofErr w:type="spellEnd"/>
-      <w:r>
-        <w:rPr>
-          <w:lang w:val="en-US"/>
-        </w:rPr>
-        <w:t xml:space="preserve"> </w:t>
-      </w:r>
-      <w:proofErr w:type="spellStart"/>
-      <w:r>
-        <w:rPr>
-          <w:lang w:val="en-US"/>
-        </w:rPr>
-        <w:t>hovedafsnit</w:t>
-      </w:r>
-      <w:proofErr w:type="spellEnd"/>
-      <w:r>
-        <w:rPr>
-          <w:lang w:val="en-US"/>
-        </w:rPr>
-        <w:t>.</w:t>
+      <w:r>
+        <w:rPr>
+          <w:lang w:val="en-US"/>
+        </w:rPr>
+        <w:t>Understøttes af rapportens hovedafsnit.</w:t>
       </w:r>
     </w:p>
     <w:p>
@@ -1678,19 +2295,11 @@
           <w:lang w:val="en-US"/>
         </w:rPr>
       </w:pPr>
-      <w:proofErr w:type="spellStart"/>
-      <w:r>
-        <w:rPr>
-          <w:lang w:val="en-US"/>
-        </w:rPr>
-        <w:t>Perspektivering</w:t>
-      </w:r>
-      <w:proofErr w:type="spellEnd"/>
-      <w:r>
-        <w:rPr>
-          <w:lang w:val="en-US"/>
-        </w:rPr>
-        <w:t>:</w:t>
+      <w:r>
+        <w:rPr>
+          <w:lang w:val="en-US"/>
+        </w:rPr>
+        <w:t>Perspektivering:</w:t>
       </w:r>
     </w:p>
     <w:p>
@@ -1708,21 +2317,7 @@
         <w:rPr>
           <w:lang w:val="en-US"/>
         </w:rPr>
-        <w:t xml:space="preserve">Ser </w:t>
-      </w:r>
-      <w:proofErr w:type="spellStart"/>
-      <w:r>
-        <w:rPr>
-          <w:lang w:val="en-US"/>
-        </w:rPr>
-        <w:t>fremad</w:t>
-      </w:r>
-      <w:proofErr w:type="spellEnd"/>
-      <w:r>
-        <w:rPr>
-          <w:lang w:val="en-US"/>
-        </w:rPr>
-        <w:t>.</w:t>
+        <w:t>Ser fremad.</w:t>
       </w:r>
     </w:p>
     <w:p>
@@ -1740,21 +2335,7 @@
         <w:rPr>
           <w:lang w:val="en-US"/>
         </w:rPr>
-        <w:t xml:space="preserve">Hold det </w:t>
-      </w:r>
-      <w:proofErr w:type="spellStart"/>
-      <w:r>
-        <w:rPr>
-          <w:lang w:val="en-US"/>
-        </w:rPr>
-        <w:t>kort</w:t>
-      </w:r>
-      <w:proofErr w:type="spellEnd"/>
-      <w:r>
-        <w:rPr>
-          <w:lang w:val="en-US"/>
-        </w:rPr>
-        <w:t>.</w:t>
+        <w:t>Hold det kort.</w:t>
       </w:r>
     </w:p>
     <w:p>
@@ -1778,16 +2359,8 @@
         <w:rPr>
           <w:lang w:val="en-US"/>
         </w:rPr>
-        <w:t xml:space="preserve">sider </w:t>
-      </w:r>
-      <w:proofErr w:type="spellStart"/>
-      <w:r>
-        <w:rPr>
-          <w:lang w:val="en-US"/>
-        </w:rPr>
-        <w:t>mål</w:t>
-      </w:r>
-      <w:proofErr w:type="spellEnd"/>
+        <w:t>sider mål</w:t>
+      </w:r>
     </w:p>
     <w:p>
       <w:pPr>
@@ -1893,23 +2466,7 @@
     </w:p>
     <w:p>
       <w:r>
-        <w:t xml:space="preserve">Teori: Snak om Regex i sorteringen. Det er </w:t>
-      </w:r>
-      <w:proofErr w:type="gramStart"/>
-      <w:r>
-        <w:t>ny  teori</w:t>
-      </w:r>
-      <w:proofErr w:type="gramEnd"/>
-      <w:r>
-        <w:t xml:space="preserve"> som ikke er blevet nævnt i undervisningen. Gå i dybden om hvordan den læser og hvordan man </w:t>
-      </w:r>
-      <w:proofErr w:type="gramStart"/>
-      <w:r>
-        <w:t>optimere</w:t>
-      </w:r>
-      <w:proofErr w:type="gramEnd"/>
-      <w:r>
-        <w:t xml:space="preserve"> en Regex Expression.</w:t>
+        <w:t>Teori: Snak om Regex i sorteringen. Det er ny  teori som ikke er blevet nævnt i undervisningen. Gå i dybden om hvordan den læser og hvordan man optimere en Regex Expression.</w:t>
       </w:r>
     </w:p>
     <w:p>
@@ -2079,6 +2636,119 @@
     </w:lvl>
   </w:abstractNum>
   <w:abstractNum w:abstractNumId="1" w15:restartNumberingAfterBreak="0">
+    <w:nsid w:val="18EA6F59"/>
+    <w:multiLevelType w:val="hybridMultilevel"/>
+    <w:tmpl w:val="8A5A3B00"/>
+    <w:lvl w:ilvl="0" w:tplc="FFFFFFFF">
+      <w:start w:val="1"/>
+      <w:numFmt w:val="decimal"/>
+      <w:lvlText w:val="%1."/>
+      <w:lvlJc w:val="left"/>
+      <w:pPr>
+        <w:ind w:left="720" w:hanging="360"/>
+      </w:pPr>
+      <w:rPr>
+        <w:rFonts w:asciiTheme="minorHAnsi" w:eastAsiaTheme="minorHAnsi" w:hAnsiTheme="minorHAnsi" w:cstheme="minorBidi"/>
+      </w:rPr>
+    </w:lvl>
+    <w:lvl w:ilvl="1" w:tplc="FFFFFFFF" w:tentative="1">
+      <w:start w:val="1"/>
+      <w:numFmt w:val="bullet"/>
+      <w:lvlText w:val="o"/>
+      <w:lvlJc w:val="left"/>
+      <w:pPr>
+        <w:ind w:left="1440" w:hanging="360"/>
+      </w:pPr>
+      <w:rPr>
+        <w:rFonts w:ascii="Courier New" w:hAnsi="Courier New" w:cs="Courier New" w:hint="default"/>
+      </w:rPr>
+    </w:lvl>
+    <w:lvl w:ilvl="2" w:tplc="FFFFFFFF" w:tentative="1">
+      <w:start w:val="1"/>
+      <w:numFmt w:val="bullet"/>
+      <w:lvlText w:val=""/>
+      <w:lvlJc w:val="left"/>
+      <w:pPr>
+        <w:ind w:left="2160" w:hanging="360"/>
+      </w:pPr>
+      <w:rPr>
+        <w:rFonts w:ascii="Wingdings" w:hAnsi="Wingdings" w:hint="default"/>
+      </w:rPr>
+    </w:lvl>
+    <w:lvl w:ilvl="3" w:tplc="FFFFFFFF" w:tentative="1">
+      <w:start w:val="1"/>
+      <w:numFmt w:val="bullet"/>
+      <w:lvlText w:val=""/>
+      <w:lvlJc w:val="left"/>
+      <w:pPr>
+        <w:ind w:left="2880" w:hanging="360"/>
+      </w:pPr>
+      <w:rPr>
+        <w:rFonts w:ascii="Symbol" w:hAnsi="Symbol" w:hint="default"/>
+      </w:rPr>
+    </w:lvl>
+    <w:lvl w:ilvl="4" w:tplc="FFFFFFFF" w:tentative="1">
+      <w:start w:val="1"/>
+      <w:numFmt w:val="bullet"/>
+      <w:lvlText w:val="o"/>
+      <w:lvlJc w:val="left"/>
+      <w:pPr>
+        <w:ind w:left="3600" w:hanging="360"/>
+      </w:pPr>
+      <w:rPr>
+        <w:rFonts w:ascii="Courier New" w:hAnsi="Courier New" w:cs="Courier New" w:hint="default"/>
+      </w:rPr>
+    </w:lvl>
+    <w:lvl w:ilvl="5" w:tplc="FFFFFFFF" w:tentative="1">
+      <w:start w:val="1"/>
+      <w:numFmt w:val="bullet"/>
+      <w:lvlText w:val=""/>
+      <w:lvlJc w:val="left"/>
+      <w:pPr>
+        <w:ind w:left="4320" w:hanging="360"/>
+      </w:pPr>
+      <w:rPr>
+        <w:rFonts w:ascii="Wingdings" w:hAnsi="Wingdings" w:hint="default"/>
+      </w:rPr>
+    </w:lvl>
+    <w:lvl w:ilvl="6" w:tplc="FFFFFFFF" w:tentative="1">
+      <w:start w:val="1"/>
+      <w:numFmt w:val="bullet"/>
+      <w:lvlText w:val=""/>
+      <w:lvlJc w:val="left"/>
+      <w:pPr>
+        <w:ind w:left="5040" w:hanging="360"/>
+      </w:pPr>
+      <w:rPr>
+        <w:rFonts w:ascii="Symbol" w:hAnsi="Symbol" w:hint="default"/>
+      </w:rPr>
+    </w:lvl>
+    <w:lvl w:ilvl="7" w:tplc="FFFFFFFF" w:tentative="1">
+      <w:start w:val="1"/>
+      <w:numFmt w:val="bullet"/>
+      <w:lvlText w:val="o"/>
+      <w:lvlJc w:val="left"/>
+      <w:pPr>
+        <w:ind w:left="5760" w:hanging="360"/>
+      </w:pPr>
+      <w:rPr>
+        <w:rFonts w:ascii="Courier New" w:hAnsi="Courier New" w:cs="Courier New" w:hint="default"/>
+      </w:rPr>
+    </w:lvl>
+    <w:lvl w:ilvl="8" w:tplc="FFFFFFFF" w:tentative="1">
+      <w:start w:val="1"/>
+      <w:numFmt w:val="bullet"/>
+      <w:lvlText w:val=""/>
+      <w:lvlJc w:val="left"/>
+      <w:pPr>
+        <w:ind w:left="6480" w:hanging="360"/>
+      </w:pPr>
+      <w:rPr>
+        <w:rFonts w:ascii="Wingdings" w:hAnsi="Wingdings" w:hint="default"/>
+      </w:rPr>
+    </w:lvl>
+  </w:abstractNum>
+  <w:abstractNum w:abstractNumId="2" w15:restartNumberingAfterBreak="0">
     <w:nsid w:val="19E34134"/>
     <w:multiLevelType w:val="multilevel"/>
     <w:tmpl w:val="31922EBA"/>
@@ -2191,7 +2861,7 @@
       </w:pPr>
     </w:lvl>
   </w:abstractNum>
-  <w:abstractNum w:abstractNumId="2" w15:restartNumberingAfterBreak="0">
+  <w:abstractNum w:abstractNumId="3" w15:restartNumberingAfterBreak="0">
     <w:nsid w:val="1EE5018F"/>
     <w:multiLevelType w:val="multilevel"/>
     <w:tmpl w:val="04E04350"/>
@@ -2340,7 +3010,7 @@
       </w:rPr>
     </w:lvl>
   </w:abstractNum>
-  <w:abstractNum w:abstractNumId="3" w15:restartNumberingAfterBreak="0">
+  <w:abstractNum w:abstractNumId="4" w15:restartNumberingAfterBreak="0">
     <w:nsid w:val="21AB5BD7"/>
     <w:multiLevelType w:val="multilevel"/>
     <w:tmpl w:val="0758F444"/>
@@ -2489,7 +3159,387 @@
       </w:rPr>
     </w:lvl>
   </w:abstractNum>
-  <w:abstractNum w:abstractNumId="4" w15:restartNumberingAfterBreak="0">
+  <w:abstractNum w:abstractNumId="5" w15:restartNumberingAfterBreak="0">
+    <w:nsid w:val="26745EC0"/>
+    <w:multiLevelType w:val="hybridMultilevel"/>
+    <w:tmpl w:val="68F884CA"/>
+    <w:lvl w:ilvl="0" w:tplc="0406000F">
+      <w:start w:val="3"/>
+      <w:numFmt w:val="decimal"/>
+      <w:lvlText w:val="%1."/>
+      <w:lvlJc w:val="left"/>
+      <w:pPr>
+        <w:ind w:left="720" w:hanging="360"/>
+      </w:pPr>
+      <w:rPr>
+        <w:rFonts w:hint="default"/>
+      </w:rPr>
+    </w:lvl>
+    <w:lvl w:ilvl="1" w:tplc="04060019" w:tentative="1">
+      <w:start w:val="1"/>
+      <w:numFmt w:val="lowerLetter"/>
+      <w:lvlText w:val="%2."/>
+      <w:lvlJc w:val="left"/>
+      <w:pPr>
+        <w:ind w:left="1440" w:hanging="360"/>
+      </w:pPr>
+    </w:lvl>
+    <w:lvl w:ilvl="2" w:tplc="0406001B" w:tentative="1">
+      <w:start w:val="1"/>
+      <w:numFmt w:val="lowerRoman"/>
+      <w:lvlText w:val="%3."/>
+      <w:lvlJc w:val="right"/>
+      <w:pPr>
+        <w:ind w:left="2160" w:hanging="180"/>
+      </w:pPr>
+    </w:lvl>
+    <w:lvl w:ilvl="3" w:tplc="0406000F" w:tentative="1">
+      <w:start w:val="1"/>
+      <w:numFmt w:val="decimal"/>
+      <w:lvlText w:val="%4."/>
+      <w:lvlJc w:val="left"/>
+      <w:pPr>
+        <w:ind w:left="2880" w:hanging="360"/>
+      </w:pPr>
+    </w:lvl>
+    <w:lvl w:ilvl="4" w:tplc="04060019" w:tentative="1">
+      <w:start w:val="1"/>
+      <w:numFmt w:val="lowerLetter"/>
+      <w:lvlText w:val="%5."/>
+      <w:lvlJc w:val="left"/>
+      <w:pPr>
+        <w:ind w:left="3600" w:hanging="360"/>
+      </w:pPr>
+    </w:lvl>
+    <w:lvl w:ilvl="5" w:tplc="0406001B" w:tentative="1">
+      <w:start w:val="1"/>
+      <w:numFmt w:val="lowerRoman"/>
+      <w:lvlText w:val="%6."/>
+      <w:lvlJc w:val="right"/>
+      <w:pPr>
+        <w:ind w:left="4320" w:hanging="180"/>
+      </w:pPr>
+    </w:lvl>
+    <w:lvl w:ilvl="6" w:tplc="0406000F" w:tentative="1">
+      <w:start w:val="1"/>
+      <w:numFmt w:val="decimal"/>
+      <w:lvlText w:val="%7."/>
+      <w:lvlJc w:val="left"/>
+      <w:pPr>
+        <w:ind w:left="5040" w:hanging="360"/>
+      </w:pPr>
+    </w:lvl>
+    <w:lvl w:ilvl="7" w:tplc="04060019" w:tentative="1">
+      <w:start w:val="1"/>
+      <w:numFmt w:val="lowerLetter"/>
+      <w:lvlText w:val="%8."/>
+      <w:lvlJc w:val="left"/>
+      <w:pPr>
+        <w:ind w:left="5760" w:hanging="360"/>
+      </w:pPr>
+    </w:lvl>
+    <w:lvl w:ilvl="8" w:tplc="0406001B" w:tentative="1">
+      <w:start w:val="1"/>
+      <w:numFmt w:val="lowerRoman"/>
+      <w:lvlText w:val="%9."/>
+      <w:lvlJc w:val="right"/>
+      <w:pPr>
+        <w:ind w:left="6480" w:hanging="180"/>
+      </w:pPr>
+    </w:lvl>
+  </w:abstractNum>
+  <w:abstractNum w:abstractNumId="6" w15:restartNumberingAfterBreak="0">
+    <w:nsid w:val="270F1597"/>
+    <w:multiLevelType w:val="hybridMultilevel"/>
+    <w:tmpl w:val="8A5A3B00"/>
+    <w:lvl w:ilvl="0" w:tplc="E842CC0C">
+      <w:start w:val="1"/>
+      <w:numFmt w:val="decimal"/>
+      <w:lvlText w:val="%1."/>
+      <w:lvlJc w:val="left"/>
+      <w:pPr>
+        <w:ind w:left="720" w:hanging="360"/>
+      </w:pPr>
+      <w:rPr>
+        <w:rFonts w:asciiTheme="minorHAnsi" w:eastAsiaTheme="minorHAnsi" w:hAnsiTheme="minorHAnsi" w:cstheme="minorBidi"/>
+      </w:rPr>
+    </w:lvl>
+    <w:lvl w:ilvl="1" w:tplc="04060003" w:tentative="1">
+      <w:start w:val="1"/>
+      <w:numFmt w:val="bullet"/>
+      <w:lvlText w:val="o"/>
+      <w:lvlJc w:val="left"/>
+      <w:pPr>
+        <w:ind w:left="1440" w:hanging="360"/>
+      </w:pPr>
+      <w:rPr>
+        <w:rFonts w:ascii="Courier New" w:hAnsi="Courier New" w:cs="Courier New" w:hint="default"/>
+      </w:rPr>
+    </w:lvl>
+    <w:lvl w:ilvl="2" w:tplc="04060005" w:tentative="1">
+      <w:start w:val="1"/>
+      <w:numFmt w:val="bullet"/>
+      <w:lvlText w:val=""/>
+      <w:lvlJc w:val="left"/>
+      <w:pPr>
+        <w:ind w:left="2160" w:hanging="360"/>
+      </w:pPr>
+      <w:rPr>
+        <w:rFonts w:ascii="Wingdings" w:hAnsi="Wingdings" w:hint="default"/>
+      </w:rPr>
+    </w:lvl>
+    <w:lvl w:ilvl="3" w:tplc="04060001" w:tentative="1">
+      <w:start w:val="1"/>
+      <w:numFmt w:val="bullet"/>
+      <w:lvlText w:val=""/>
+      <w:lvlJc w:val="left"/>
+      <w:pPr>
+        <w:ind w:left="2880" w:hanging="360"/>
+      </w:pPr>
+      <w:rPr>
+        <w:rFonts w:ascii="Symbol" w:hAnsi="Symbol" w:hint="default"/>
+      </w:rPr>
+    </w:lvl>
+    <w:lvl w:ilvl="4" w:tplc="04060003" w:tentative="1">
+      <w:start w:val="1"/>
+      <w:numFmt w:val="bullet"/>
+      <w:lvlText w:val="o"/>
+      <w:lvlJc w:val="left"/>
+      <w:pPr>
+        <w:ind w:left="3600" w:hanging="360"/>
+      </w:pPr>
+      <w:rPr>
+        <w:rFonts w:ascii="Courier New" w:hAnsi="Courier New" w:cs="Courier New" w:hint="default"/>
+      </w:rPr>
+    </w:lvl>
+    <w:lvl w:ilvl="5" w:tplc="04060005" w:tentative="1">
+      <w:start w:val="1"/>
+      <w:numFmt w:val="bullet"/>
+      <w:lvlText w:val=""/>
+      <w:lvlJc w:val="left"/>
+      <w:pPr>
+        <w:ind w:left="4320" w:hanging="360"/>
+      </w:pPr>
+      <w:rPr>
+        <w:rFonts w:ascii="Wingdings" w:hAnsi="Wingdings" w:hint="default"/>
+      </w:rPr>
+    </w:lvl>
+    <w:lvl w:ilvl="6" w:tplc="04060001" w:tentative="1">
+      <w:start w:val="1"/>
+      <w:numFmt w:val="bullet"/>
+      <w:lvlText w:val=""/>
+      <w:lvlJc w:val="left"/>
+      <w:pPr>
+        <w:ind w:left="5040" w:hanging="360"/>
+      </w:pPr>
+      <w:rPr>
+        <w:rFonts w:ascii="Symbol" w:hAnsi="Symbol" w:hint="default"/>
+      </w:rPr>
+    </w:lvl>
+    <w:lvl w:ilvl="7" w:tplc="04060003" w:tentative="1">
+      <w:start w:val="1"/>
+      <w:numFmt w:val="bullet"/>
+      <w:lvlText w:val="o"/>
+      <w:lvlJc w:val="left"/>
+      <w:pPr>
+        <w:ind w:left="5760" w:hanging="360"/>
+      </w:pPr>
+      <w:rPr>
+        <w:rFonts w:ascii="Courier New" w:hAnsi="Courier New" w:cs="Courier New" w:hint="default"/>
+      </w:rPr>
+    </w:lvl>
+    <w:lvl w:ilvl="8" w:tplc="04060005" w:tentative="1">
+      <w:start w:val="1"/>
+      <w:numFmt w:val="bullet"/>
+      <w:lvlText w:val=""/>
+      <w:lvlJc w:val="left"/>
+      <w:pPr>
+        <w:ind w:left="6480" w:hanging="360"/>
+      </w:pPr>
+      <w:rPr>
+        <w:rFonts w:ascii="Wingdings" w:hAnsi="Wingdings" w:hint="default"/>
+      </w:rPr>
+    </w:lvl>
+  </w:abstractNum>
+  <w:abstractNum w:abstractNumId="7" w15:restartNumberingAfterBreak="0">
+    <w:nsid w:val="2E187A3A"/>
+    <w:multiLevelType w:val="hybridMultilevel"/>
+    <w:tmpl w:val="066EEF76"/>
+    <w:lvl w:ilvl="0" w:tplc="0406000F">
+      <w:start w:val="1"/>
+      <w:numFmt w:val="decimal"/>
+      <w:lvlText w:val="%1."/>
+      <w:lvlJc w:val="left"/>
+      <w:pPr>
+        <w:ind w:left="720" w:hanging="360"/>
+      </w:pPr>
+      <w:rPr>
+        <w:rFonts w:hint="default"/>
+      </w:rPr>
+    </w:lvl>
+    <w:lvl w:ilvl="1" w:tplc="04060019" w:tentative="1">
+      <w:start w:val="1"/>
+      <w:numFmt w:val="lowerLetter"/>
+      <w:lvlText w:val="%2."/>
+      <w:lvlJc w:val="left"/>
+      <w:pPr>
+        <w:ind w:left="1440" w:hanging="360"/>
+      </w:pPr>
+    </w:lvl>
+    <w:lvl w:ilvl="2" w:tplc="0406001B" w:tentative="1">
+      <w:start w:val="1"/>
+      <w:numFmt w:val="lowerRoman"/>
+      <w:lvlText w:val="%3."/>
+      <w:lvlJc w:val="right"/>
+      <w:pPr>
+        <w:ind w:left="2160" w:hanging="180"/>
+      </w:pPr>
+    </w:lvl>
+    <w:lvl w:ilvl="3" w:tplc="0406000F" w:tentative="1">
+      <w:start w:val="1"/>
+      <w:numFmt w:val="decimal"/>
+      <w:lvlText w:val="%4."/>
+      <w:lvlJc w:val="left"/>
+      <w:pPr>
+        <w:ind w:left="2880" w:hanging="360"/>
+      </w:pPr>
+    </w:lvl>
+    <w:lvl w:ilvl="4" w:tplc="04060019" w:tentative="1">
+      <w:start w:val="1"/>
+      <w:numFmt w:val="lowerLetter"/>
+      <w:lvlText w:val="%5."/>
+      <w:lvlJc w:val="left"/>
+      <w:pPr>
+        <w:ind w:left="3600" w:hanging="360"/>
+      </w:pPr>
+    </w:lvl>
+    <w:lvl w:ilvl="5" w:tplc="0406001B" w:tentative="1">
+      <w:start w:val="1"/>
+      <w:numFmt w:val="lowerRoman"/>
+      <w:lvlText w:val="%6."/>
+      <w:lvlJc w:val="right"/>
+      <w:pPr>
+        <w:ind w:left="4320" w:hanging="180"/>
+      </w:pPr>
+    </w:lvl>
+    <w:lvl w:ilvl="6" w:tplc="0406000F" w:tentative="1">
+      <w:start w:val="1"/>
+      <w:numFmt w:val="decimal"/>
+      <w:lvlText w:val="%7."/>
+      <w:lvlJc w:val="left"/>
+      <w:pPr>
+        <w:ind w:left="5040" w:hanging="360"/>
+      </w:pPr>
+    </w:lvl>
+    <w:lvl w:ilvl="7" w:tplc="04060019" w:tentative="1">
+      <w:start w:val="1"/>
+      <w:numFmt w:val="lowerLetter"/>
+      <w:lvlText w:val="%8."/>
+      <w:lvlJc w:val="left"/>
+      <w:pPr>
+        <w:ind w:left="5760" w:hanging="360"/>
+      </w:pPr>
+    </w:lvl>
+    <w:lvl w:ilvl="8" w:tplc="0406001B" w:tentative="1">
+      <w:start w:val="1"/>
+      <w:numFmt w:val="lowerRoman"/>
+      <w:lvlText w:val="%9."/>
+      <w:lvlJc w:val="right"/>
+      <w:pPr>
+        <w:ind w:left="6480" w:hanging="180"/>
+      </w:pPr>
+    </w:lvl>
+  </w:abstractNum>
+  <w:abstractNum w:abstractNumId="8" w15:restartNumberingAfterBreak="0">
+    <w:nsid w:val="308B0BE5"/>
+    <w:multiLevelType w:val="hybridMultilevel"/>
+    <w:tmpl w:val="3BC2F518"/>
+    <w:lvl w:ilvl="0" w:tplc="56AA3726">
+      <w:start w:val="1"/>
+      <w:numFmt w:val="decimal"/>
+      <w:lvlText w:val="%1."/>
+      <w:lvlJc w:val="left"/>
+      <w:pPr>
+        <w:ind w:left="1080" w:hanging="360"/>
+      </w:pPr>
+      <w:rPr>
+        <w:rFonts w:hint="default"/>
+      </w:rPr>
+    </w:lvl>
+    <w:lvl w:ilvl="1" w:tplc="04060019" w:tentative="1">
+      <w:start w:val="1"/>
+      <w:numFmt w:val="lowerLetter"/>
+      <w:lvlText w:val="%2."/>
+      <w:lvlJc w:val="left"/>
+      <w:pPr>
+        <w:ind w:left="1800" w:hanging="360"/>
+      </w:pPr>
+    </w:lvl>
+    <w:lvl w:ilvl="2" w:tplc="0406001B" w:tentative="1">
+      <w:start w:val="1"/>
+      <w:numFmt w:val="lowerRoman"/>
+      <w:lvlText w:val="%3."/>
+      <w:lvlJc w:val="right"/>
+      <w:pPr>
+        <w:ind w:left="2520" w:hanging="180"/>
+      </w:pPr>
+    </w:lvl>
+    <w:lvl w:ilvl="3" w:tplc="0406000F" w:tentative="1">
+      <w:start w:val="1"/>
+      <w:numFmt w:val="decimal"/>
+      <w:lvlText w:val="%4."/>
+      <w:lvlJc w:val="left"/>
+      <w:pPr>
+        <w:ind w:left="3240" w:hanging="360"/>
+      </w:pPr>
+    </w:lvl>
+    <w:lvl w:ilvl="4" w:tplc="04060019" w:tentative="1">
+      <w:start w:val="1"/>
+      <w:numFmt w:val="lowerLetter"/>
+      <w:lvlText w:val="%5."/>
+      <w:lvlJc w:val="left"/>
+      <w:pPr>
+        <w:ind w:left="3960" w:hanging="360"/>
+      </w:pPr>
+    </w:lvl>
+    <w:lvl w:ilvl="5" w:tplc="0406001B" w:tentative="1">
+      <w:start w:val="1"/>
+      <w:numFmt w:val="lowerRoman"/>
+      <w:lvlText w:val="%6."/>
+      <w:lvlJc w:val="right"/>
+      <w:pPr>
+        <w:ind w:left="4680" w:hanging="180"/>
+      </w:pPr>
+    </w:lvl>
+    <w:lvl w:ilvl="6" w:tplc="0406000F" w:tentative="1">
+      <w:start w:val="1"/>
+      <w:numFmt w:val="decimal"/>
+      <w:lvlText w:val="%7."/>
+      <w:lvlJc w:val="left"/>
+      <w:pPr>
+        <w:ind w:left="5400" w:hanging="360"/>
+      </w:pPr>
+    </w:lvl>
+    <w:lvl w:ilvl="7" w:tplc="04060019" w:tentative="1">
+      <w:start w:val="1"/>
+      <w:numFmt w:val="lowerLetter"/>
+      <w:lvlText w:val="%8."/>
+      <w:lvlJc w:val="left"/>
+      <w:pPr>
+        <w:ind w:left="6120" w:hanging="360"/>
+      </w:pPr>
+    </w:lvl>
+    <w:lvl w:ilvl="8" w:tplc="0406001B" w:tentative="1">
+      <w:start w:val="1"/>
+      <w:numFmt w:val="lowerRoman"/>
+      <w:lvlText w:val="%9."/>
+      <w:lvlJc w:val="right"/>
+      <w:pPr>
+        <w:ind w:left="6840" w:hanging="180"/>
+      </w:pPr>
+    </w:lvl>
+  </w:abstractNum>
+  <w:abstractNum w:abstractNumId="9" w15:restartNumberingAfterBreak="0">
     <w:nsid w:val="3BA85124"/>
     <w:multiLevelType w:val="hybridMultilevel"/>
     <w:tmpl w:val="25047FF8"/>
@@ -2601,7 +3651,96 @@
       </w:rPr>
     </w:lvl>
   </w:abstractNum>
-  <w:abstractNum w:abstractNumId="5" w15:restartNumberingAfterBreak="0">
+  <w:abstractNum w:abstractNumId="10" w15:restartNumberingAfterBreak="0">
+    <w:nsid w:val="501D1EDF"/>
+    <w:multiLevelType w:val="hybridMultilevel"/>
+    <w:tmpl w:val="CC601702"/>
+    <w:lvl w:ilvl="0" w:tplc="0406000F">
+      <w:start w:val="1"/>
+      <w:numFmt w:val="decimal"/>
+      <w:lvlText w:val="%1."/>
+      <w:lvlJc w:val="left"/>
+      <w:pPr>
+        <w:ind w:left="720" w:hanging="360"/>
+      </w:pPr>
+      <w:rPr>
+        <w:rFonts w:hint="default"/>
+      </w:rPr>
+    </w:lvl>
+    <w:lvl w:ilvl="1" w:tplc="04060019" w:tentative="1">
+      <w:start w:val="1"/>
+      <w:numFmt w:val="lowerLetter"/>
+      <w:lvlText w:val="%2."/>
+      <w:lvlJc w:val="left"/>
+      <w:pPr>
+        <w:ind w:left="1440" w:hanging="360"/>
+      </w:pPr>
+    </w:lvl>
+    <w:lvl w:ilvl="2" w:tplc="0406001B" w:tentative="1">
+      <w:start w:val="1"/>
+      <w:numFmt w:val="lowerRoman"/>
+      <w:lvlText w:val="%3."/>
+      <w:lvlJc w:val="right"/>
+      <w:pPr>
+        <w:ind w:left="2160" w:hanging="180"/>
+      </w:pPr>
+    </w:lvl>
+    <w:lvl w:ilvl="3" w:tplc="0406000F" w:tentative="1">
+      <w:start w:val="1"/>
+      <w:numFmt w:val="decimal"/>
+      <w:lvlText w:val="%4."/>
+      <w:lvlJc w:val="left"/>
+      <w:pPr>
+        <w:ind w:left="2880" w:hanging="360"/>
+      </w:pPr>
+    </w:lvl>
+    <w:lvl w:ilvl="4" w:tplc="04060019" w:tentative="1">
+      <w:start w:val="1"/>
+      <w:numFmt w:val="lowerLetter"/>
+      <w:lvlText w:val="%5."/>
+      <w:lvlJc w:val="left"/>
+      <w:pPr>
+        <w:ind w:left="3600" w:hanging="360"/>
+      </w:pPr>
+    </w:lvl>
+    <w:lvl w:ilvl="5" w:tplc="0406001B" w:tentative="1">
+      <w:start w:val="1"/>
+      <w:numFmt w:val="lowerRoman"/>
+      <w:lvlText w:val="%6."/>
+      <w:lvlJc w:val="right"/>
+      <w:pPr>
+        <w:ind w:left="4320" w:hanging="180"/>
+      </w:pPr>
+    </w:lvl>
+    <w:lvl w:ilvl="6" w:tplc="0406000F" w:tentative="1">
+      <w:start w:val="1"/>
+      <w:numFmt w:val="decimal"/>
+      <w:lvlText w:val="%7."/>
+      <w:lvlJc w:val="left"/>
+      <w:pPr>
+        <w:ind w:left="5040" w:hanging="360"/>
+      </w:pPr>
+    </w:lvl>
+    <w:lvl w:ilvl="7" w:tplc="04060019" w:tentative="1">
+      <w:start w:val="1"/>
+      <w:numFmt w:val="lowerLetter"/>
+      <w:lvlText w:val="%8."/>
+      <w:lvlJc w:val="left"/>
+      <w:pPr>
+        <w:ind w:left="5760" w:hanging="360"/>
+      </w:pPr>
+    </w:lvl>
+    <w:lvl w:ilvl="8" w:tplc="0406001B" w:tentative="1">
+      <w:start w:val="1"/>
+      <w:numFmt w:val="lowerRoman"/>
+      <w:lvlText w:val="%9."/>
+      <w:lvlJc w:val="right"/>
+      <w:pPr>
+        <w:ind w:left="6480" w:hanging="180"/>
+      </w:pPr>
+    </w:lvl>
+  </w:abstractNum>
+  <w:abstractNum w:abstractNumId="11" w15:restartNumberingAfterBreak="0">
     <w:nsid w:val="51711BE9"/>
     <w:multiLevelType w:val="multilevel"/>
     <w:tmpl w:val="F786566E"/>
@@ -2750,7 +3889,96 @@
       </w:rPr>
     </w:lvl>
   </w:abstractNum>
-  <w:abstractNum w:abstractNumId="6" w15:restartNumberingAfterBreak="0">
+  <w:abstractNum w:abstractNumId="12" w15:restartNumberingAfterBreak="0">
+    <w:nsid w:val="53512486"/>
+    <w:multiLevelType w:val="hybridMultilevel"/>
+    <w:tmpl w:val="CC601702"/>
+    <w:lvl w:ilvl="0" w:tplc="FFFFFFFF">
+      <w:start w:val="1"/>
+      <w:numFmt w:val="decimal"/>
+      <w:lvlText w:val="%1."/>
+      <w:lvlJc w:val="left"/>
+      <w:pPr>
+        <w:ind w:left="720" w:hanging="360"/>
+      </w:pPr>
+      <w:rPr>
+        <w:rFonts w:hint="default"/>
+      </w:rPr>
+    </w:lvl>
+    <w:lvl w:ilvl="1" w:tplc="FFFFFFFF" w:tentative="1">
+      <w:start w:val="1"/>
+      <w:numFmt w:val="lowerLetter"/>
+      <w:lvlText w:val="%2."/>
+      <w:lvlJc w:val="left"/>
+      <w:pPr>
+        <w:ind w:left="1440" w:hanging="360"/>
+      </w:pPr>
+    </w:lvl>
+    <w:lvl w:ilvl="2" w:tplc="FFFFFFFF" w:tentative="1">
+      <w:start w:val="1"/>
+      <w:numFmt w:val="lowerRoman"/>
+      <w:lvlText w:val="%3."/>
+      <w:lvlJc w:val="right"/>
+      <w:pPr>
+        <w:ind w:left="2160" w:hanging="180"/>
+      </w:pPr>
+    </w:lvl>
+    <w:lvl w:ilvl="3" w:tplc="FFFFFFFF" w:tentative="1">
+      <w:start w:val="1"/>
+      <w:numFmt w:val="decimal"/>
+      <w:lvlText w:val="%4."/>
+      <w:lvlJc w:val="left"/>
+      <w:pPr>
+        <w:ind w:left="2880" w:hanging="360"/>
+      </w:pPr>
+    </w:lvl>
+    <w:lvl w:ilvl="4" w:tplc="FFFFFFFF" w:tentative="1">
+      <w:start w:val="1"/>
+      <w:numFmt w:val="lowerLetter"/>
+      <w:lvlText w:val="%5."/>
+      <w:lvlJc w:val="left"/>
+      <w:pPr>
+        <w:ind w:left="3600" w:hanging="360"/>
+      </w:pPr>
+    </w:lvl>
+    <w:lvl w:ilvl="5" w:tplc="FFFFFFFF" w:tentative="1">
+      <w:start w:val="1"/>
+      <w:numFmt w:val="lowerRoman"/>
+      <w:lvlText w:val="%6."/>
+      <w:lvlJc w:val="right"/>
+      <w:pPr>
+        <w:ind w:left="4320" w:hanging="180"/>
+      </w:pPr>
+    </w:lvl>
+    <w:lvl w:ilvl="6" w:tplc="FFFFFFFF" w:tentative="1">
+      <w:start w:val="1"/>
+      <w:numFmt w:val="decimal"/>
+      <w:lvlText w:val="%7."/>
+      <w:lvlJc w:val="left"/>
+      <w:pPr>
+        <w:ind w:left="5040" w:hanging="360"/>
+      </w:pPr>
+    </w:lvl>
+    <w:lvl w:ilvl="7" w:tplc="FFFFFFFF" w:tentative="1">
+      <w:start w:val="1"/>
+      <w:numFmt w:val="lowerLetter"/>
+      <w:lvlText w:val="%8."/>
+      <w:lvlJc w:val="left"/>
+      <w:pPr>
+        <w:ind w:left="5760" w:hanging="360"/>
+      </w:pPr>
+    </w:lvl>
+    <w:lvl w:ilvl="8" w:tplc="FFFFFFFF" w:tentative="1">
+      <w:start w:val="1"/>
+      <w:numFmt w:val="lowerRoman"/>
+      <w:lvlText w:val="%9."/>
+      <w:lvlJc w:val="right"/>
+      <w:pPr>
+        <w:ind w:left="6480" w:hanging="180"/>
+      </w:pPr>
+    </w:lvl>
+  </w:abstractNum>
+  <w:abstractNum w:abstractNumId="13" w15:restartNumberingAfterBreak="0">
     <w:nsid w:val="58C36FE2"/>
     <w:multiLevelType w:val="multilevel"/>
     <w:tmpl w:val="DC682BB8"/>
@@ -2899,26 +4127,900 @@
       </w:rPr>
     </w:lvl>
   </w:abstractNum>
+  <w:abstractNum w:abstractNumId="14" w15:restartNumberingAfterBreak="0">
+    <w:nsid w:val="5B064D9F"/>
+    <w:multiLevelType w:val="hybridMultilevel"/>
+    <w:tmpl w:val="066EEF76"/>
+    <w:lvl w:ilvl="0" w:tplc="FFFFFFFF">
+      <w:start w:val="1"/>
+      <w:numFmt w:val="decimal"/>
+      <w:lvlText w:val="%1."/>
+      <w:lvlJc w:val="left"/>
+      <w:pPr>
+        <w:ind w:left="720" w:hanging="360"/>
+      </w:pPr>
+      <w:rPr>
+        <w:rFonts w:hint="default"/>
+      </w:rPr>
+    </w:lvl>
+    <w:lvl w:ilvl="1" w:tplc="FFFFFFFF" w:tentative="1">
+      <w:start w:val="1"/>
+      <w:numFmt w:val="lowerLetter"/>
+      <w:lvlText w:val="%2."/>
+      <w:lvlJc w:val="left"/>
+      <w:pPr>
+        <w:ind w:left="1440" w:hanging="360"/>
+      </w:pPr>
+    </w:lvl>
+    <w:lvl w:ilvl="2" w:tplc="FFFFFFFF" w:tentative="1">
+      <w:start w:val="1"/>
+      <w:numFmt w:val="lowerRoman"/>
+      <w:lvlText w:val="%3."/>
+      <w:lvlJc w:val="right"/>
+      <w:pPr>
+        <w:ind w:left="2160" w:hanging="180"/>
+      </w:pPr>
+    </w:lvl>
+    <w:lvl w:ilvl="3" w:tplc="FFFFFFFF" w:tentative="1">
+      <w:start w:val="1"/>
+      <w:numFmt w:val="decimal"/>
+      <w:lvlText w:val="%4."/>
+      <w:lvlJc w:val="left"/>
+      <w:pPr>
+        <w:ind w:left="2880" w:hanging="360"/>
+      </w:pPr>
+    </w:lvl>
+    <w:lvl w:ilvl="4" w:tplc="FFFFFFFF" w:tentative="1">
+      <w:start w:val="1"/>
+      <w:numFmt w:val="lowerLetter"/>
+      <w:lvlText w:val="%5."/>
+      <w:lvlJc w:val="left"/>
+      <w:pPr>
+        <w:ind w:left="3600" w:hanging="360"/>
+      </w:pPr>
+    </w:lvl>
+    <w:lvl w:ilvl="5" w:tplc="FFFFFFFF" w:tentative="1">
+      <w:start w:val="1"/>
+      <w:numFmt w:val="lowerRoman"/>
+      <w:lvlText w:val="%6."/>
+      <w:lvlJc w:val="right"/>
+      <w:pPr>
+        <w:ind w:left="4320" w:hanging="180"/>
+      </w:pPr>
+    </w:lvl>
+    <w:lvl w:ilvl="6" w:tplc="FFFFFFFF" w:tentative="1">
+      <w:start w:val="1"/>
+      <w:numFmt w:val="decimal"/>
+      <w:lvlText w:val="%7."/>
+      <w:lvlJc w:val="left"/>
+      <w:pPr>
+        <w:ind w:left="5040" w:hanging="360"/>
+      </w:pPr>
+    </w:lvl>
+    <w:lvl w:ilvl="7" w:tplc="FFFFFFFF" w:tentative="1">
+      <w:start w:val="1"/>
+      <w:numFmt w:val="lowerLetter"/>
+      <w:lvlText w:val="%8."/>
+      <w:lvlJc w:val="left"/>
+      <w:pPr>
+        <w:ind w:left="5760" w:hanging="360"/>
+      </w:pPr>
+    </w:lvl>
+    <w:lvl w:ilvl="8" w:tplc="FFFFFFFF" w:tentative="1">
+      <w:start w:val="1"/>
+      <w:numFmt w:val="lowerRoman"/>
+      <w:lvlText w:val="%9."/>
+      <w:lvlJc w:val="right"/>
+      <w:pPr>
+        <w:ind w:left="6480" w:hanging="180"/>
+      </w:pPr>
+    </w:lvl>
+  </w:abstractNum>
+  <w:abstractNum w:abstractNumId="15" w15:restartNumberingAfterBreak="0">
+    <w:nsid w:val="5CF2671D"/>
+    <w:multiLevelType w:val="hybridMultilevel"/>
+    <w:tmpl w:val="066EEF76"/>
+    <w:lvl w:ilvl="0" w:tplc="FFFFFFFF">
+      <w:start w:val="1"/>
+      <w:numFmt w:val="decimal"/>
+      <w:lvlText w:val="%1."/>
+      <w:lvlJc w:val="left"/>
+      <w:pPr>
+        <w:ind w:left="720" w:hanging="360"/>
+      </w:pPr>
+      <w:rPr>
+        <w:rFonts w:hint="default"/>
+      </w:rPr>
+    </w:lvl>
+    <w:lvl w:ilvl="1" w:tplc="FFFFFFFF" w:tentative="1">
+      <w:start w:val="1"/>
+      <w:numFmt w:val="lowerLetter"/>
+      <w:lvlText w:val="%2."/>
+      <w:lvlJc w:val="left"/>
+      <w:pPr>
+        <w:ind w:left="1440" w:hanging="360"/>
+      </w:pPr>
+    </w:lvl>
+    <w:lvl w:ilvl="2" w:tplc="FFFFFFFF" w:tentative="1">
+      <w:start w:val="1"/>
+      <w:numFmt w:val="lowerRoman"/>
+      <w:lvlText w:val="%3."/>
+      <w:lvlJc w:val="right"/>
+      <w:pPr>
+        <w:ind w:left="2160" w:hanging="180"/>
+      </w:pPr>
+    </w:lvl>
+    <w:lvl w:ilvl="3" w:tplc="FFFFFFFF" w:tentative="1">
+      <w:start w:val="1"/>
+      <w:numFmt w:val="decimal"/>
+      <w:lvlText w:val="%4."/>
+      <w:lvlJc w:val="left"/>
+      <w:pPr>
+        <w:ind w:left="2880" w:hanging="360"/>
+      </w:pPr>
+    </w:lvl>
+    <w:lvl w:ilvl="4" w:tplc="FFFFFFFF" w:tentative="1">
+      <w:start w:val="1"/>
+      <w:numFmt w:val="lowerLetter"/>
+      <w:lvlText w:val="%5."/>
+      <w:lvlJc w:val="left"/>
+      <w:pPr>
+        <w:ind w:left="3600" w:hanging="360"/>
+      </w:pPr>
+    </w:lvl>
+    <w:lvl w:ilvl="5" w:tplc="FFFFFFFF" w:tentative="1">
+      <w:start w:val="1"/>
+      <w:numFmt w:val="lowerRoman"/>
+      <w:lvlText w:val="%6."/>
+      <w:lvlJc w:val="right"/>
+      <w:pPr>
+        <w:ind w:left="4320" w:hanging="180"/>
+      </w:pPr>
+    </w:lvl>
+    <w:lvl w:ilvl="6" w:tplc="FFFFFFFF" w:tentative="1">
+      <w:start w:val="1"/>
+      <w:numFmt w:val="decimal"/>
+      <w:lvlText w:val="%7."/>
+      <w:lvlJc w:val="left"/>
+      <w:pPr>
+        <w:ind w:left="5040" w:hanging="360"/>
+      </w:pPr>
+    </w:lvl>
+    <w:lvl w:ilvl="7" w:tplc="FFFFFFFF" w:tentative="1">
+      <w:start w:val="1"/>
+      <w:numFmt w:val="lowerLetter"/>
+      <w:lvlText w:val="%8."/>
+      <w:lvlJc w:val="left"/>
+      <w:pPr>
+        <w:ind w:left="5760" w:hanging="360"/>
+      </w:pPr>
+    </w:lvl>
+    <w:lvl w:ilvl="8" w:tplc="FFFFFFFF" w:tentative="1">
+      <w:start w:val="1"/>
+      <w:numFmt w:val="lowerRoman"/>
+      <w:lvlText w:val="%9."/>
+      <w:lvlJc w:val="right"/>
+      <w:pPr>
+        <w:ind w:left="6480" w:hanging="180"/>
+      </w:pPr>
+    </w:lvl>
+  </w:abstractNum>
+  <w:abstractNum w:abstractNumId="16" w15:restartNumberingAfterBreak="0">
+    <w:nsid w:val="64FB361E"/>
+    <w:multiLevelType w:val="hybridMultilevel"/>
+    <w:tmpl w:val="299487A8"/>
+    <w:lvl w:ilvl="0" w:tplc="42ECB8AC">
+      <w:start w:val="3"/>
+      <w:numFmt w:val="decimal"/>
+      <w:lvlText w:val="%1."/>
+      <w:lvlJc w:val="left"/>
+      <w:pPr>
+        <w:ind w:left="1080" w:hanging="360"/>
+      </w:pPr>
+      <w:rPr>
+        <w:rFonts w:hint="default"/>
+        <w:b w:val="0"/>
+      </w:rPr>
+    </w:lvl>
+    <w:lvl w:ilvl="1" w:tplc="04060019" w:tentative="1">
+      <w:start w:val="1"/>
+      <w:numFmt w:val="lowerLetter"/>
+      <w:lvlText w:val="%2."/>
+      <w:lvlJc w:val="left"/>
+      <w:pPr>
+        <w:ind w:left="1800" w:hanging="360"/>
+      </w:pPr>
+    </w:lvl>
+    <w:lvl w:ilvl="2" w:tplc="0406001B" w:tentative="1">
+      <w:start w:val="1"/>
+      <w:numFmt w:val="lowerRoman"/>
+      <w:lvlText w:val="%3."/>
+      <w:lvlJc w:val="right"/>
+      <w:pPr>
+        <w:ind w:left="2520" w:hanging="180"/>
+      </w:pPr>
+    </w:lvl>
+    <w:lvl w:ilvl="3" w:tplc="0406000F" w:tentative="1">
+      <w:start w:val="1"/>
+      <w:numFmt w:val="decimal"/>
+      <w:lvlText w:val="%4."/>
+      <w:lvlJc w:val="left"/>
+      <w:pPr>
+        <w:ind w:left="3240" w:hanging="360"/>
+      </w:pPr>
+    </w:lvl>
+    <w:lvl w:ilvl="4" w:tplc="04060019" w:tentative="1">
+      <w:start w:val="1"/>
+      <w:numFmt w:val="lowerLetter"/>
+      <w:lvlText w:val="%5."/>
+      <w:lvlJc w:val="left"/>
+      <w:pPr>
+        <w:ind w:left="3960" w:hanging="360"/>
+      </w:pPr>
+    </w:lvl>
+    <w:lvl w:ilvl="5" w:tplc="0406001B" w:tentative="1">
+      <w:start w:val="1"/>
+      <w:numFmt w:val="lowerRoman"/>
+      <w:lvlText w:val="%6."/>
+      <w:lvlJc w:val="right"/>
+      <w:pPr>
+        <w:ind w:left="4680" w:hanging="180"/>
+      </w:pPr>
+    </w:lvl>
+    <w:lvl w:ilvl="6" w:tplc="0406000F" w:tentative="1">
+      <w:start w:val="1"/>
+      <w:numFmt w:val="decimal"/>
+      <w:lvlText w:val="%7."/>
+      <w:lvlJc w:val="left"/>
+      <w:pPr>
+        <w:ind w:left="5400" w:hanging="360"/>
+      </w:pPr>
+    </w:lvl>
+    <w:lvl w:ilvl="7" w:tplc="04060019" w:tentative="1">
+      <w:start w:val="1"/>
+      <w:numFmt w:val="lowerLetter"/>
+      <w:lvlText w:val="%8."/>
+      <w:lvlJc w:val="left"/>
+      <w:pPr>
+        <w:ind w:left="6120" w:hanging="360"/>
+      </w:pPr>
+    </w:lvl>
+    <w:lvl w:ilvl="8" w:tplc="0406001B" w:tentative="1">
+      <w:start w:val="1"/>
+      <w:numFmt w:val="lowerRoman"/>
+      <w:lvlText w:val="%9."/>
+      <w:lvlJc w:val="right"/>
+      <w:pPr>
+        <w:ind w:left="6840" w:hanging="180"/>
+      </w:pPr>
+    </w:lvl>
+  </w:abstractNum>
+  <w:abstractNum w:abstractNumId="17" w15:restartNumberingAfterBreak="0">
+    <w:nsid w:val="6A273847"/>
+    <w:multiLevelType w:val="hybridMultilevel"/>
+    <w:tmpl w:val="767E3A42"/>
+    <w:lvl w:ilvl="0" w:tplc="0406000F">
+      <w:start w:val="1"/>
+      <w:numFmt w:val="decimal"/>
+      <w:lvlText w:val="%1."/>
+      <w:lvlJc w:val="left"/>
+      <w:pPr>
+        <w:ind w:left="720" w:hanging="360"/>
+      </w:pPr>
+      <w:rPr>
+        <w:rFonts w:hint="default"/>
+      </w:rPr>
+    </w:lvl>
+    <w:lvl w:ilvl="1" w:tplc="04060019" w:tentative="1">
+      <w:start w:val="1"/>
+      <w:numFmt w:val="lowerLetter"/>
+      <w:lvlText w:val="%2."/>
+      <w:lvlJc w:val="left"/>
+      <w:pPr>
+        <w:ind w:left="1440" w:hanging="360"/>
+      </w:pPr>
+    </w:lvl>
+    <w:lvl w:ilvl="2" w:tplc="0406001B" w:tentative="1">
+      <w:start w:val="1"/>
+      <w:numFmt w:val="lowerRoman"/>
+      <w:lvlText w:val="%3."/>
+      <w:lvlJc w:val="right"/>
+      <w:pPr>
+        <w:ind w:left="2160" w:hanging="180"/>
+      </w:pPr>
+    </w:lvl>
+    <w:lvl w:ilvl="3" w:tplc="0406000F" w:tentative="1">
+      <w:start w:val="1"/>
+      <w:numFmt w:val="decimal"/>
+      <w:lvlText w:val="%4."/>
+      <w:lvlJc w:val="left"/>
+      <w:pPr>
+        <w:ind w:left="2880" w:hanging="360"/>
+      </w:pPr>
+    </w:lvl>
+    <w:lvl w:ilvl="4" w:tplc="04060019" w:tentative="1">
+      <w:start w:val="1"/>
+      <w:numFmt w:val="lowerLetter"/>
+      <w:lvlText w:val="%5."/>
+      <w:lvlJc w:val="left"/>
+      <w:pPr>
+        <w:ind w:left="3600" w:hanging="360"/>
+      </w:pPr>
+    </w:lvl>
+    <w:lvl w:ilvl="5" w:tplc="0406001B" w:tentative="1">
+      <w:start w:val="1"/>
+      <w:numFmt w:val="lowerRoman"/>
+      <w:lvlText w:val="%6."/>
+      <w:lvlJc w:val="right"/>
+      <w:pPr>
+        <w:ind w:left="4320" w:hanging="180"/>
+      </w:pPr>
+    </w:lvl>
+    <w:lvl w:ilvl="6" w:tplc="0406000F" w:tentative="1">
+      <w:start w:val="1"/>
+      <w:numFmt w:val="decimal"/>
+      <w:lvlText w:val="%7."/>
+      <w:lvlJc w:val="left"/>
+      <w:pPr>
+        <w:ind w:left="5040" w:hanging="360"/>
+      </w:pPr>
+    </w:lvl>
+    <w:lvl w:ilvl="7" w:tplc="04060019" w:tentative="1">
+      <w:start w:val="1"/>
+      <w:numFmt w:val="lowerLetter"/>
+      <w:lvlText w:val="%8."/>
+      <w:lvlJc w:val="left"/>
+      <w:pPr>
+        <w:ind w:left="5760" w:hanging="360"/>
+      </w:pPr>
+    </w:lvl>
+    <w:lvl w:ilvl="8" w:tplc="0406001B" w:tentative="1">
+      <w:start w:val="1"/>
+      <w:numFmt w:val="lowerRoman"/>
+      <w:lvlText w:val="%9."/>
+      <w:lvlJc w:val="right"/>
+      <w:pPr>
+        <w:ind w:left="6480" w:hanging="180"/>
+      </w:pPr>
+    </w:lvl>
+  </w:abstractNum>
+  <w:abstractNum w:abstractNumId="18" w15:restartNumberingAfterBreak="0">
+    <w:nsid w:val="6C19479C"/>
+    <w:multiLevelType w:val="hybridMultilevel"/>
+    <w:tmpl w:val="51FA5E86"/>
+    <w:lvl w:ilvl="0" w:tplc="0406000F">
+      <w:start w:val="1"/>
+      <w:numFmt w:val="decimal"/>
+      <w:lvlText w:val="%1."/>
+      <w:lvlJc w:val="left"/>
+      <w:pPr>
+        <w:ind w:left="720" w:hanging="360"/>
+      </w:pPr>
+      <w:rPr>
+        <w:rFonts w:hint="default"/>
+      </w:rPr>
+    </w:lvl>
+    <w:lvl w:ilvl="1" w:tplc="04060019" w:tentative="1">
+      <w:start w:val="1"/>
+      <w:numFmt w:val="lowerLetter"/>
+      <w:lvlText w:val="%2."/>
+      <w:lvlJc w:val="left"/>
+      <w:pPr>
+        <w:ind w:left="1440" w:hanging="360"/>
+      </w:pPr>
+    </w:lvl>
+    <w:lvl w:ilvl="2" w:tplc="0406001B" w:tentative="1">
+      <w:start w:val="1"/>
+      <w:numFmt w:val="lowerRoman"/>
+      <w:lvlText w:val="%3."/>
+      <w:lvlJc w:val="right"/>
+      <w:pPr>
+        <w:ind w:left="2160" w:hanging="180"/>
+      </w:pPr>
+    </w:lvl>
+    <w:lvl w:ilvl="3" w:tplc="0406000F" w:tentative="1">
+      <w:start w:val="1"/>
+      <w:numFmt w:val="decimal"/>
+      <w:lvlText w:val="%4."/>
+      <w:lvlJc w:val="left"/>
+      <w:pPr>
+        <w:ind w:left="2880" w:hanging="360"/>
+      </w:pPr>
+    </w:lvl>
+    <w:lvl w:ilvl="4" w:tplc="04060019" w:tentative="1">
+      <w:start w:val="1"/>
+      <w:numFmt w:val="lowerLetter"/>
+      <w:lvlText w:val="%5."/>
+      <w:lvlJc w:val="left"/>
+      <w:pPr>
+        <w:ind w:left="3600" w:hanging="360"/>
+      </w:pPr>
+    </w:lvl>
+    <w:lvl w:ilvl="5" w:tplc="0406001B" w:tentative="1">
+      <w:start w:val="1"/>
+      <w:numFmt w:val="lowerRoman"/>
+      <w:lvlText w:val="%6."/>
+      <w:lvlJc w:val="right"/>
+      <w:pPr>
+        <w:ind w:left="4320" w:hanging="180"/>
+      </w:pPr>
+    </w:lvl>
+    <w:lvl w:ilvl="6" w:tplc="0406000F" w:tentative="1">
+      <w:start w:val="1"/>
+      <w:numFmt w:val="decimal"/>
+      <w:lvlText w:val="%7."/>
+      <w:lvlJc w:val="left"/>
+      <w:pPr>
+        <w:ind w:left="5040" w:hanging="360"/>
+      </w:pPr>
+    </w:lvl>
+    <w:lvl w:ilvl="7" w:tplc="04060019" w:tentative="1">
+      <w:start w:val="1"/>
+      <w:numFmt w:val="lowerLetter"/>
+      <w:lvlText w:val="%8."/>
+      <w:lvlJc w:val="left"/>
+      <w:pPr>
+        <w:ind w:left="5760" w:hanging="360"/>
+      </w:pPr>
+    </w:lvl>
+    <w:lvl w:ilvl="8" w:tplc="0406001B" w:tentative="1">
+      <w:start w:val="1"/>
+      <w:numFmt w:val="lowerRoman"/>
+      <w:lvlText w:val="%9."/>
+      <w:lvlJc w:val="right"/>
+      <w:pPr>
+        <w:ind w:left="6480" w:hanging="180"/>
+      </w:pPr>
+    </w:lvl>
+  </w:abstractNum>
+  <w:abstractNum w:abstractNumId="19" w15:restartNumberingAfterBreak="0">
+    <w:nsid w:val="6D5A719F"/>
+    <w:multiLevelType w:val="hybridMultilevel"/>
+    <w:tmpl w:val="8A5A3B00"/>
+    <w:lvl w:ilvl="0" w:tplc="FFFFFFFF">
+      <w:start w:val="1"/>
+      <w:numFmt w:val="decimal"/>
+      <w:lvlText w:val="%1."/>
+      <w:lvlJc w:val="left"/>
+      <w:pPr>
+        <w:ind w:left="720" w:hanging="360"/>
+      </w:pPr>
+      <w:rPr>
+        <w:rFonts w:asciiTheme="minorHAnsi" w:eastAsiaTheme="minorHAnsi" w:hAnsiTheme="minorHAnsi" w:cstheme="minorBidi"/>
+      </w:rPr>
+    </w:lvl>
+    <w:lvl w:ilvl="1" w:tplc="FFFFFFFF" w:tentative="1">
+      <w:start w:val="1"/>
+      <w:numFmt w:val="bullet"/>
+      <w:lvlText w:val="o"/>
+      <w:lvlJc w:val="left"/>
+      <w:pPr>
+        <w:ind w:left="1440" w:hanging="360"/>
+      </w:pPr>
+      <w:rPr>
+        <w:rFonts w:ascii="Courier New" w:hAnsi="Courier New" w:cs="Courier New" w:hint="default"/>
+      </w:rPr>
+    </w:lvl>
+    <w:lvl w:ilvl="2" w:tplc="FFFFFFFF" w:tentative="1">
+      <w:start w:val="1"/>
+      <w:numFmt w:val="bullet"/>
+      <w:lvlText w:val=""/>
+      <w:lvlJc w:val="left"/>
+      <w:pPr>
+        <w:ind w:left="2160" w:hanging="360"/>
+      </w:pPr>
+      <w:rPr>
+        <w:rFonts w:ascii="Wingdings" w:hAnsi="Wingdings" w:hint="default"/>
+      </w:rPr>
+    </w:lvl>
+    <w:lvl w:ilvl="3" w:tplc="FFFFFFFF" w:tentative="1">
+      <w:start w:val="1"/>
+      <w:numFmt w:val="bullet"/>
+      <w:lvlText w:val=""/>
+      <w:lvlJc w:val="left"/>
+      <w:pPr>
+        <w:ind w:left="2880" w:hanging="360"/>
+      </w:pPr>
+      <w:rPr>
+        <w:rFonts w:ascii="Symbol" w:hAnsi="Symbol" w:hint="default"/>
+      </w:rPr>
+    </w:lvl>
+    <w:lvl w:ilvl="4" w:tplc="FFFFFFFF" w:tentative="1">
+      <w:start w:val="1"/>
+      <w:numFmt w:val="bullet"/>
+      <w:lvlText w:val="o"/>
+      <w:lvlJc w:val="left"/>
+      <w:pPr>
+        <w:ind w:left="3600" w:hanging="360"/>
+      </w:pPr>
+      <w:rPr>
+        <w:rFonts w:ascii="Courier New" w:hAnsi="Courier New" w:cs="Courier New" w:hint="default"/>
+      </w:rPr>
+    </w:lvl>
+    <w:lvl w:ilvl="5" w:tplc="FFFFFFFF" w:tentative="1">
+      <w:start w:val="1"/>
+      <w:numFmt w:val="bullet"/>
+      <w:lvlText w:val=""/>
+      <w:lvlJc w:val="left"/>
+      <w:pPr>
+        <w:ind w:left="4320" w:hanging="360"/>
+      </w:pPr>
+      <w:rPr>
+        <w:rFonts w:ascii="Wingdings" w:hAnsi="Wingdings" w:hint="default"/>
+      </w:rPr>
+    </w:lvl>
+    <w:lvl w:ilvl="6" w:tplc="FFFFFFFF" w:tentative="1">
+      <w:start w:val="1"/>
+      <w:numFmt w:val="bullet"/>
+      <w:lvlText w:val=""/>
+      <w:lvlJc w:val="left"/>
+      <w:pPr>
+        <w:ind w:left="5040" w:hanging="360"/>
+      </w:pPr>
+      <w:rPr>
+        <w:rFonts w:ascii="Symbol" w:hAnsi="Symbol" w:hint="default"/>
+      </w:rPr>
+    </w:lvl>
+    <w:lvl w:ilvl="7" w:tplc="FFFFFFFF" w:tentative="1">
+      <w:start w:val="1"/>
+      <w:numFmt w:val="bullet"/>
+      <w:lvlText w:val="o"/>
+      <w:lvlJc w:val="left"/>
+      <w:pPr>
+        <w:ind w:left="5760" w:hanging="360"/>
+      </w:pPr>
+      <w:rPr>
+        <w:rFonts w:ascii="Courier New" w:hAnsi="Courier New" w:cs="Courier New" w:hint="default"/>
+      </w:rPr>
+    </w:lvl>
+    <w:lvl w:ilvl="8" w:tplc="FFFFFFFF" w:tentative="1">
+      <w:start w:val="1"/>
+      <w:numFmt w:val="bullet"/>
+      <w:lvlText w:val=""/>
+      <w:lvlJc w:val="left"/>
+      <w:pPr>
+        <w:ind w:left="6480" w:hanging="360"/>
+      </w:pPr>
+      <w:rPr>
+        <w:rFonts w:ascii="Wingdings" w:hAnsi="Wingdings" w:hint="default"/>
+      </w:rPr>
+    </w:lvl>
+  </w:abstractNum>
+  <w:abstractNum w:abstractNumId="20" w15:restartNumberingAfterBreak="0">
+    <w:nsid w:val="726E28FA"/>
+    <w:multiLevelType w:val="hybridMultilevel"/>
+    <w:tmpl w:val="E794B366"/>
+    <w:lvl w:ilvl="0" w:tplc="0406000F">
+      <w:start w:val="1"/>
+      <w:numFmt w:val="decimal"/>
+      <w:lvlText w:val="%1."/>
+      <w:lvlJc w:val="left"/>
+      <w:pPr>
+        <w:ind w:left="720" w:hanging="360"/>
+      </w:pPr>
+      <w:rPr>
+        <w:rFonts w:hint="default"/>
+      </w:rPr>
+    </w:lvl>
+    <w:lvl w:ilvl="1" w:tplc="04060019" w:tentative="1">
+      <w:start w:val="1"/>
+      <w:numFmt w:val="lowerLetter"/>
+      <w:lvlText w:val="%2."/>
+      <w:lvlJc w:val="left"/>
+      <w:pPr>
+        <w:ind w:left="1440" w:hanging="360"/>
+      </w:pPr>
+    </w:lvl>
+    <w:lvl w:ilvl="2" w:tplc="0406001B" w:tentative="1">
+      <w:start w:val="1"/>
+      <w:numFmt w:val="lowerRoman"/>
+      <w:lvlText w:val="%3."/>
+      <w:lvlJc w:val="right"/>
+      <w:pPr>
+        <w:ind w:left="2160" w:hanging="180"/>
+      </w:pPr>
+    </w:lvl>
+    <w:lvl w:ilvl="3" w:tplc="0406000F" w:tentative="1">
+      <w:start w:val="1"/>
+      <w:numFmt w:val="decimal"/>
+      <w:lvlText w:val="%4."/>
+      <w:lvlJc w:val="left"/>
+      <w:pPr>
+        <w:ind w:left="2880" w:hanging="360"/>
+      </w:pPr>
+    </w:lvl>
+    <w:lvl w:ilvl="4" w:tplc="04060019" w:tentative="1">
+      <w:start w:val="1"/>
+      <w:numFmt w:val="lowerLetter"/>
+      <w:lvlText w:val="%5."/>
+      <w:lvlJc w:val="left"/>
+      <w:pPr>
+        <w:ind w:left="3600" w:hanging="360"/>
+      </w:pPr>
+    </w:lvl>
+    <w:lvl w:ilvl="5" w:tplc="0406001B" w:tentative="1">
+      <w:start w:val="1"/>
+      <w:numFmt w:val="lowerRoman"/>
+      <w:lvlText w:val="%6."/>
+      <w:lvlJc w:val="right"/>
+      <w:pPr>
+        <w:ind w:left="4320" w:hanging="180"/>
+      </w:pPr>
+    </w:lvl>
+    <w:lvl w:ilvl="6" w:tplc="0406000F" w:tentative="1">
+      <w:start w:val="1"/>
+      <w:numFmt w:val="decimal"/>
+      <w:lvlText w:val="%7."/>
+      <w:lvlJc w:val="left"/>
+      <w:pPr>
+        <w:ind w:left="5040" w:hanging="360"/>
+      </w:pPr>
+    </w:lvl>
+    <w:lvl w:ilvl="7" w:tplc="04060019" w:tentative="1">
+      <w:start w:val="1"/>
+      <w:numFmt w:val="lowerLetter"/>
+      <w:lvlText w:val="%8."/>
+      <w:lvlJc w:val="left"/>
+      <w:pPr>
+        <w:ind w:left="5760" w:hanging="360"/>
+      </w:pPr>
+    </w:lvl>
+    <w:lvl w:ilvl="8" w:tplc="0406001B" w:tentative="1">
+      <w:start w:val="1"/>
+      <w:numFmt w:val="lowerRoman"/>
+      <w:lvlText w:val="%9."/>
+      <w:lvlJc w:val="right"/>
+      <w:pPr>
+        <w:ind w:left="6480" w:hanging="180"/>
+      </w:pPr>
+    </w:lvl>
+  </w:abstractNum>
+  <w:abstractNum w:abstractNumId="21" w15:restartNumberingAfterBreak="0">
+    <w:nsid w:val="7445403A"/>
+    <w:multiLevelType w:val="hybridMultilevel"/>
+    <w:tmpl w:val="E794B366"/>
+    <w:lvl w:ilvl="0" w:tplc="FFFFFFFF">
+      <w:start w:val="1"/>
+      <w:numFmt w:val="decimal"/>
+      <w:lvlText w:val="%1."/>
+      <w:lvlJc w:val="left"/>
+      <w:pPr>
+        <w:ind w:left="720" w:hanging="360"/>
+      </w:pPr>
+      <w:rPr>
+        <w:rFonts w:hint="default"/>
+      </w:rPr>
+    </w:lvl>
+    <w:lvl w:ilvl="1" w:tplc="FFFFFFFF" w:tentative="1">
+      <w:start w:val="1"/>
+      <w:numFmt w:val="lowerLetter"/>
+      <w:lvlText w:val="%2."/>
+      <w:lvlJc w:val="left"/>
+      <w:pPr>
+        <w:ind w:left="1440" w:hanging="360"/>
+      </w:pPr>
+    </w:lvl>
+    <w:lvl w:ilvl="2" w:tplc="FFFFFFFF" w:tentative="1">
+      <w:start w:val="1"/>
+      <w:numFmt w:val="lowerRoman"/>
+      <w:lvlText w:val="%3."/>
+      <w:lvlJc w:val="right"/>
+      <w:pPr>
+        <w:ind w:left="2160" w:hanging="180"/>
+      </w:pPr>
+    </w:lvl>
+    <w:lvl w:ilvl="3" w:tplc="FFFFFFFF" w:tentative="1">
+      <w:start w:val="1"/>
+      <w:numFmt w:val="decimal"/>
+      <w:lvlText w:val="%4."/>
+      <w:lvlJc w:val="left"/>
+      <w:pPr>
+        <w:ind w:left="2880" w:hanging="360"/>
+      </w:pPr>
+    </w:lvl>
+    <w:lvl w:ilvl="4" w:tplc="FFFFFFFF" w:tentative="1">
+      <w:start w:val="1"/>
+      <w:numFmt w:val="lowerLetter"/>
+      <w:lvlText w:val="%5."/>
+      <w:lvlJc w:val="left"/>
+      <w:pPr>
+        <w:ind w:left="3600" w:hanging="360"/>
+      </w:pPr>
+    </w:lvl>
+    <w:lvl w:ilvl="5" w:tplc="FFFFFFFF" w:tentative="1">
+      <w:start w:val="1"/>
+      <w:numFmt w:val="lowerRoman"/>
+      <w:lvlText w:val="%6."/>
+      <w:lvlJc w:val="right"/>
+      <w:pPr>
+        <w:ind w:left="4320" w:hanging="180"/>
+      </w:pPr>
+    </w:lvl>
+    <w:lvl w:ilvl="6" w:tplc="FFFFFFFF" w:tentative="1">
+      <w:start w:val="1"/>
+      <w:numFmt w:val="decimal"/>
+      <w:lvlText w:val="%7."/>
+      <w:lvlJc w:val="left"/>
+      <w:pPr>
+        <w:ind w:left="5040" w:hanging="360"/>
+      </w:pPr>
+    </w:lvl>
+    <w:lvl w:ilvl="7" w:tplc="FFFFFFFF" w:tentative="1">
+      <w:start w:val="1"/>
+      <w:numFmt w:val="lowerLetter"/>
+      <w:lvlText w:val="%8."/>
+      <w:lvlJc w:val="left"/>
+      <w:pPr>
+        <w:ind w:left="5760" w:hanging="360"/>
+      </w:pPr>
+    </w:lvl>
+    <w:lvl w:ilvl="8" w:tplc="FFFFFFFF" w:tentative="1">
+      <w:start w:val="1"/>
+      <w:numFmt w:val="lowerRoman"/>
+      <w:lvlText w:val="%9."/>
+      <w:lvlJc w:val="right"/>
+      <w:pPr>
+        <w:ind w:left="6480" w:hanging="180"/>
+      </w:pPr>
+    </w:lvl>
+  </w:abstractNum>
+  <w:abstractNum w:abstractNumId="22" w15:restartNumberingAfterBreak="0">
+    <w:nsid w:val="77E146B8"/>
+    <w:multiLevelType w:val="hybridMultilevel"/>
+    <w:tmpl w:val="066EEF76"/>
+    <w:lvl w:ilvl="0" w:tplc="FFFFFFFF">
+      <w:start w:val="1"/>
+      <w:numFmt w:val="decimal"/>
+      <w:lvlText w:val="%1."/>
+      <w:lvlJc w:val="left"/>
+      <w:pPr>
+        <w:ind w:left="720" w:hanging="360"/>
+      </w:pPr>
+      <w:rPr>
+        <w:rFonts w:hint="default"/>
+      </w:rPr>
+    </w:lvl>
+    <w:lvl w:ilvl="1" w:tplc="FFFFFFFF" w:tentative="1">
+      <w:start w:val="1"/>
+      <w:numFmt w:val="lowerLetter"/>
+      <w:lvlText w:val="%2."/>
+      <w:lvlJc w:val="left"/>
+      <w:pPr>
+        <w:ind w:left="1440" w:hanging="360"/>
+      </w:pPr>
+    </w:lvl>
+    <w:lvl w:ilvl="2" w:tplc="FFFFFFFF" w:tentative="1">
+      <w:start w:val="1"/>
+      <w:numFmt w:val="lowerRoman"/>
+      <w:lvlText w:val="%3."/>
+      <w:lvlJc w:val="right"/>
+      <w:pPr>
+        <w:ind w:left="2160" w:hanging="180"/>
+      </w:pPr>
+    </w:lvl>
+    <w:lvl w:ilvl="3" w:tplc="FFFFFFFF" w:tentative="1">
+      <w:start w:val="1"/>
+      <w:numFmt w:val="decimal"/>
+      <w:lvlText w:val="%4."/>
+      <w:lvlJc w:val="left"/>
+      <w:pPr>
+        <w:ind w:left="2880" w:hanging="360"/>
+      </w:pPr>
+    </w:lvl>
+    <w:lvl w:ilvl="4" w:tplc="FFFFFFFF" w:tentative="1">
+      <w:start w:val="1"/>
+      <w:numFmt w:val="lowerLetter"/>
+      <w:lvlText w:val="%5."/>
+      <w:lvlJc w:val="left"/>
+      <w:pPr>
+        <w:ind w:left="3600" w:hanging="360"/>
+      </w:pPr>
+    </w:lvl>
+    <w:lvl w:ilvl="5" w:tplc="FFFFFFFF" w:tentative="1">
+      <w:start w:val="1"/>
+      <w:numFmt w:val="lowerRoman"/>
+      <w:lvlText w:val="%6."/>
+      <w:lvlJc w:val="right"/>
+      <w:pPr>
+        <w:ind w:left="4320" w:hanging="180"/>
+      </w:pPr>
+    </w:lvl>
+    <w:lvl w:ilvl="6" w:tplc="FFFFFFFF" w:tentative="1">
+      <w:start w:val="1"/>
+      <w:numFmt w:val="decimal"/>
+      <w:lvlText w:val="%7."/>
+      <w:lvlJc w:val="left"/>
+      <w:pPr>
+        <w:ind w:left="5040" w:hanging="360"/>
+      </w:pPr>
+    </w:lvl>
+    <w:lvl w:ilvl="7" w:tplc="FFFFFFFF" w:tentative="1">
+      <w:start w:val="1"/>
+      <w:numFmt w:val="lowerLetter"/>
+      <w:lvlText w:val="%8."/>
+      <w:lvlJc w:val="left"/>
+      <w:pPr>
+        <w:ind w:left="5760" w:hanging="360"/>
+      </w:pPr>
+    </w:lvl>
+    <w:lvl w:ilvl="8" w:tplc="FFFFFFFF" w:tentative="1">
+      <w:start w:val="1"/>
+      <w:numFmt w:val="lowerRoman"/>
+      <w:lvlText w:val="%9."/>
+      <w:lvlJc w:val="right"/>
+      <w:pPr>
+        <w:ind w:left="6480" w:hanging="180"/>
+      </w:pPr>
+    </w:lvl>
+  </w:abstractNum>
   <w:num w:numId="1" w16cid:durableId="984089138">
-    <w:abstractNumId w:val="4"/>
+    <w:abstractNumId w:val="9"/>
   </w:num>
   <w:num w:numId="2" w16cid:durableId="1592544454">
     <w:abstractNumId w:val="0"/>
   </w:num>
   <w:num w:numId="3" w16cid:durableId="506286222">
+    <w:abstractNumId w:val="11"/>
+  </w:num>
+  <w:num w:numId="4" w16cid:durableId="1523009029">
+    <w:abstractNumId w:val="3"/>
+  </w:num>
+  <w:num w:numId="5" w16cid:durableId="1438793440">
+    <w:abstractNumId w:val="13"/>
+  </w:num>
+  <w:num w:numId="6" w16cid:durableId="815336276">
+    <w:abstractNumId w:val="4"/>
+  </w:num>
+  <w:num w:numId="7" w16cid:durableId="2139104848">
+    <w:abstractNumId w:val="2"/>
+  </w:num>
+  <w:num w:numId="8" w16cid:durableId="1924530476">
+    <w:abstractNumId w:val="6"/>
+  </w:num>
+  <w:num w:numId="9" w16cid:durableId="960921114">
+    <w:abstractNumId w:val="19"/>
+  </w:num>
+  <w:num w:numId="10" w16cid:durableId="479276075">
+    <w:abstractNumId w:val="16"/>
+  </w:num>
+  <w:num w:numId="11" w16cid:durableId="1686203313">
     <w:abstractNumId w:val="5"/>
   </w:num>
-  <w:num w:numId="4" w16cid:durableId="1523009029">
-    <w:abstractNumId w:val="2"/>
+  <w:num w:numId="12" w16cid:durableId="1934168306">
+    <w:abstractNumId w:val="1"/>
   </w:num>
-  <w:num w:numId="5" w16cid:durableId="1438793440">
-    <w:abstractNumId w:val="6"/>
+  <w:num w:numId="13" w16cid:durableId="259416648">
+    <w:abstractNumId w:val="17"/>
   </w:num>
-  <w:num w:numId="6" w16cid:durableId="815336276">
-    <w:abstractNumId w:val="3"/>
+  <w:num w:numId="14" w16cid:durableId="493186596">
+    <w:abstractNumId w:val="8"/>
   </w:num>
-  <w:num w:numId="7" w16cid:durableId="2139104848">
-    <w:abstractNumId w:val="1"/>
+  <w:num w:numId="15" w16cid:durableId="191503081">
+    <w:abstractNumId w:val="7"/>
+  </w:num>
+  <w:num w:numId="16" w16cid:durableId="1806696942">
+    <w:abstractNumId w:val="18"/>
+  </w:num>
+  <w:num w:numId="17" w16cid:durableId="825559733">
+    <w:abstractNumId w:val="10"/>
+  </w:num>
+  <w:num w:numId="18" w16cid:durableId="1566143818">
+    <w:abstractNumId w:val="20"/>
+  </w:num>
+  <w:num w:numId="19" w16cid:durableId="296028963">
+    <w:abstractNumId w:val="14"/>
+  </w:num>
+  <w:num w:numId="20" w16cid:durableId="1245379">
+    <w:abstractNumId w:val="15"/>
+  </w:num>
+  <w:num w:numId="21" w16cid:durableId="1086807841">
+    <w:abstractNumId w:val="22"/>
+  </w:num>
+  <w:num w:numId="22" w16cid:durableId="1666937717">
+    <w:abstractNumId w:val="12"/>
+  </w:num>
+  <w:num w:numId="23" w16cid:durableId="853610631">
+    <w:abstractNumId w:val="21"/>
   </w:num>
 </w:numbering>
 </file>

</xml_diff>

<commit_message>
started theory section in report
</commit_message>
<xml_diff>
--- a/Rapport/Hovedopgave Rapport.docx
+++ b/Rapport/Hovedopgave Rapport.docx
@@ -4,7 +4,7 @@
   <w:body>
     <w:p>
       <w:pPr>
-        <w:pStyle w:val="Title"/>
+        <w:pStyle w:val="Titel"/>
         <w:jc w:val="center"/>
       </w:pPr>
       <w:r>
@@ -13,7 +13,7 @@
     </w:p>
     <w:p>
       <w:pPr>
-        <w:pStyle w:val="Subtitle"/>
+        <w:pStyle w:val="Undertitel"/>
         <w:jc w:val="center"/>
       </w:pPr>
       <w:r>
@@ -22,7 +22,7 @@
     </w:p>
     <w:p>
       <w:pPr>
-        <w:pStyle w:val="Heading1"/>
+        <w:pStyle w:val="Overskrift1"/>
         <w:jc w:val="center"/>
       </w:pPr>
       <w:r>
@@ -106,7 +106,7 @@
     </w:p>
     <w:p>
       <w:pPr>
-        <w:pStyle w:val="Heading2"/>
+        <w:pStyle w:val="Overskrift2"/>
       </w:pPr>
       <w:r>
         <w:lastRenderedPageBreak/>
@@ -128,7 +128,7 @@
     </w:p>
     <w:p>
       <w:pPr>
-        <w:pStyle w:val="Heading2"/>
+        <w:pStyle w:val="Overskrift2"/>
       </w:pPr>
       <w:r>
         <w:t xml:space="preserve">Afgræsning </w:t>
@@ -157,7 +157,23 @@
         <w:t xml:space="preserve"> af deres system er optælling af salg. Et resume af hvad der ren faktisk er solgt. </w:t>
       </w:r>
       <w:r>
-        <w:t xml:space="preserve">Planen for programmet er at få en salgsfil ind, lave noget data håndtering på det og komme med et sorteret resultat, som er en forkortet version af det rod som er en salgsfil. En salgsfil er hvad deres POS system, (point of sale) skriver til ved hver transaktion. Det er ”denne produkt, med disse info, blev solgt x antal gange”. Hvis det samme produkt bliver solgt to gange på en dag, kommer der to linjer med samme data. Det er dette der kan gøre det svært at læse, da man ikke nemt kan se hvor mange af et slags produkt der blev solgt. </w:t>
+        <w:t>Planen for programmet er at få en salgsfil ind, lave noget data håndtering på det og komme med et sorteret resultat, som er en forkortet version af det rod som er en salgsfil. En salgsfil er hvad deres POS system, (point of sale) skriver til ved hver transaktion. Det er ”</w:t>
+      </w:r>
+      <w:proofErr w:type="gramStart"/>
+      <w:r>
+        <w:t>denne produkt</w:t>
+      </w:r>
+      <w:proofErr w:type="gramEnd"/>
+      <w:r>
+        <w:t xml:space="preserve">, med disse </w:t>
+      </w:r>
+      <w:proofErr w:type="gramStart"/>
+      <w:r>
+        <w:t>info</w:t>
+      </w:r>
+      <w:proofErr w:type="gramEnd"/>
+      <w:r>
+        <w:t xml:space="preserve">, blev solgt x antal gange”. Hvis det samme produkt bliver solgt to gange på en dag, kommer der to linjer med samme data. Det er dette der kan gøre det svært at læse, da man ikke nemt kan se hvor mange af et slags produkt der blev solgt. </w:t>
       </w:r>
     </w:p>
     <w:p>
@@ -165,10 +181,26 @@
         <w:t xml:space="preserve">GoFact </w:t>
       </w:r>
       <w:r>
-        <w:t xml:space="preserve">starter med kundens data. Det er her problemet med deres data som er anderledes kommer ind i billedet. </w:t>
-      </w:r>
-      <w:r>
-        <w:t xml:space="preserve">Det er et problem at ændre deres data hvis det skal gøres automatisk, men i denne applikation gør vi det en gang, og det er dermed et mindre problem. I denne applikation tager vi en salgsfil og kører igennem vores system. Det betyder at vi ændre data til at passe hvad programmet forventer. Dette gør at man ikke skal bruge </w:t>
+        <w:t xml:space="preserve">starter med kundens data. Det er her problemet med deres data som er </w:t>
+      </w:r>
+      <w:proofErr w:type="gramStart"/>
+      <w:r>
+        <w:t>anderledes</w:t>
+      </w:r>
+      <w:proofErr w:type="gramEnd"/>
+      <w:r>
+        <w:t xml:space="preserve"> kommer ind i billedet. </w:t>
+      </w:r>
+      <w:r>
+        <w:t xml:space="preserve">Det er et problem at ændre deres data hvis det skal gøres automatisk, men i denne applikation gør vi det en gang, og det er dermed et mindre problem. I denne applikation tager vi en salgsfil og kører igennem vores system. Det betyder at vi </w:t>
+      </w:r>
+      <w:proofErr w:type="gramStart"/>
+      <w:r>
+        <w:t>ændre</w:t>
+      </w:r>
+      <w:proofErr w:type="gramEnd"/>
+      <w:r>
+        <w:t xml:space="preserve"> data til at passe hvad programmet forventer. Dette gør at man ikke skal bruge </w:t>
       </w:r>
       <w:r>
         <w:t>ressource</w:t>
@@ -177,7 +209,15 @@
         <w:t xml:space="preserve">r </w:t>
       </w:r>
       <w:r>
-        <w:t>til at ændre eller skrive kode som oversætter det for en, men vi ”bare” skal gøre det selv. Det er hurtigere at ændre overskrifter i en CSV fil end det er at skrive en oversætter til den. Dette gør også at man ikke skal være bange for at kunden bruger test-systemet i stedet for hoved-systemet, da det ikke er bygget til at være effektivt uden en fast bruger.</w:t>
+        <w:t xml:space="preserve">til at ændre eller skrive kode som oversætter det for en, men vi ”bare” skal gøre det selv. Det er hurtigere at ændre overskrifter i en </w:t>
+      </w:r>
+      <w:proofErr w:type="gramStart"/>
+      <w:r>
+        <w:t>CSV fil</w:t>
+      </w:r>
+      <w:proofErr w:type="gramEnd"/>
+      <w:r>
+        <w:t xml:space="preserve"> end det er at skrive en oversætter til den. Dette gør også at man ikke skal være bange for at kunden bruger test-systemet i stedet for hoved-systemet, da det ikke er bygget til at være effektivt uden en fast bruger.</w:t>
       </w:r>
     </w:p>
     <w:p>
@@ -188,7 +228,15 @@
     <w:p>
       <w:r>
         <w:lastRenderedPageBreak/>
-        <w:t xml:space="preserve">Vi holder os også fra datoer. I kundens fil de kommer med kan der være salg for 3 år siden, eller for 2 uger siden. Det ville være svært at give et fuldendt billede hvis man siger til kunden at det er salg for hele måneden, hvis der kun er salg for 2 uger. Så det sænker forvirring med programmet her hvis vi siger ”Det data der kommer ind, bliver sorteret og talt”. </w:t>
+        <w:t xml:space="preserve">Vi holder os også fra datoer. I kundens fil de kommer </w:t>
+      </w:r>
+      <w:proofErr w:type="gramStart"/>
+      <w:r>
+        <w:t>med</w:t>
+      </w:r>
+      <w:proofErr w:type="gramEnd"/>
+      <w:r>
+        <w:t xml:space="preserve"> kan der være salg for 3 år siden, eller for 2 uger siden. Det ville være svært at give et fuldendt billede hvis man siger til kunden at det er salg for hele måneden, hvis der kun er salg for 2 uger. Så det sænker forvirring med programmet her hvis vi siger ”Det data der kommer ind, bliver sorteret og talt”. </w:t>
       </w:r>
     </w:p>
     <w:p>
@@ -204,7 +252,7 @@
     </w:p>
     <w:p>
       <w:pPr>
-        <w:pStyle w:val="Heading1"/>
+        <w:pStyle w:val="Overskrift1"/>
       </w:pPr>
       <w:r>
         <w:t xml:space="preserve">Virksomhedsbeskrivelse </w:t>
@@ -212,32 +260,38 @@
     </w:p>
     <w:p>
       <w:r>
-        <w:t xml:space="preserve">GoFact er som sagt et data håndterings firma, men ikke til AI eller lign. De indsamler data for kunder, sortere og forkorter det, og giver kunder et bedre overblik. De startede med at skulle have noget kode ud af døren hurtigt, og det resulterede i at deres backend er lidt af et rod, og indeholder en del spildte udregninger. Hver gang en ny kunde kommer ind skal deres data også gennemtjekkes for at se om der er nogle mærkelige fejl som de ikke selv har lagt mærke til. Det kan være ting som at have sin </w:t>
+        <w:t xml:space="preserve">GoFact er som sagt et data håndterings firma, men ikke til AI eller lign. De indsamler data for kunder, sortere og forkorter det, og giver kunder et bedre overblik. De startede med at skulle have noget kode ud </w:t>
+      </w:r>
+      <w:proofErr w:type="gramStart"/>
+      <w:r>
+        <w:t>af</w:t>
+      </w:r>
+      <w:proofErr w:type="gramEnd"/>
+      <w:r>
+        <w:t xml:space="preserve"> døren hurtigt, og det resulterede i at deres backend er lidt af et rod, og indeholder en del spildte udregninger. Hver gang en ny kunde kommer ind skal deres data også gennemtjekkes for at se om der er nogle mærkelige fejl som de ikke selv har lagt mærke til. Det kan være ting som at have sin </w:t>
+      </w:r>
+      <w:r>
+        <w:t>delimiter</w:t>
+      </w:r>
+      <w:r>
+        <w:t xml:space="preserve"> i en CSV fil det samme som ens decimale værdier. Dette ville resultere i et automatisk system som har alt for meget data, og hvor der højst sandsynligt ville være type-mismatches. </w:t>
+      </w:r>
+    </w:p>
+    <w:p>
+      <w:r>
+        <w:t xml:space="preserve">Det er komplekse problemer, men det har resulteret i et robust system der tager noget tid at komme ind i, og som oftest er langsommere end det burde være. For de kunder der allerede er inde i systemet, betyder det ikke alt for meget, da de får et resume af for-dagens salg på starten af morgenen. </w:t>
+      </w:r>
+    </w:p>
+    <w:p>
+      <w:r>
+        <w:t xml:space="preserve">Det meste af GoFacts’ udviklings-timer kommer fra at udvikle nye funktioner. Deres salgs-model er en abonnement system, som betyder at de fortsat tjener penge på kode de har skrevet før. Dermed giver det mere mening at skrive ny kode, end at opdatere gammel kode hvis det ikke kræver det. Det betyder også at deres system forbliver nyt, da der kommer nye features og andre </w:t>
       </w:r>
       <w:proofErr w:type="spellStart"/>
       <w:r>
-        <w:t>delimiter</w:t>
+        <w:t>nice</w:t>
       </w:r>
       <w:proofErr w:type="spellEnd"/>
       <w:r>
-        <w:t xml:space="preserve"> i en CSV fil det samme som ens decimale værdier. Dette ville resultere i et automatisk system som har alt for meget data, og hvor der højst sandsynligt ville være type-mismatches. </w:t>
-      </w:r>
-    </w:p>
-    <w:p>
-      <w:r>
-        <w:t xml:space="preserve">Det er komplekse problemer, men det har resulteret i et robust system der tager noget tid at komme ind i, og som oftest er langsommere end det burde være. For de kunder der allerede er inde i systemet, betyder det ikke alt for meget, da de får et resume af for-dagens salg på starten af morgenen. </w:t>
-      </w:r>
-    </w:p>
-    <w:p>
-      <w:r>
-        <w:t xml:space="preserve">Det meste af GoFacts’ udviklings-timer kommer fra at udvikle nye funktioner. Deres salgs-model er en abonnement system, som betyder at de fortsat tjener penge på kode de har skrevet før. Dermed giver det mere mening at skrive ny kode, end at opdatere gammel kode hvis det ikke kræver det. Det betyder også at deres system forbliver nyt, da der kommer nye features og andre </w:t>
-      </w:r>
-      <w:proofErr w:type="spellStart"/>
-      <w:r>
-        <w:t>nice</w:t>
-      </w:r>
-      <w:proofErr w:type="spellEnd"/>
-      <w:r>
         <w:t xml:space="preserve">-to-haves som gør at kunder forbliver kunder hos GoFact. Hver kunde har også direkte adgang til enden CTO Morten V.G. eller CEO Henning H. som betyder at når der er problemer føler kunden at deres stemme bliver hørt. Dette giver kun mening for dem da der ikke er mange problemer med deres produkt. Hvis der var problemer ofte, ville de ikke lavet andet, men det er ikke ofte at der kommer noget frem. </w:t>
       </w:r>
     </w:p>
@@ -254,7 +308,15 @@
     <w:p>
       <w:r>
         <w:lastRenderedPageBreak/>
-        <w:t>Det giver også nogle gange mere mening for større kæder at bruge GoFact, en mindre kæder, da de også har nogle features som hjælper mere hvis man har flere butikker der snakker sammen. En af dem er en ”bytte forslag” system. Det kigger kort sagt på et produkt, og hvor det bliver solgt mest henne. Det kunne være en striktrøje som sælger mere inde i Herning end i Brande. I stedet for at butikken i Herning køber flere nye trøjer, kan de tage nogle af dem butikken i Brande sidder med. Dette gør at de forskellige butikker ikke har spild af det tøj de ikke kunne få solgt. Det er her at hvis man er en lille kunde ville man ikke have andre butikker at kunne bytte med.</w:t>
+        <w:t xml:space="preserve">Det giver også nogle gange mere mening for større kæder at bruge GoFact, </w:t>
+      </w:r>
+      <w:proofErr w:type="gramStart"/>
+      <w:r>
+        <w:t>en mindre kæder</w:t>
+      </w:r>
+      <w:proofErr w:type="gramEnd"/>
+      <w:r>
+        <w:t>, da de også har nogle features som hjælper mere hvis man har flere butikker der snakker sammen. En af dem er en ”bytte forslag” system. Det kigger kort sagt på et produkt, og hvor det bliver solgt mest henne. Det kunne være en striktrøje som sælger mere inde i Herning end i Brande. I stedet for at butikken i Herning køber flere nye trøjer, kan de tage nogle af dem butikken i Brande sidder med. Dette gør at de forskellige butikker ikke har spild af det tøj de ikke kunne få solgt. Det er her at hvis man er en lille kunde ville man ikke have andre butikker at kunne bytte med.</w:t>
       </w:r>
       <w:r>
         <w:t xml:space="preserve"> Det er også en af grundende til at det ikke er en af de features fra GoFact som kommer med i vores light version, da det er bygget til de små, nye kunder.</w:t>
@@ -280,7 +342,7 @@
     </w:p>
     <w:p>
       <w:pPr>
-        <w:pStyle w:val="Heading1"/>
+        <w:pStyle w:val="Overskrift1"/>
       </w:pPr>
       <w:r>
         <w:lastRenderedPageBreak/>
@@ -292,12 +354,28 @@
         <w:t xml:space="preserve">Når man gerne vil have sit produkt ud i verden, kræver det en god strategi. En stor del af ens strategi er grundet i hvilket produkt man laver. Hvis man laver en køkkensvamp, er ens målgruppe en gennemsnitlig person. Men den kunne også være et industrielt køkken. Man kan dermed sige at man kan sælge få svampe til mange mennesker, eller mange svampe til få institutioner. Dette er det samme problem som GoFact også har siddet med. De har et software som er godt til at sænke spild, og øge vækst for tøjbutikker. Men </w:t>
       </w:r>
       <w:r>
-        <w:t xml:space="preserve">hvem skal man fokusere på? Hvis man kunne tilkoble alt og alle til systemet ville man kunne gøre begge nemt, men det er ikke sådan det virker for GoFact, på grund af deres ”kom som i er” mentalitet. Det gør det nemmere for nye kunder at tilkoble GoFact fra kundernes side, men for GoFact skal de vælge hvilke kunder de tager ind med lidt omhu, da det tager GoFact en del mandtimer for at få tilkoblet en ny kunde. Det er også der deres største udgift ligger, da deres abonnement model gør at de ikke skal tænke mere på en kunde efter de er opsat. </w:t>
-      </w:r>
-    </w:p>
-    <w:p>
-      <w:r>
-        <w:t>Det gør det lidt akavet for GoFact. De har et godt produkt, som de har bevis på at de sparer butikker mange penge hvert måned, og mindsker tøj-spild. Der er også mange butikker som gerne vil blive en del af GoFact systemet, men da det ikke er alle der ville kunne få lige så stor værdi af det, kan det være at nogle går fra efter det hele er opsat. Det er et stort problem for GoFact hvis en kunde går fra, da de i opstarten af en ny kunde laver meget ”gratis” arbejde, i det at de ikke tager penge for opsætning, bare den månedlige pris. Det betyder at hvis en kunde tager 250 timer at få sat op, og de går af efter første måned, kunne GoFact tabe mange penge, da de tjener tabet op i de følgende måneder.</w:t>
+        <w:t xml:space="preserve">hvem skal man fokusere på? Hvis man kunne tilkoble alt og alle til systemet ville man kunne gøre begge nemt, men det er ikke sådan det virker for GoFact, på grund af deres ”kom som </w:t>
+      </w:r>
+      <w:proofErr w:type="gramStart"/>
+      <w:r>
+        <w:t>i</w:t>
+      </w:r>
+      <w:proofErr w:type="gramEnd"/>
+      <w:r>
+        <w:t xml:space="preserve"> er” mentalitet. Det gør det nemmere for nye kunder at tilkoble GoFact fra kundernes side, men for GoFact skal de vælge hvilke kunder de tager ind med lidt omhu, da det tager GoFact en del mandtimer for at få tilkoblet en ny kunde. Det er også der deres største udgift ligger, da deres abonnement model gør at de ikke skal tænke mere på en kunde efter de er opsat. </w:t>
+      </w:r>
+    </w:p>
+    <w:p>
+      <w:r>
+        <w:t xml:space="preserve">Det gør det lidt akavet for GoFact. De har et godt produkt, som de har bevis på at de sparer butikker mange penge </w:t>
+      </w:r>
+      <w:proofErr w:type="gramStart"/>
+      <w:r>
+        <w:t>hvert måned</w:t>
+      </w:r>
+      <w:proofErr w:type="gramEnd"/>
+      <w:r>
+        <w:t>, og mindsker tøj-spild. Der er også mange butikker som gerne vil blive en del af GoFact systemet, men da det ikke er alle der ville kunne få lige så stor værdi af det, kan det være at nogle går fra efter det hele er opsat. Det er et stort problem for GoFact hvis en kunde går fra, da de i opstarten af en ny kunde laver meget ”gratis” arbejde, i det at de ikke tager penge for opsætning, bare den månedlige pris. Det betyder at hvis en kunde tager 250 timer at få sat op, og de går af efter første måned, kunne GoFact tabe mange penge, da de tjener tabet op i de følgende måneder.</w:t>
       </w:r>
     </w:p>
     <w:p>
@@ -350,12 +428,28 @@
     </w:p>
     <w:p>
       <w:r>
-        <w:t>Med mindre butikker som ikke har for fastlagte IT-systemer kunne man også sige at de skal ændre deres data til en ”simplere” version af GoFact systemet, som ikke er custom lavet til dem. Man kunne give denne version en billigere pris, da GoFact ikke skal gøre noget for at få en ekstra kunde ind ad døren. Det ville også være mere attraktivt til små kunder at det er billigere for dem.</w:t>
-      </w:r>
-    </w:p>
-    <w:p>
-      <w:r>
-        <w:t>Dette er dog ikke hvad der er fokus på her. Vi fokusere på at sælge ideen til kunder. Vi skal dermed komme frem til et produkt der nemt kan vise hvad GoFact kan gøre for kunder. Det skal kunne hurtigt highlighte i en praktisk måde, hvad GoFact kan gøre for kunderne.</w:t>
+        <w:t>Med mindre butikker som ikke har for fastlagte IT-</w:t>
+      </w:r>
+      <w:proofErr w:type="gramStart"/>
+      <w:r>
+        <w:t>systemer</w:t>
+      </w:r>
+      <w:proofErr w:type="gramEnd"/>
+      <w:r>
+        <w:t xml:space="preserve"> kunne man også sige at de skal ændre deres data til en ”simplere” version af GoFact systemet, som ikke er custom lavet til dem. Man kunne give denne version en billigere pris, da GoFact ikke skal gøre noget for at få en ekstra kunde ind ad døren. Det ville også være mere attraktivt til små kunder at det er billigere for dem.</w:t>
+      </w:r>
+    </w:p>
+    <w:p>
+      <w:r>
+        <w:t xml:space="preserve">Dette er dog ikke hvad der er fokus på her. Vi </w:t>
+      </w:r>
+      <w:proofErr w:type="gramStart"/>
+      <w:r>
+        <w:t>fokusere</w:t>
+      </w:r>
+      <w:proofErr w:type="gramEnd"/>
+      <w:r>
+        <w:t xml:space="preserve"> på at sælge ideen til kunder. Vi skal dermed komme frem til et produkt der nemt kan vise hvad GoFact kan gøre for kunder. Det skal kunne hurtigt highlighte i en praktisk måde, hvad GoFact kan gøre for kunderne.</w:t>
       </w:r>
       <w:r>
         <w:t xml:space="preserve"> For det kan vi kigge på hvad vores produkt skal kunne gøre, hvordan vi ville udføre dem, og hvad vi vælger at skære fra. </w:t>
@@ -363,7 +457,15 @@
     </w:p>
     <w:p>
       <w:r>
-        <w:t>Det er også vigtigt at vi skærer funktioner fra, da vi prøver at sælge hoved ideen på GoFact. Det er en bedre salgs-pitch at komme med en god grund til at bruge en, i stedet for mange små. Da folk nemmere kan have små vigtige ting i hovedet, end mange små, mindre vigtige ting.</w:t>
+        <w:t xml:space="preserve">Det er også vigtigt at vi skærer funktioner fra, da vi prøver at sælge </w:t>
+      </w:r>
+      <w:proofErr w:type="gramStart"/>
+      <w:r>
+        <w:t>hoved ideen</w:t>
+      </w:r>
+      <w:proofErr w:type="gramEnd"/>
+      <w:r>
+        <w:t xml:space="preserve"> på GoFact. Det er en bedre salgs-pitch at komme med en god grund til at bruge en, i stedet for mange små. Da folk nemmere kan have små vigtige ting i hovedet, end mange små, mindre vigtige ting.</w:t>
       </w:r>
     </w:p>
     <w:p>
@@ -373,7 +475,7 @@
     </w:p>
     <w:p>
       <w:pPr>
-        <w:pStyle w:val="Heading3"/>
+        <w:pStyle w:val="Overskrift3"/>
       </w:pPr>
       <w:r>
         <w:lastRenderedPageBreak/>
@@ -396,13 +498,69 @@
         <w:rPr>
           <w:lang w:val="en-US"/>
         </w:rPr>
-        <w:t>MoSCoW står for</w:t>
-      </w:r>
-      <w:r>
-        <w:rPr>
-          <w:lang w:val="en-US"/>
-        </w:rPr>
-        <w:t xml:space="preserve"> ”Must have, Should have, Could have, Wont have”. </w:t>
+        <w:t xml:space="preserve">MoSCoW står </w:t>
+      </w:r>
+      <w:proofErr w:type="gramStart"/>
+      <w:r>
+        <w:rPr>
+          <w:lang w:val="en-US"/>
+        </w:rPr>
+        <w:t>for</w:t>
+      </w:r>
+      <w:r>
+        <w:rPr>
+          <w:lang w:val="en-US"/>
+        </w:rPr>
+        <w:t xml:space="preserve"> ”Must</w:t>
+      </w:r>
+      <w:proofErr w:type="gramEnd"/>
+      <w:r>
+        <w:rPr>
+          <w:lang w:val="en-US"/>
+        </w:rPr>
+        <w:t xml:space="preserve"> have, </w:t>
+      </w:r>
+      <w:proofErr w:type="gramStart"/>
+      <w:r>
+        <w:rPr>
+          <w:lang w:val="en-US"/>
+        </w:rPr>
+        <w:t>Should</w:t>
+      </w:r>
+      <w:proofErr w:type="gramEnd"/>
+      <w:r>
+        <w:rPr>
+          <w:lang w:val="en-US"/>
+        </w:rPr>
+        <w:t xml:space="preserve"> have, </w:t>
+      </w:r>
+      <w:proofErr w:type="gramStart"/>
+      <w:r>
+        <w:rPr>
+          <w:lang w:val="en-US"/>
+        </w:rPr>
+        <w:t>Could</w:t>
+      </w:r>
+      <w:proofErr w:type="gramEnd"/>
+      <w:r>
+        <w:rPr>
+          <w:lang w:val="en-US"/>
+        </w:rPr>
+        <w:t xml:space="preserve"> have, </w:t>
+      </w:r>
+      <w:proofErr w:type="gramStart"/>
+      <w:r>
+        <w:rPr>
+          <w:lang w:val="en-US"/>
+        </w:rPr>
+        <w:t>Wont</w:t>
+      </w:r>
+      <w:proofErr w:type="gramEnd"/>
+      <w:r>
+        <w:rPr>
+          <w:lang w:val="en-US"/>
+        </w:rPr>
+        <w:t xml:space="preserve"> have”. </w:t>
       </w:r>
       <w:r>
         <w:t xml:space="preserve">Det er en metode at skrive </w:t>
@@ -427,7 +585,7 @@
     </w:p>
     <w:p>
       <w:pPr>
-        <w:pStyle w:val="Heading2"/>
+        <w:pStyle w:val="Overskrift2"/>
         <w:rPr>
           <w:lang w:val="en-US"/>
         </w:rPr>
@@ -466,7 +624,7 @@
     </w:p>
     <w:p>
       <w:pPr>
-        <w:pStyle w:val="ListParagraph"/>
+        <w:pStyle w:val="Listeafsnit"/>
         <w:numPr>
           <w:ilvl w:val="0"/>
           <w:numId w:val="8"/>
@@ -478,7 +636,7 @@
     </w:p>
     <w:p>
       <w:pPr>
-        <w:pStyle w:val="ListParagraph"/>
+        <w:pStyle w:val="Listeafsnit"/>
         <w:numPr>
           <w:ilvl w:val="0"/>
           <w:numId w:val="8"/>
@@ -490,7 +648,7 @@
     </w:p>
     <w:p>
       <w:pPr>
-        <w:pStyle w:val="ListParagraph"/>
+        <w:pStyle w:val="Listeafsnit"/>
         <w:numPr>
           <w:ilvl w:val="0"/>
           <w:numId w:val="8"/>
@@ -502,7 +660,7 @@
     </w:p>
     <w:p>
       <w:pPr>
-        <w:pStyle w:val="ListParagraph"/>
+        <w:pStyle w:val="Listeafsnit"/>
         <w:numPr>
           <w:ilvl w:val="0"/>
           <w:numId w:val="8"/>
@@ -531,7 +689,7 @@
     </w:p>
     <w:p>
       <w:pPr>
-        <w:pStyle w:val="ListParagraph"/>
+        <w:pStyle w:val="Listeafsnit"/>
         <w:numPr>
           <w:ilvl w:val="0"/>
           <w:numId w:val="15"/>
@@ -543,7 +701,7 @@
     </w:p>
     <w:p>
       <w:pPr>
-        <w:pStyle w:val="ListParagraph"/>
+        <w:pStyle w:val="Listeafsnit"/>
         <w:numPr>
           <w:ilvl w:val="0"/>
           <w:numId w:val="15"/>
@@ -555,7 +713,7 @@
     </w:p>
     <w:p>
       <w:pPr>
-        <w:pStyle w:val="ListParagraph"/>
+        <w:pStyle w:val="Listeafsnit"/>
         <w:numPr>
           <w:ilvl w:val="0"/>
           <w:numId w:val="15"/>
@@ -584,7 +742,7 @@
     </w:p>
     <w:p>
       <w:pPr>
-        <w:pStyle w:val="ListParagraph"/>
+        <w:pStyle w:val="Listeafsnit"/>
         <w:numPr>
           <w:ilvl w:val="0"/>
           <w:numId w:val="17"/>
@@ -596,15 +754,20 @@
     </w:p>
     <w:p>
       <w:pPr>
-        <w:pStyle w:val="ListParagraph"/>
+        <w:pStyle w:val="Listeafsnit"/>
         <w:numPr>
           <w:ilvl w:val="0"/>
           <w:numId w:val="17"/>
         </w:numPr>
       </w:pPr>
       <w:r>
-        <w:t xml:space="preserve"> En hurtigere måde at ændre filen på en manuel arbejde</w:t>
-      </w:r>
+        <w:t xml:space="preserve"> En hurtigere måde at ændre filen på </w:t>
+      </w:r>
+      <w:proofErr w:type="gramStart"/>
+      <w:r>
+        <w:t>en manuel arbejde</w:t>
+      </w:r>
+      <w:proofErr w:type="gramEnd"/>
     </w:p>
     <w:p>
       <w:pPr>
@@ -614,18 +777,28 @@
           <w:lang w:val="en-US"/>
         </w:rPr>
       </w:pPr>
+      <w:proofErr w:type="gramStart"/>
       <w:r>
         <w:rPr>
           <w:b/>
           <w:bCs/>
           <w:lang w:val="en-US"/>
         </w:rPr>
-        <w:t>Wont Have</w:t>
-      </w:r>
-    </w:p>
-    <w:p>
-      <w:pPr>
-        <w:pStyle w:val="ListParagraph"/>
+        <w:t>Wont</w:t>
+      </w:r>
+      <w:proofErr w:type="gramEnd"/>
+      <w:r>
+        <w:rPr>
+          <w:b/>
+          <w:bCs/>
+          <w:lang w:val="en-US"/>
+        </w:rPr>
+        <w:t xml:space="preserve"> Have</w:t>
+      </w:r>
+    </w:p>
+    <w:p>
+      <w:pPr>
+        <w:pStyle w:val="Listeafsnit"/>
         <w:numPr>
           <w:ilvl w:val="0"/>
           <w:numId w:val="18"/>
@@ -643,7 +816,7 @@
     </w:p>
     <w:p>
       <w:pPr>
-        <w:pStyle w:val="ListParagraph"/>
+        <w:pStyle w:val="Listeafsnit"/>
         <w:numPr>
           <w:ilvl w:val="0"/>
           <w:numId w:val="18"/>
@@ -678,7 +851,7 @@
     </w:p>
     <w:p>
       <w:pPr>
-        <w:pStyle w:val="Heading2"/>
+        <w:pStyle w:val="Overskrift2"/>
         <w:rPr>
           <w:lang w:val="en-US"/>
         </w:rPr>
@@ -707,7 +880,7 @@
     </w:p>
     <w:p>
       <w:pPr>
-        <w:pStyle w:val="Heading3"/>
+        <w:pStyle w:val="Overskrift3"/>
       </w:pPr>
       <w:r>
         <w:t>Must Have</w:t>
@@ -729,7 +902,7 @@
     </w:p>
     <w:p>
       <w:pPr>
-        <w:pStyle w:val="ListParagraph"/>
+        <w:pStyle w:val="Listeafsnit"/>
         <w:rPr>
           <w:b/>
           <w:bCs/>
@@ -745,7 +918,7 @@
     </w:p>
     <w:p>
       <w:pPr>
-        <w:pStyle w:val="ListParagraph"/>
+        <w:pStyle w:val="Listeafsnit"/>
         <w:rPr>
           <w:b/>
           <w:bCs/>
@@ -761,7 +934,7 @@
     </w:p>
     <w:p>
       <w:pPr>
-        <w:pStyle w:val="ListParagraph"/>
+        <w:pStyle w:val="Listeafsnit"/>
         <w:rPr>
           <w:b/>
           <w:bCs/>
@@ -777,7 +950,7 @@
     </w:p>
     <w:p>
       <w:pPr>
-        <w:pStyle w:val="ListParagraph"/>
+        <w:pStyle w:val="Listeafsnit"/>
         <w:rPr>
           <w:b/>
           <w:bCs/>
@@ -833,13 +1006,37 @@
     </w:p>
     <w:p>
       <w:r>
-        <w:t>Når vi snakker om onboarding af nye kunder, skal vi gøre det så nemt for dem så muligt at se vores vision, og hvad vi kan gøre for dem. Selvom vi snakker om en lightweight version kun skabt til at sælge en vision, er det stadig vigtigt for os at det er så nemt som muligt. Vores produkt har funktion at sælge en vision. Og hvis vores salgs pitch er svær at bruge, reflektere det ikke godt på den fulde version. Det er dermed vigtigt at vores version er ligeså nem, hvis ikke nemmere at bruge end det fulde produkt. Men hvad er ”nemt” at bruge? Det fylde system kører data automatisk ind, så hvis vores ”nemhed” kriterie går imod manuel vs. Automatisk, kommer vi til at fejle på dette punkt uanset hvad. Så hvad kan vi gøre for at det er nemt? Genbruge systemer kunderne allerede kender til. Vores input til vores system skal bruge indbyggede</w:t>
+        <w:t xml:space="preserve">Når vi snakker om onboarding af nye kunder, skal vi gøre det så nemt for dem så muligt at se vores vision, og hvad vi kan gøre for dem. Selvom vi snakker om en lightweight version kun skabt til at sælge en vision, er det stadig vigtigt for os at det er så nemt som muligt. Vores produkt har funktion at sælge en vision. Og hvis vores salgs pitch er svær at bruge, reflektere det ikke godt på den fulde version. Det er dermed vigtigt at vores version er </w:t>
+      </w:r>
+      <w:proofErr w:type="gramStart"/>
+      <w:r>
+        <w:t>ligeså</w:t>
+      </w:r>
+      <w:proofErr w:type="gramEnd"/>
+      <w:r>
+        <w:t xml:space="preserve"> nem, hvis ikke nemmere at bruge end det fulde produkt. Men hvad er ”nemt” at bruge? Det </w:t>
+      </w:r>
+      <w:proofErr w:type="gramStart"/>
+      <w:r>
+        <w:t>fylde</w:t>
+      </w:r>
+      <w:proofErr w:type="gramEnd"/>
+      <w:r>
+        <w:t xml:space="preserve"> system kører data automatisk ind, så hvis vores ”nemhed” kriterie går imod manuel vs. Automatisk, kommer vi til at fejle på dette punkt uanset hvad. Så hvad kan vi gøre for at det er nemt? Genbruge systemer kunderne allerede kender til. Vores input til vores system skal bruge indbyggede</w:t>
       </w:r>
       <w:r>
         <w:t xml:space="preserve"> filnavigation</w:t>
       </w:r>
       <w:r>
-        <w:t xml:space="preserve">, og ikke noget custom lavet. Så i stedet for at have en GUI eller en anden løsning som man kunne blive forvirret over, skal vi ligge en fil ind i en mappe tydeligt navngivet ”input”. Det ville være det nemmeste at fortælle en kunde. ”lig den eller de ønskede filer ind i denne mappe og kør programmet”. Mappen bliver lavet på ens skrivebord, som er der hvor de fleste mennesker opbevarer deres ”vigtige” applikationer. Så vores </w:t>
+        <w:t xml:space="preserve">, og ikke noget custom lavet. Så i stedet for at have en GUI eller en anden løsning som man kunne blive forvirret over, skal vi </w:t>
+      </w:r>
+      <w:proofErr w:type="gramStart"/>
+      <w:r>
+        <w:t>ligge</w:t>
+      </w:r>
+      <w:proofErr w:type="gramEnd"/>
+      <w:r>
+        <w:t xml:space="preserve"> en fil ind i en mappe tydeligt navngivet ”input”. Det ville være det nemmeste at fortælle en kunde. ”lig den eller de ønskede filer ind i denne mappe og kør programmet”. Mappen bliver lavet på ens skrivebord, som er der hvor de fleste mennesker opbevarer deres ”vigtige” applikationer. Så vores </w:t>
       </w:r>
       <w:r>
         <w:t>input bliver så</w:t>
@@ -925,7 +1122,15 @@
       </w:r>
       <w:proofErr w:type="spellEnd"/>
       <w:r>
-        <w:t>” felt, som er hvad en af disse produkter sælges for. Det sidste felt vi tilføjer er et ”</w:t>
+        <w:t xml:space="preserve">” felt, som er hvad en af disse produkter sælges for. Det sidste felt vi </w:t>
+      </w:r>
+      <w:proofErr w:type="gramStart"/>
+      <w:r>
+        <w:t>tilføjer</w:t>
+      </w:r>
+      <w:proofErr w:type="gramEnd"/>
+      <w:r>
+        <w:t xml:space="preserve"> er et ”</w:t>
       </w:r>
       <w:proofErr w:type="spellStart"/>
       <w:r>
@@ -982,7 +1187,23 @@
     </w:p>
     <w:p>
       <w:r>
-        <w:t xml:space="preserve">Vi ender med en mærkelig blanding af industri standarten, og min egen version, da jeg ikke har et katalog af produkter, bliver hver EAN kode et helt unikt produkt, hvor man oftest ville have en række af EAN koder der er ”samme” produkt, men en anden størrelse eller anden farve. Det betyder at i mit program bliver der sorteret efter </w:t>
+        <w:t xml:space="preserve">Vi ender med en mærkelig blanding af </w:t>
+      </w:r>
+      <w:proofErr w:type="gramStart"/>
+      <w:r>
+        <w:t>industri standarten</w:t>
+      </w:r>
+      <w:proofErr w:type="gramEnd"/>
+      <w:r>
+        <w:t xml:space="preserve">, og min egen version, da jeg ikke har et katalog af produkter, bliver hver EAN kode et helt unikt produkt, hvor man oftest ville have en række af </w:t>
+      </w:r>
+      <w:proofErr w:type="gramStart"/>
+      <w:r>
+        <w:t>EAN</w:t>
+      </w:r>
+      <w:proofErr w:type="gramEnd"/>
+      <w:r>
+        <w:t xml:space="preserve"> koder der er ”samme” produkt, men en anden størrelse eller anden farve. Det betyder at i mit program bliver der sorteret efter </w:t>
       </w:r>
       <w:r>
         <w:rPr>
@@ -992,7 +1213,15 @@
         <w:t>alle</w:t>
       </w:r>
       <w:r>
-        <w:t xml:space="preserve"> størrelser, og indenfor samme størrelse, antal salg. Det er ikke helt som man gør i den virkelige verden, men for at få det til at passe til den virkelige verden ville jeg skulle have rigtig data, i stedet for data jeg selv laver.</w:t>
+        <w:t xml:space="preserve"> størrelser, og indenfor samme størrelse, antal salg. Det er ikke helt som man gør i den virkelige verden, men for at få det til at passe til den virkelige verden ville jeg skulle have </w:t>
+      </w:r>
+      <w:proofErr w:type="gramStart"/>
+      <w:r>
+        <w:t>rigtig</w:t>
+      </w:r>
+      <w:proofErr w:type="gramEnd"/>
+      <w:r>
+        <w:t xml:space="preserve"> data, i stedet for data jeg selv laver.</w:t>
       </w:r>
     </w:p>
     <w:p>
@@ -1039,7 +1268,7 @@
     </w:p>
     <w:p>
       <w:pPr>
-        <w:pStyle w:val="Heading3"/>
+        <w:pStyle w:val="Overskrift3"/>
       </w:pPr>
       <w:r>
         <w:lastRenderedPageBreak/>
@@ -1208,7 +1437,7 @@
     <w:p/>
     <w:p>
       <w:pPr>
-        <w:pStyle w:val="Heading3"/>
+        <w:pStyle w:val="Overskrift3"/>
       </w:pPr>
       <w:r>
         <w:t>Could have</w:t>
@@ -1253,8 +1482,17 @@
           <w:b/>
           <w:bCs/>
         </w:rPr>
-        <w:t>Nr. 2 En hurtigere måde at ændre filen på en manuel arbejde</w:t>
-      </w:r>
+        <w:t xml:space="preserve">Nr. 2 En hurtigere måde at ændre filen på </w:t>
+      </w:r>
+      <w:proofErr w:type="gramStart"/>
+      <w:r>
+        <w:rPr>
+          <w:b/>
+          <w:bCs/>
+        </w:rPr>
+        <w:t>en manuel arbejde</w:t>
+      </w:r>
+      <w:proofErr w:type="gramEnd"/>
     </w:p>
     <w:p>
       <w:r>
@@ -1284,7 +1522,7 @@
     </w:p>
     <w:p>
       <w:pPr>
-        <w:pStyle w:val="Heading3"/>
+        <w:pStyle w:val="Overskrift3"/>
       </w:pPr>
       <w:r>
         <w:lastRenderedPageBreak/>
@@ -1296,12 +1534,28 @@
         <w:t xml:space="preserve">Wont have er </w:t>
       </w:r>
       <w:r>
-        <w:t xml:space="preserve">sektionen hvor vi afskærer features fra programmet. Det er ting som man kunne have med, hvis man havde ingen grænse på tid eller ressourcer. Det er også her hvor man kan fjerner features som ikke ville bidrage til programmet men tager tid at implementere, eller i værste tilfælde trække fokus fra vigtige områder. </w:t>
-      </w:r>
-    </w:p>
-    <w:p>
-      <w:pPr>
-        <w:pStyle w:val="ListParagraph"/>
+        <w:t xml:space="preserve">sektionen hvor vi afskærer features fra programmet. Det er ting som man kunne have med, hvis man havde ingen grænse på tid eller ressourcer. Det er også her hvor man kan </w:t>
+      </w:r>
+      <w:proofErr w:type="gramStart"/>
+      <w:r>
+        <w:t>fjerner</w:t>
+      </w:r>
+      <w:proofErr w:type="gramEnd"/>
+      <w:r>
+        <w:t xml:space="preserve"> features som ikke ville bidrage til </w:t>
+      </w:r>
+      <w:proofErr w:type="gramStart"/>
+      <w:r>
+        <w:t>programmet</w:t>
+      </w:r>
+      <w:proofErr w:type="gramEnd"/>
+      <w:r>
+        <w:t xml:space="preserve"> men tager tid at implementere, eller i værste tilfælde trække fokus fra vigtige områder. </w:t>
+      </w:r>
+    </w:p>
+    <w:p>
+      <w:pPr>
+        <w:pStyle w:val="Listeafsnit"/>
         <w:numPr>
           <w:ilvl w:val="0"/>
           <w:numId w:val="23"/>
@@ -1319,7 +1573,7 @@
     </w:p>
     <w:p>
       <w:pPr>
-        <w:pStyle w:val="ListParagraph"/>
+        <w:pStyle w:val="Listeafsnit"/>
         <w:numPr>
           <w:ilvl w:val="0"/>
           <w:numId w:val="23"/>
@@ -1375,7 +1629,15 @@
         <w:t xml:space="preserve">Mit program kræver ikke en GUI, da den ikke ville bruge den. Så hvorfor involvere grafisk design, testing af UI </w:t>
       </w:r>
       <w:r>
-        <w:t>og en masse programmering, for en feature som ikke ville bidrage til funktionen af produktet? Det er derfor jeg har valgt ikke at have en GUI til mit program. Programmet er simpelt, og det ville kun forvirrer med at have en GUI.</w:t>
+        <w:t xml:space="preserve">og en masse programmering, for en feature som ikke ville bidrage til funktionen af produktet? Det er derfor jeg har valgt ikke at have en GUI til mit program. Programmet er simpelt, og det ville kun </w:t>
+      </w:r>
+      <w:proofErr w:type="gramStart"/>
+      <w:r>
+        <w:t>forvirrer</w:t>
+      </w:r>
+      <w:proofErr w:type="gramEnd"/>
+      <w:r>
+        <w:t xml:space="preserve"> med at have en GUI.</w:t>
       </w:r>
     </w:p>
     <w:p>
@@ -1434,7 +1696,7 @@
     </w:p>
     <w:p>
       <w:pPr>
-        <w:pStyle w:val="Heading1"/>
+        <w:pStyle w:val="Overskrift1"/>
       </w:pPr>
       <w:r>
         <w:lastRenderedPageBreak/>
@@ -1443,7 +1705,7 @@
     </w:p>
     <w:p>
       <w:pPr>
-        <w:pStyle w:val="ListParagraph"/>
+        <w:pStyle w:val="Listeafsnit"/>
         <w:numPr>
           <w:ilvl w:val="1"/>
           <w:numId w:val="1"/>
@@ -1468,7 +1730,7 @@
     </w:p>
     <w:p>
       <w:pPr>
-        <w:pStyle w:val="ListParagraph"/>
+        <w:pStyle w:val="Listeafsnit"/>
         <w:numPr>
           <w:ilvl w:val="1"/>
           <w:numId w:val="1"/>
@@ -1490,7 +1752,7 @@
     </w:p>
     <w:p>
       <w:pPr>
-        <w:pStyle w:val="ListParagraph"/>
+        <w:pStyle w:val="Listeafsnit"/>
         <w:numPr>
           <w:ilvl w:val="1"/>
           <w:numId w:val="1"/>
@@ -1512,7 +1774,7 @@
     </w:p>
     <w:p>
       <w:pPr>
-        <w:pStyle w:val="ListParagraph"/>
+        <w:pStyle w:val="Listeafsnit"/>
         <w:numPr>
           <w:ilvl w:val="1"/>
           <w:numId w:val="1"/>
@@ -1530,7 +1792,7 @@
     </w:p>
     <w:p>
       <w:pPr>
-        <w:pStyle w:val="ListParagraph"/>
+        <w:pStyle w:val="Listeafsnit"/>
         <w:numPr>
           <w:ilvl w:val="2"/>
           <w:numId w:val="1"/>
@@ -1556,7 +1818,7 @@
     </w:p>
     <w:p>
       <w:pPr>
-        <w:pStyle w:val="Heading2"/>
+        <w:pStyle w:val="Overskrift2"/>
         <w:rPr>
           <w:lang w:val="en-US"/>
         </w:rPr>
@@ -1618,7 +1880,7 @@
     </w:p>
     <w:p>
       <w:pPr>
-        <w:pStyle w:val="Heading3"/>
+        <w:pStyle w:val="Overskrift3"/>
       </w:pPr>
     </w:p>
     <w:p>
@@ -1636,7 +1898,7 @@
     </w:p>
     <w:p>
       <w:pPr>
-        <w:pStyle w:val="Heading3"/>
+        <w:pStyle w:val="Overskrift3"/>
       </w:pPr>
       <w:r>
         <w:lastRenderedPageBreak/>
@@ -1668,7 +1930,31 @@
     </w:p>
     <w:p>
       <w:r>
-        <w:t>Det første trin i programmet er at indlæse filer fra en CSV fil. Grunden til at input er en CSV fil er at de fleste mennesker bruger den filtype. Da Excel kører på en filtype der er tæt på, kan man oftest lave en Excel fil om til CSV, og man kan åbne en CSV fil i Excel uden nogle problemer</w:t>
+        <w:t xml:space="preserve">Det første trin i programmet er at indlæse filer fra en </w:t>
+      </w:r>
+      <w:proofErr w:type="gramStart"/>
+      <w:r>
+        <w:t>CSV fil</w:t>
+      </w:r>
+      <w:proofErr w:type="gramEnd"/>
+      <w:r>
+        <w:t xml:space="preserve">. Grunden til at input er en </w:t>
+      </w:r>
+      <w:proofErr w:type="gramStart"/>
+      <w:r>
+        <w:t>CSV fil</w:t>
+      </w:r>
+      <w:proofErr w:type="gramEnd"/>
+      <w:r>
+        <w:t xml:space="preserve"> er at de fleste mennesker bruger den filtype. Da Excel kører på en filtype der er tæt på, kan man oftest lave en Excel fil om til CSV, og man kan åbne en </w:t>
+      </w:r>
+      <w:proofErr w:type="gramStart"/>
+      <w:r>
+        <w:t>CSV fil</w:t>
+      </w:r>
+      <w:proofErr w:type="gramEnd"/>
+      <w:r>
+        <w:t xml:space="preserve"> i Excel uden nogle problemer</w:t>
       </w:r>
       <w:r>
         <w:t xml:space="preserve">. </w:t>
@@ -1694,7 +1980,15 @@
         <w:t xml:space="preserve"> Files”</w:t>
       </w:r>
       <w:r>
-        <w:t>. Så alt der har med indlæsning af filer at gøre kommer i denne mappe. Efter filer er indlæst, er dette sektions opgave færdig.</w:t>
+        <w:t xml:space="preserve">. Så alt der har med indlæsning af filer at </w:t>
+      </w:r>
+      <w:proofErr w:type="gramStart"/>
+      <w:r>
+        <w:t>gøre</w:t>
+      </w:r>
+      <w:proofErr w:type="gramEnd"/>
+      <w:r>
+        <w:t xml:space="preserve"> kommer i denne mappe. Efter filer er indlæst, er dette sektions opgave færdig.</w:t>
       </w:r>
     </w:p>
     <w:p>
@@ -1707,7 +2001,15 @@
       </w:r>
       <w:proofErr w:type="spellEnd"/>
       <w:r>
-        <w:t xml:space="preserve">”. Det er alt der ændre på dataen der kommer her ind. I det fulde system laver de meget i dette trin, men vi holder os til 2 primære opgaver. Kompresse data, og sortere data. Kompresse data handler om at samle mange af samme slags salg til en, hvor den samler hvor mange salg der er lavet på det objekt, samt hvor mange penge man har tjent på salgene. </w:t>
+        <w:t xml:space="preserve">”. Det er alt der </w:t>
+      </w:r>
+      <w:proofErr w:type="gramStart"/>
+      <w:r>
+        <w:t>ændre</w:t>
+      </w:r>
+      <w:proofErr w:type="gramEnd"/>
+      <w:r>
+        <w:t xml:space="preserve"> på dataen der kommer her ind. I det fulde system laver de meget i dette trin, men vi holder os til 2 primære opgaver. Kompresse data, og sortere data. Kompresse data handler om at samle mange af samme slags salg til en, hvor den samler hvor mange salg der er lavet på det objekt, samt hvor mange penge man har tjent på salgene. </w:t>
       </w:r>
     </w:p>
     <w:p>
@@ -1740,7 +2042,15 @@
         <w:t xml:space="preserve">Det går ind til det sidste step i vores filstruktur, ”3.WritingOutput”. </w:t>
       </w:r>
       <w:r>
-        <w:t>I dette trin handler det om at skrive data til kunden så de kan se resultatet af vores program. Dette inkludere både til konsollen med opdateringer om programmets handlinger, og til filer som kunden kan læse som viser resultatet. Det med at skrive til konsollen bryder lidt den tanke om at have fælles ting i common, men da den skriver information ud, giver det ikke mening at opbevare koden et andet sted end i mappen der har jobbet at udskrive data.</w:t>
+        <w:t xml:space="preserve">I dette trin handler det om at skrive data til kunden så de kan se resultatet af vores program. Dette </w:t>
+      </w:r>
+      <w:proofErr w:type="gramStart"/>
+      <w:r>
+        <w:t>inkludere</w:t>
+      </w:r>
+      <w:proofErr w:type="gramEnd"/>
+      <w:r>
+        <w:t xml:space="preserve"> både til konsollen med opdateringer om programmets handlinger, og til filer som kunden kan læse som viser resultatet. Det med at skrive til konsollen bryder lidt den tanke om at have fælles ting i common, men da den skriver information ud, giver det ikke mening at opbevare koden et andet sted end i mappen der har jobbet at udskrive data.</w:t>
       </w:r>
     </w:p>
     <w:p>
@@ -1756,7 +2066,7 @@
     </w:p>
     <w:p>
       <w:pPr>
-        <w:pStyle w:val="Heading2"/>
+        <w:pStyle w:val="Overskrift2"/>
       </w:pPr>
       <w:r>
         <w:t>Databærende objekter</w:t>
@@ -1800,7 +2110,7 @@
     <w:p/>
     <w:p>
       <w:pPr>
-        <w:pStyle w:val="Heading2"/>
+        <w:pStyle w:val="Overskrift2"/>
       </w:pPr>
       <w:r>
         <w:lastRenderedPageBreak/>
@@ -1818,12 +2128,20 @@
         <w:t xml:space="preserve"> </w:t>
       </w:r>
       <w:r>
-        <w:t>Det data der bliver samlet her er hvad der ender med at blive udskrevet til kunden, så vi kan tilføje ekstra detaljer som vi kommer til at skulle bruge senere i programmet. Nogle af disse detaljer kunne være hvor meget der er solgt indenfor en kategori, da vi kan udskrive et resume af resuméet. Så vi viser både et total mængde profit, men også en mere fuldendt version hvor man kan se hvilke produkter der har solgt mere end andre.</w:t>
-      </w:r>
-    </w:p>
-    <w:p>
-      <w:pPr>
-        <w:pStyle w:val="Heading2"/>
+        <w:t xml:space="preserve">Det data der bliver samlet </w:t>
+      </w:r>
+      <w:proofErr w:type="gramStart"/>
+      <w:r>
+        <w:t>her</w:t>
+      </w:r>
+      <w:proofErr w:type="gramEnd"/>
+      <w:r>
+        <w:t xml:space="preserve"> er hvad der ender med at blive udskrevet til kunden, så vi kan tilføje ekstra detaljer som vi kommer til at skulle bruge senere i programmet. Nogle af disse detaljer kunne være hvor meget der er solgt indenfor en kategori, da vi kan udskrive et resume af resuméet. Så vi viser både et total mængde profit, men også en mere fuldendt version hvor man kan se hvilke produkter der har solgt mere end andre.</w:t>
+      </w:r>
+    </w:p>
+    <w:p>
+      <w:pPr>
+        <w:pStyle w:val="Overskrift2"/>
       </w:pPr>
       <w:r>
         <w:t xml:space="preserve">Sorterings </w:t>
@@ -1834,7 +2152,15 @@
     </w:p>
     <w:p>
       <w:r>
-        <w:t xml:space="preserve">Målet er at samle or sortere data, men det er ret komplekst problem. Det at sortere er et løst problem indenfor kode-verden, med mange forskellige måder at sortere på. Jeg har dog tænkt mig at bruge ”Insertion sort”. Det er nok den mest simple løsning, men det betyder ikke at den er dårlig. Insertion sort kigger ret simpelt på om et element er større eller mindre end den før. Hvis den er mindre, vil den bytte om på de to elementer. Det virker meget godt for små datamængder, men da den skal gå igennem hvert element, måske flere gange har den nogle skaleringsproblemer. Når jeg tænker på de salgs filer jeg har set er de ret lange, men indeholder oftest ikke alt for mange produkter. Vi snakker om måske 60 produkter i gennemsnit, og det er intet problem for Insertion sort. </w:t>
+        <w:t xml:space="preserve">Målet er at samle or sortere data, men det er ret komplekst problem. Det at sortere er et løst problem indenfor kode-verden, med mange forskellige måder at sortere på. Jeg har dog tænkt mig at bruge ”Insertion sort”. Det er nok den mest simple løsning, men det betyder ikke at den er dårlig. Insertion sort kigger ret simpelt på om et element er større eller mindre end den før. Hvis den er mindre, vil den bytte om på de to elementer. Det virker meget godt for små datamængder, men da den skal gå igennem hvert element, måske flere gange har den nogle skaleringsproblemer. Når jeg tænker på de salgs filer jeg har </w:t>
+      </w:r>
+      <w:proofErr w:type="gramStart"/>
+      <w:r>
+        <w:t>set</w:t>
+      </w:r>
+      <w:proofErr w:type="gramEnd"/>
+      <w:r>
+        <w:t xml:space="preserve"> er de ret lange, men indeholder oftest ikke alt for mange produkter. Vi snakker om måske 60 produkter i gennemsnit, og det er intet problem for Insertion sort. </w:t>
       </w:r>
     </w:p>
     <w:p>
@@ -1876,66 +2202,305 @@
     </w:p>
     <w:p>
       <w:pPr>
-        <w:pStyle w:val="Heading1"/>
+        <w:pStyle w:val="Overskrift1"/>
       </w:pPr>
       <w:r>
         <w:t>Teori</w:t>
       </w:r>
     </w:p>
     <w:p>
-      <w:pPr>
-        <w:pStyle w:val="Heading2"/>
+      <w:r>
+        <w:t xml:space="preserve">Ikke alle teknologier jeg har </w:t>
+      </w:r>
+      <w:proofErr w:type="gramStart"/>
+      <w:r>
+        <w:t>brugt</w:t>
+      </w:r>
+      <w:proofErr w:type="gramEnd"/>
+      <w:r>
+        <w:t xml:space="preserve"> er noget der er intuitivt, eller som de fleste programmører ville vide. Primært er der snakke om Regex, men også en custom </w:t>
+      </w:r>
+      <w:proofErr w:type="spellStart"/>
+      <w:r>
+        <w:t>hashing</w:t>
+      </w:r>
+      <w:proofErr w:type="spellEnd"/>
+      <w:r>
+        <w:t xml:space="preserve"> </w:t>
+      </w:r>
+      <w:proofErr w:type="spellStart"/>
+      <w:r>
+        <w:t>algorime</w:t>
+      </w:r>
+      <w:proofErr w:type="spellEnd"/>
+      <w:r>
+        <w:t>, som omdanner tekst til tal. Der er ikke noget specielt med den algoritme, men tankegangen er ret unik, og lidt svær at forstå bare ved at se koden, så vi forklarer det også her.</w:t>
+      </w:r>
+    </w:p>
+    <w:p>
+      <w:pPr>
+        <w:pStyle w:val="Overskrift2"/>
       </w:pPr>
       <w:r>
         <w:t>Regex</w:t>
       </w:r>
     </w:p>
-    <w:p/>
-    <w:p>
-      <w:pPr>
-        <w:pStyle w:val="Heading2"/>
-        <w:rPr>
-          <w:lang w:val="en-US"/>
-        </w:rPr>
-      </w:pPr>
-      <w:r>
-        <w:rPr>
-          <w:lang w:val="en-US"/>
-        </w:rPr>
-        <w:t xml:space="preserve">Valley </w:t>
+    <w:p>
+      <w:r>
+        <w:t xml:space="preserve">Regex er noget nogle programmører har hørt om. Men det er noget som de færreste </w:t>
+      </w:r>
+      <w:proofErr w:type="gramStart"/>
+      <w:r>
+        <w:t>ren</w:t>
+      </w:r>
+      <w:proofErr w:type="gramEnd"/>
+      <w:r>
+        <w:t xml:space="preserve"> faktisk forstår. Da det er en stor del af mit </w:t>
+      </w:r>
+      <w:proofErr w:type="gramStart"/>
+      <w:r>
+        <w:t>program</w:t>
+      </w:r>
+      <w:proofErr w:type="gramEnd"/>
+      <w:r>
+        <w:t xml:space="preserve"> har jeg skulle blive en ekspert på området. Det har indebåret at lære syntax, læse </w:t>
+      </w:r>
+      <w:proofErr w:type="gramStart"/>
+      <w:r>
+        <w:t>massere</w:t>
+      </w:r>
+      <w:proofErr w:type="gramEnd"/>
+      <w:r>
+        <w:t xml:space="preserve"> af Regex, og lære at skrive dem selv. Samt tænke på hvad Regex Engine gør, og hvordan man </w:t>
+      </w:r>
+      <w:proofErr w:type="gramStart"/>
+      <w:r>
+        <w:t>optimere</w:t>
+      </w:r>
+      <w:proofErr w:type="gramEnd"/>
+      <w:r>
+        <w:t xml:space="preserve"> dem. </w:t>
+      </w:r>
+    </w:p>
+    <w:p>
+      <w:pPr>
+        <w:pStyle w:val="Overskrift3"/>
+      </w:pPr>
+      <w:r>
+        <w:t>Min brug af regex opsummeret</w:t>
+      </w:r>
+    </w:p>
+    <w:p>
+      <w:r>
+        <w:t xml:space="preserve">Men hvorfor skrive dem selv, i stedet for at bruge AI til at skrive dem for en? Hvis man kun skal bruge simple ting, kunne man sagtens bruge AI til at lave ens Regex Expressions, men når det bliver </w:t>
+      </w:r>
+      <w:proofErr w:type="gramStart"/>
+      <w:r>
+        <w:t>komplekst</w:t>
+      </w:r>
+      <w:proofErr w:type="gramEnd"/>
+      <w:r>
+        <w:t xml:space="preserve"> kan det være svært at skrive alle de forskellige cases som den skal indebære, i prompts. Et eksempel på en kompleks regex kunne være denne. </w:t>
+      </w:r>
+      <w:r>
+        <w:br/>
+      </w:r>
+      <w:r>
+        <w:t>”</w:t>
+      </w:r>
+      <w:r>
+        <w:rPr>
+          <w:highlight w:val="yellow"/>
+        </w:rPr>
+        <w:t>^([^0-9]*)[^A-z0-9]*(([0-9]*)([^0-9]*?)([0-</w:t>
+      </w:r>
+      <w:proofErr w:type="gramStart"/>
+      <w:r>
+        <w:rPr>
+          <w:highlight w:val="yellow"/>
+        </w:rPr>
+        <w:t>9]*))(</w:t>
+      </w:r>
+      <w:proofErr w:type="gramEnd"/>
+      <w:r>
+        <w:rPr>
+          <w:highlight w:val="yellow"/>
+        </w:rPr>
+        <w:t>[^0-</w:t>
+      </w:r>
+      <w:proofErr w:type="gramStart"/>
+      <w:r>
+        <w:rPr>
+          <w:highlight w:val="yellow"/>
+        </w:rPr>
+        <w:t>9]*?)(</w:t>
+      </w:r>
+      <w:proofErr w:type="gramEnd"/>
+      <w:r>
+        <w:rPr>
+          <w:highlight w:val="yellow"/>
+        </w:rPr>
+        <w:t>([0-</w:t>
+      </w:r>
+      <w:proofErr w:type="gramStart"/>
+      <w:r>
+        <w:rPr>
+          <w:highlight w:val="yellow"/>
+        </w:rPr>
+        <w:t>9]*)(</w:t>
+      </w:r>
+      <w:proofErr w:type="gramEnd"/>
+      <w:r>
+        <w:rPr>
+          <w:highlight w:val="yellow"/>
+        </w:rPr>
+        <w:t>[^0-</w:t>
+      </w:r>
+      <w:proofErr w:type="gramStart"/>
+      <w:r>
+        <w:rPr>
+          <w:highlight w:val="yellow"/>
+        </w:rPr>
+        <w:t>9]*</w:t>
+      </w:r>
+      <w:proofErr w:type="gramEnd"/>
+      <w:r>
+        <w:rPr>
+          <w:highlight w:val="yellow"/>
+        </w:rPr>
+        <w:t>?)([0-9]*))[^0-9]*$</w:t>
+      </w:r>
+      <w:r>
+        <w:t>”</w:t>
+      </w:r>
+      <w:r>
+        <w:t xml:space="preserve"> Den er meget lang, og indeholder mange af de samme elementer, men når der står 0-9 kan det betyde flere ting, angående hvad der er før eller efter. </w:t>
+      </w:r>
+      <w:r>
+        <w:t xml:space="preserve">En AI kunne måske skrive denne regex, men den bruges meget i mit program, hvor jeg kalder på forskellige dele af den flere gange, så det ville ikke bare være at bruge AI til at lave sådan en Regex. Men det ville også kræve AI hver </w:t>
+      </w:r>
+      <w:r>
+        <w:lastRenderedPageBreak/>
+        <w:t>gang man skulle bruge den, eller hver gang man skulle debugge den. Det fact, sammen med min ”anti-ai” tilgang gjorde at jeg valgte at lære Regex fra bunden af, i stedet for at være afhængig af en AI.</w:t>
+      </w:r>
+    </w:p>
+    <w:p>
+      <w:r>
+        <w:t xml:space="preserve">Men hvordan ser det ud i det større sammenhæng? Mit program skal være brugbart for dem hos GoFact, og det betyder at andre programmører skal kunne læse og forstå min regex. For at sørge for at det er nemmere for andre at læse min Regex, har jeg prøvet at gøre den mere ”begynder” venlig, uden at komprimere på performance. </w:t>
+      </w:r>
+      <w:r>
+        <w:t>Meget af den regex kunne have været ”simplificeret” ved at bruge \d \D og \W.</w:t>
+      </w:r>
+      <w:r>
+        <w:t xml:space="preserve"> Men det er forkortelser for hvad regex søger på. Hvis man ikke ved hvad de står </w:t>
+      </w:r>
+      <w:proofErr w:type="gramStart"/>
+      <w:r>
+        <w:t>for</w:t>
+      </w:r>
+      <w:proofErr w:type="gramEnd"/>
+      <w:r>
+        <w:t xml:space="preserve"> kan det føles umuligt at forstå. Forskellen på \d og \D er også kæmpe (bogstaveligt talt modsat), men de kan se ens ud til nogen der ikke ved det. Jeg har dermed valgt at bruge hvad de symboler står for, i stedet for at bruge symbolerne selv. Jeg ved at de bruger Regex ude hos GoFact, men jeg ved også at ingen af dem kan lide at bruge det, og ved bare det minimum de skal for at kunne bruge det. Det er blandt andet også derfor </w:t>
+      </w:r>
+      <w:proofErr w:type="gramStart"/>
+      <w:r>
+        <w:t>at jeg</w:t>
+      </w:r>
+      <w:proofErr w:type="gramEnd"/>
+      <w:r>
+        <w:t xml:space="preserve"> har valgt at skrive den med [0-9] i stedet for [\d]. </w:t>
+      </w:r>
+    </w:p>
+    <w:p>
+      <w:pPr>
+        <w:pStyle w:val="Overskrift3"/>
+      </w:pPr>
+      <w:r>
+        <w:t xml:space="preserve">Optimering af regex  </w:t>
+      </w:r>
+    </w:p>
+    <w:p>
+      <w:r>
+        <w:t xml:space="preserve">Når man bruger regex, kan det enden være meget hurtigt, eller meget langsomt. Det kan føles lidt som en 50/50 en gang imellem, hvis man ikke forstår hvad der sker. </w:t>
+      </w:r>
+      <w:r>
+        <w:t xml:space="preserve">For mit brug af Regex, kræver det at jeg </w:t>
+      </w:r>
+      <w:proofErr w:type="gramStart"/>
+      <w:r>
+        <w:t>optimere</w:t>
+      </w:r>
+      <w:proofErr w:type="gramEnd"/>
+      <w:r>
+        <w:t xml:space="preserve"> dem så meget som muligt. </w:t>
+      </w:r>
+    </w:p>
+    <w:p>
+      <w:r>
+        <w:t xml:space="preserve">Når man snakker om regex optimering handler det primært om at sørge for at man ikke kører mange små regex queries. Grunden til dette er at der er noget overhead i at starte Regex Engine. (Regex Engine er hvad der kører regex bag scenen). Hver gang man kalder </w:t>
+      </w:r>
+      <w:proofErr w:type="gramStart"/>
+      <w:r>
+        <w:t>en .Match</w:t>
+      </w:r>
+      <w:proofErr w:type="gramEnd"/>
+      <w:r>
+        <w:t xml:space="preserve">() </w:t>
+      </w:r>
+      <w:proofErr w:type="gramStart"/>
+      <w:r>
+        <w:t>eller .IsMatch</w:t>
+      </w:r>
+      <w:proofErr w:type="gramEnd"/>
+      <w:r>
+        <w:t xml:space="preserve">() på regex kræver det at ens computer </w:t>
+      </w:r>
+      <w:proofErr w:type="gramStart"/>
+      <w:r>
+        <w:t>allokere</w:t>
+      </w:r>
+      <w:proofErr w:type="gramEnd"/>
+      <w:r>
+        <w:t xml:space="preserve"> hukommelse, og den laver en del funktion kald bag scenen. Dette er oftest ikke et stort problem hvis man kalder dem få gange, men hvis man kan optimere 100 kald ned til 10 eller 1, ville man se en stor forskel på længden.</w:t>
+      </w:r>
+    </w:p>
+    <w:p>
+      <w:r>
+        <w:t xml:space="preserve">En måde man kan sørge for at man ikke skal køre mange forskellige regex kald på, er ved at samle flere expressions til 1, ved hjælp af ”|” symbolet. Den gør det samme som i programmering, og betyder ”or”. Så man siger ”passer mønster </w:t>
+      </w:r>
+      <w:proofErr w:type="gramStart"/>
+      <w:r>
+        <w:t>1 ,</w:t>
+      </w:r>
+      <w:proofErr w:type="gramEnd"/>
+      <w:r>
+        <w:t xml:space="preserve"> eller mønster 2”. Man skulle tænke at det ville være det samme, hvor den kører mønster 1 igennem først, og dernæst mønster 2. Men i virkeligheden tjekker den begge mønstre igennem på første gang.</w:t>
+      </w:r>
+    </w:p>
+    <w:p>
+      <w:r>
+        <w:t xml:space="preserve">Der meget af Regex’ tid kan blive brugt, er ved at lave hvad man kalder for ”backtracking”, som betyder at den løb ned af den ”blind gyde” og skulle gå lidt tilbage igen for at kunne fortsætte. </w:t>
+      </w:r>
+      <w:r>
+        <w:t xml:space="preserve">Disse kan ske meget ofte hvis man ikke passer på, og det er den anden primære optimerings metode man har i regex. </w:t>
+      </w:r>
+    </w:p>
+    <w:p>
+      <w:pPr>
+        <w:pStyle w:val="Overskrift2"/>
+      </w:pPr>
+      <w:r>
+        <w:t xml:space="preserve">Valley af Tal / Custom </w:t>
       </w:r>
       <w:proofErr w:type="spellStart"/>
       <w:r>
-        <w:rPr>
-          <w:lang w:val="en-US"/>
-        </w:rPr>
-        <w:t>af</w:t>
+        <w:t>Hasing</w:t>
       </w:r>
       <w:proofErr w:type="spellEnd"/>
-      <w:r>
-        <w:rPr>
-          <w:lang w:val="en-US"/>
-        </w:rPr>
-        <w:t xml:space="preserve"> Tal / Custom </w:t>
-      </w:r>
-      <w:proofErr w:type="spellStart"/>
-      <w:r>
-        <w:rPr>
-          <w:lang w:val="en-US"/>
-        </w:rPr>
-        <w:t>Has</w:t>
-      </w:r>
-      <w:r>
-        <w:rPr>
-          <w:lang w:val="en-US"/>
-        </w:rPr>
-        <w:t>ing</w:t>
-      </w:r>
-      <w:proofErr w:type="spellEnd"/>
-    </w:p>
-    <w:p>
-      <w:pPr>
-        <w:pStyle w:val="ListParagraph"/>
+    </w:p>
+    <w:p>
+      <w:pPr>
+        <w:pStyle w:val="Listeafsnit"/>
         <w:numPr>
           <w:ilvl w:val="0"/>
           <w:numId w:val="1"/>
@@ -1953,7 +2518,7 @@
     </w:p>
     <w:p>
       <w:pPr>
-        <w:pStyle w:val="ListParagraph"/>
+        <w:pStyle w:val="Listeafsnit"/>
         <w:numPr>
           <w:ilvl w:val="0"/>
           <w:numId w:val="1"/>
@@ -1966,12 +2531,13 @@
         <w:rPr>
           <w:lang w:val="en-US"/>
         </w:rPr>
+        <w:lastRenderedPageBreak/>
         <w:t>Determinism</w:t>
       </w:r>
     </w:p>
     <w:p>
       <w:pPr>
-        <w:pStyle w:val="ListParagraph"/>
+        <w:pStyle w:val="Listeafsnit"/>
         <w:numPr>
           <w:ilvl w:val="0"/>
           <w:numId w:val="1"/>
@@ -1989,7 +2555,7 @@
     </w:p>
     <w:p>
       <w:pPr>
-        <w:pStyle w:val="ListParagraph"/>
+        <w:pStyle w:val="Listeafsnit"/>
         <w:numPr>
           <w:ilvl w:val="0"/>
           <w:numId w:val="1"/>
@@ -2049,7 +2615,7 @@
     </w:p>
     <w:p>
       <w:pPr>
-        <w:pStyle w:val="ListParagraph"/>
+        <w:pStyle w:val="Listeafsnit"/>
         <w:numPr>
           <w:ilvl w:val="0"/>
           <w:numId w:val="1"/>
@@ -2101,7 +2667,7 @@
     </w:p>
     <w:p>
       <w:pPr>
-        <w:pStyle w:val="Heading1"/>
+        <w:pStyle w:val="Overskrift1"/>
       </w:pPr>
       <w:r>
         <w:lastRenderedPageBreak/>
@@ -2137,7 +2703,7 @@
     </w:p>
     <w:p>
       <w:pPr>
-        <w:pStyle w:val="ListParagraph"/>
+        <w:pStyle w:val="Listeafsnit"/>
         <w:numPr>
           <w:ilvl w:val="0"/>
           <w:numId w:val="1"/>
@@ -2155,7 +2721,7 @@
     </w:p>
     <w:p>
       <w:pPr>
-        <w:pStyle w:val="ListParagraph"/>
+        <w:pStyle w:val="Listeafsnit"/>
         <w:numPr>
           <w:ilvl w:val="1"/>
           <w:numId w:val="1"/>
@@ -2173,7 +2739,7 @@
     </w:p>
     <w:p>
       <w:pPr>
-        <w:pStyle w:val="ListParagraph"/>
+        <w:pStyle w:val="Listeafsnit"/>
         <w:numPr>
           <w:ilvl w:val="1"/>
           <w:numId w:val="1"/>
@@ -2191,7 +2757,7 @@
     </w:p>
     <w:p>
       <w:pPr>
-        <w:pStyle w:val="ListParagraph"/>
+        <w:pStyle w:val="Listeafsnit"/>
         <w:numPr>
           <w:ilvl w:val="1"/>
           <w:numId w:val="1"/>
@@ -2209,7 +2775,7 @@
     </w:p>
     <w:p>
       <w:pPr>
-        <w:pStyle w:val="ListParagraph"/>
+        <w:pStyle w:val="Listeafsnit"/>
         <w:numPr>
           <w:ilvl w:val="2"/>
           <w:numId w:val="1"/>
@@ -2233,7 +2799,7 @@
     </w:p>
     <w:p>
       <w:pPr>
-        <w:pStyle w:val="ListParagraph"/>
+        <w:pStyle w:val="Listeafsnit"/>
         <w:numPr>
           <w:ilvl w:val="2"/>
           <w:numId w:val="1"/>
@@ -2251,7 +2817,7 @@
     </w:p>
     <w:p>
       <w:pPr>
-        <w:pStyle w:val="ListParagraph"/>
+        <w:pStyle w:val="Listeafsnit"/>
         <w:numPr>
           <w:ilvl w:val="0"/>
           <w:numId w:val="1"/>
@@ -2269,7 +2835,7 @@
     </w:p>
     <w:p>
       <w:pPr>
-        <w:pStyle w:val="ListParagraph"/>
+        <w:pStyle w:val="Listeafsnit"/>
         <w:numPr>
           <w:ilvl w:val="2"/>
           <w:numId w:val="1"/>
@@ -2293,7 +2859,7 @@
     </w:p>
     <w:p>
       <w:pPr>
-        <w:pStyle w:val="ListParagraph"/>
+        <w:pStyle w:val="Listeafsnit"/>
         <w:numPr>
           <w:ilvl w:val="2"/>
           <w:numId w:val="1"/>
@@ -2311,7 +2877,7 @@
     </w:p>
     <w:p>
       <w:pPr>
-        <w:pStyle w:val="ListParagraph"/>
+        <w:pStyle w:val="Listeafsnit"/>
         <w:numPr>
           <w:ilvl w:val="0"/>
           <w:numId w:val="1"/>
@@ -2329,7 +2895,7 @@
     </w:p>
     <w:p>
       <w:pPr>
-        <w:pStyle w:val="ListParagraph"/>
+        <w:pStyle w:val="Listeafsnit"/>
         <w:numPr>
           <w:ilvl w:val="1"/>
           <w:numId w:val="1"/>
@@ -2347,7 +2913,7 @@
     </w:p>
     <w:p>
       <w:pPr>
-        <w:pStyle w:val="ListParagraph"/>
+        <w:pStyle w:val="Listeafsnit"/>
         <w:numPr>
           <w:ilvl w:val="1"/>
           <w:numId w:val="1"/>
@@ -2365,7 +2931,7 @@
     </w:p>
     <w:p>
       <w:pPr>
-        <w:pStyle w:val="ListParagraph"/>
+        <w:pStyle w:val="Listeafsnit"/>
         <w:numPr>
           <w:ilvl w:val="2"/>
           <w:numId w:val="1"/>
@@ -2389,7 +2955,7 @@
     </w:p>
     <w:p>
       <w:pPr>
-        <w:pStyle w:val="ListParagraph"/>
+        <w:pStyle w:val="Listeafsnit"/>
         <w:numPr>
           <w:ilvl w:val="2"/>
           <w:numId w:val="1"/>
@@ -2413,7 +2979,7 @@
     </w:p>
     <w:p>
       <w:pPr>
-        <w:pStyle w:val="ListParagraph"/>
+        <w:pStyle w:val="Listeafsnit"/>
         <w:numPr>
           <w:ilvl w:val="0"/>
           <w:numId w:val="1"/>
@@ -2442,7 +3008,7 @@
     </w:p>
     <w:p>
       <w:pPr>
-        <w:pStyle w:val="ListParagraph"/>
+        <w:pStyle w:val="Listeafsnit"/>
         <w:numPr>
           <w:ilvl w:val="1"/>
           <w:numId w:val="1"/>
@@ -2469,7 +3035,7 @@
     </w:p>
     <w:p>
       <w:pPr>
-        <w:pStyle w:val="ListParagraph"/>
+        <w:pStyle w:val="Listeafsnit"/>
         <w:numPr>
           <w:ilvl w:val="1"/>
           <w:numId w:val="1"/>
@@ -2496,7 +3062,7 @@
     </w:p>
     <w:p>
       <w:pPr>
-        <w:pStyle w:val="ListParagraph"/>
+        <w:pStyle w:val="Listeafsnit"/>
         <w:numPr>
           <w:ilvl w:val="1"/>
           <w:numId w:val="1"/>
@@ -2523,7 +3089,7 @@
     </w:p>
     <w:p>
       <w:pPr>
-        <w:pStyle w:val="ListParagraph"/>
+        <w:pStyle w:val="Listeafsnit"/>
         <w:numPr>
           <w:ilvl w:val="1"/>
           <w:numId w:val="1"/>
@@ -2548,7 +3114,7 @@
     </w:p>
     <w:p>
       <w:pPr>
-        <w:pStyle w:val="ListParagraph"/>
+        <w:pStyle w:val="Listeafsnit"/>
         <w:numPr>
           <w:ilvl w:val="2"/>
           <w:numId w:val="1"/>
@@ -2577,7 +3143,7 @@
     </w:p>
     <w:p>
       <w:pPr>
-        <w:pStyle w:val="ListParagraph"/>
+        <w:pStyle w:val="Listeafsnit"/>
         <w:numPr>
           <w:ilvl w:val="2"/>
           <w:numId w:val="1"/>
@@ -2606,7 +3172,7 @@
     </w:p>
     <w:p>
       <w:pPr>
-        <w:pStyle w:val="ListParagraph"/>
+        <w:pStyle w:val="Listeafsnit"/>
         <w:numPr>
           <w:ilvl w:val="0"/>
           <w:numId w:val="1"/>
@@ -2632,7 +3198,7 @@
     </w:p>
     <w:p>
       <w:pPr>
-        <w:pStyle w:val="ListParagraph"/>
+        <w:pStyle w:val="Listeafsnit"/>
         <w:numPr>
           <w:ilvl w:val="1"/>
           <w:numId w:val="1"/>
@@ -2654,7 +3220,7 @@
     </w:p>
     <w:p>
       <w:pPr>
-        <w:pStyle w:val="ListParagraph"/>
+        <w:pStyle w:val="Listeafsnit"/>
         <w:numPr>
           <w:ilvl w:val="2"/>
           <w:numId w:val="1"/>
@@ -2672,7 +3238,7 @@
     </w:p>
     <w:p>
       <w:pPr>
-        <w:pStyle w:val="ListParagraph"/>
+        <w:pStyle w:val="Listeafsnit"/>
         <w:numPr>
           <w:ilvl w:val="1"/>
           <w:numId w:val="1"/>
@@ -2694,7 +3260,7 @@
     </w:p>
     <w:p>
       <w:pPr>
-        <w:pStyle w:val="ListParagraph"/>
+        <w:pStyle w:val="Listeafsnit"/>
         <w:numPr>
           <w:ilvl w:val="1"/>
           <w:numId w:val="1"/>
@@ -2716,7 +3282,7 @@
     </w:p>
     <w:p>
       <w:pPr>
-        <w:pStyle w:val="ListParagraph"/>
+        <w:pStyle w:val="Listeafsnit"/>
         <w:numPr>
           <w:ilvl w:val="2"/>
           <w:numId w:val="1"/>
@@ -2734,7 +3300,7 @@
     </w:p>
     <w:p>
       <w:pPr>
-        <w:pStyle w:val="ListParagraph"/>
+        <w:pStyle w:val="Listeafsnit"/>
         <w:numPr>
           <w:ilvl w:val="2"/>
           <w:numId w:val="1"/>
@@ -2752,7 +3318,7 @@
     </w:p>
     <w:p>
       <w:pPr>
-        <w:pStyle w:val="ListParagraph"/>
+        <w:pStyle w:val="Listeafsnit"/>
         <w:numPr>
           <w:ilvl w:val="2"/>
           <w:numId w:val="1"/>
@@ -2787,7 +3353,7 @@
     </w:p>
     <w:p>
       <w:pPr>
-        <w:pStyle w:val="ListParagraph"/>
+        <w:pStyle w:val="Listeafsnit"/>
         <w:numPr>
           <w:ilvl w:val="0"/>
           <w:numId w:val="1"/>
@@ -2813,7 +3379,7 @@
     </w:p>
     <w:p>
       <w:pPr>
-        <w:pStyle w:val="ListParagraph"/>
+        <w:pStyle w:val="Listeafsnit"/>
         <w:numPr>
           <w:ilvl w:val="1"/>
           <w:numId w:val="1"/>
@@ -2831,7 +3397,7 @@
     </w:p>
     <w:p>
       <w:pPr>
-        <w:pStyle w:val="ListParagraph"/>
+        <w:pStyle w:val="Listeafsnit"/>
         <w:numPr>
           <w:ilvl w:val="1"/>
           <w:numId w:val="1"/>
@@ -2853,7 +3419,7 @@
     </w:p>
     <w:p>
       <w:pPr>
-        <w:pStyle w:val="ListParagraph"/>
+        <w:pStyle w:val="Listeafsnit"/>
         <w:numPr>
           <w:ilvl w:val="2"/>
           <w:numId w:val="1"/>
@@ -2876,7 +3442,7 @@
     </w:p>
     <w:p>
       <w:pPr>
-        <w:pStyle w:val="ListParagraph"/>
+        <w:pStyle w:val="Listeafsnit"/>
         <w:numPr>
           <w:ilvl w:val="0"/>
           <w:numId w:val="1"/>
@@ -2903,7 +3469,7 @@
     </w:p>
     <w:p>
       <w:pPr>
-        <w:pStyle w:val="ListParagraph"/>
+        <w:pStyle w:val="Listeafsnit"/>
         <w:numPr>
           <w:ilvl w:val="1"/>
           <w:numId w:val="1"/>
@@ -2925,7 +3491,7 @@
     </w:p>
     <w:p>
       <w:pPr>
-        <w:pStyle w:val="ListParagraph"/>
+        <w:pStyle w:val="Listeafsnit"/>
         <w:numPr>
           <w:ilvl w:val="1"/>
           <w:numId w:val="1"/>
@@ -2943,7 +3509,7 @@
     </w:p>
     <w:p>
       <w:pPr>
-        <w:pStyle w:val="ListParagraph"/>
+        <w:pStyle w:val="Listeafsnit"/>
         <w:numPr>
           <w:ilvl w:val="1"/>
           <w:numId w:val="1"/>
@@ -2965,14 +3531,22 @@
     </w:p>
     <w:p>
       <w:pPr>
-        <w:pStyle w:val="ListParagraph"/>
+        <w:pStyle w:val="Listeafsnit"/>
         <w:numPr>
           <w:ilvl w:val="2"/>
           <w:numId w:val="1"/>
         </w:numPr>
       </w:pPr>
       <w:r>
-        <w:t>Men ikke teori om mønstre (med mindre de er nye).</w:t>
+        <w:t>Men ikke teori om mønstre (</w:t>
+      </w:r>
+      <w:proofErr w:type="gramStart"/>
+      <w:r>
+        <w:t>med mindre</w:t>
+      </w:r>
+      <w:proofErr w:type="gramEnd"/>
+      <w:r>
+        <w:t xml:space="preserve"> de er nye).</w:t>
       </w:r>
       <w:r>
         <w:rPr>
@@ -2983,7 +3557,7 @@
     </w:p>
     <w:p>
       <w:pPr>
-        <w:pStyle w:val="ListParagraph"/>
+        <w:pStyle w:val="Listeafsnit"/>
         <w:numPr>
           <w:ilvl w:val="1"/>
           <w:numId w:val="1"/>
@@ -3009,7 +3583,7 @@
     </w:p>
     <w:p>
       <w:pPr>
-        <w:pStyle w:val="ListParagraph"/>
+        <w:pStyle w:val="Listeafsnit"/>
         <w:numPr>
           <w:ilvl w:val="2"/>
           <w:numId w:val="1"/>
@@ -3035,7 +3609,7 @@
     </w:p>
     <w:p>
       <w:pPr>
-        <w:pStyle w:val="ListParagraph"/>
+        <w:pStyle w:val="Listeafsnit"/>
         <w:numPr>
           <w:ilvl w:val="0"/>
           <w:numId w:val="1"/>
@@ -3061,7 +3635,7 @@
     </w:p>
     <w:p>
       <w:pPr>
-        <w:pStyle w:val="ListParagraph"/>
+        <w:pStyle w:val="Listeafsnit"/>
         <w:numPr>
           <w:ilvl w:val="1"/>
           <w:numId w:val="1"/>
@@ -3079,7 +3653,7 @@
     </w:p>
     <w:p>
       <w:pPr>
-        <w:pStyle w:val="ListParagraph"/>
+        <w:pStyle w:val="Listeafsnit"/>
         <w:numPr>
           <w:ilvl w:val="1"/>
           <w:numId w:val="1"/>
@@ -3097,7 +3671,7 @@
     </w:p>
     <w:p>
       <w:pPr>
-        <w:pStyle w:val="ListParagraph"/>
+        <w:pStyle w:val="Listeafsnit"/>
         <w:numPr>
           <w:ilvl w:val="2"/>
           <w:numId w:val="1"/>
@@ -3123,7 +3697,7 @@
     </w:p>
     <w:p>
       <w:pPr>
-        <w:pStyle w:val="ListParagraph"/>
+        <w:pStyle w:val="Listeafsnit"/>
         <w:numPr>
           <w:ilvl w:val="0"/>
           <w:numId w:val="1"/>
@@ -3147,7 +3721,7 @@
     </w:p>
     <w:p>
       <w:pPr>
-        <w:pStyle w:val="ListParagraph"/>
+        <w:pStyle w:val="Listeafsnit"/>
         <w:numPr>
           <w:ilvl w:val="1"/>
           <w:numId w:val="1"/>
@@ -3159,7 +3733,7 @@
     </w:p>
     <w:p>
       <w:pPr>
-        <w:pStyle w:val="ListParagraph"/>
+        <w:pStyle w:val="Listeafsnit"/>
         <w:numPr>
           <w:ilvl w:val="1"/>
           <w:numId w:val="1"/>
@@ -3227,7 +3801,7 @@
     </w:p>
     <w:p>
       <w:pPr>
-        <w:pStyle w:val="ListParagraph"/>
+        <w:pStyle w:val="Listeafsnit"/>
         <w:numPr>
           <w:ilvl w:val="1"/>
           <w:numId w:val="1"/>
@@ -3295,7 +3869,7 @@
     </w:p>
     <w:p>
       <w:pPr>
-        <w:pStyle w:val="ListParagraph"/>
+        <w:pStyle w:val="Listeafsnit"/>
         <w:numPr>
           <w:ilvl w:val="1"/>
           <w:numId w:val="1"/>
@@ -3321,7 +3895,7 @@
     </w:p>
     <w:p>
       <w:pPr>
-        <w:pStyle w:val="ListParagraph"/>
+        <w:pStyle w:val="Listeafsnit"/>
         <w:numPr>
           <w:ilvl w:val="2"/>
           <w:numId w:val="1"/>
@@ -3353,7 +3927,7 @@
     </w:p>
     <w:p>
       <w:pPr>
-        <w:pStyle w:val="ListParagraph"/>
+        <w:pStyle w:val="Listeafsnit"/>
         <w:numPr>
           <w:ilvl w:val="2"/>
           <w:numId w:val="1"/>
@@ -3385,7 +3959,7 @@
     </w:p>
     <w:p>
       <w:pPr>
-        <w:pStyle w:val="ListParagraph"/>
+        <w:pStyle w:val="Listeafsnit"/>
         <w:numPr>
           <w:ilvl w:val="2"/>
           <w:numId w:val="1"/>
@@ -3417,7 +3991,7 @@
     </w:p>
     <w:p>
       <w:pPr>
-        <w:pStyle w:val="ListParagraph"/>
+        <w:pStyle w:val="Listeafsnit"/>
         <w:rPr>
           <w:lang w:val="en-US"/>
         </w:rPr>
@@ -3511,7 +4085,7 @@
     </w:p>
     <w:p>
       <w:pPr>
-        <w:pStyle w:val="Heading1"/>
+        <w:pStyle w:val="Overskrift1"/>
       </w:pPr>
       <w:r>
         <w:t>Noter til mig selv om rapport indhold</w:t>
@@ -3519,7 +4093,23 @@
     </w:p>
     <w:p>
       <w:r>
-        <w:t>Teori: Snak om Regex i sorteringen. Det er ny  teori som ikke er blevet nævnt i undervisningen. Gå i dybden om hvordan den læser og hvordan man optimere en Regex Expression.</w:t>
+        <w:t xml:space="preserve">Teori: Snak om Regex i sorteringen. Det er </w:t>
+      </w:r>
+      <w:proofErr w:type="gramStart"/>
+      <w:r>
+        <w:t>ny  teori</w:t>
+      </w:r>
+      <w:proofErr w:type="gramEnd"/>
+      <w:r>
+        <w:t xml:space="preserve"> som ikke er blevet nævnt i undervisningen. Gå i dybden om hvordan den læser og hvordan man </w:t>
+      </w:r>
+      <w:proofErr w:type="gramStart"/>
+      <w:r>
+        <w:t>optimere</w:t>
+      </w:r>
+      <w:proofErr w:type="gramEnd"/>
+      <w:r>
+        <w:t xml:space="preserve"> en Regex Expression.</w:t>
       </w:r>
     </w:p>
     <w:p>
@@ -6480,11 +7070,11 @@
     <w:name w:val="Normal"/>
     <w:qFormat/>
   </w:style>
-  <w:style w:type="paragraph" w:styleId="Heading1">
+  <w:style w:type="paragraph" w:styleId="Overskrift1">
     <w:name w:val="heading 1"/>
     <w:basedOn w:val="Normal"/>
     <w:next w:val="Normal"/>
-    <w:link w:val="Heading1Char"/>
+    <w:link w:val="Overskrift1Tegn"/>
     <w:uiPriority w:val="9"/>
     <w:qFormat/>
     <w:rsid w:val="0096029D"/>
@@ -6501,11 +7091,11 @@
       <w:szCs w:val="40"/>
     </w:rPr>
   </w:style>
-  <w:style w:type="paragraph" w:styleId="Heading2">
+  <w:style w:type="paragraph" w:styleId="Overskrift2">
     <w:name w:val="heading 2"/>
     <w:basedOn w:val="Normal"/>
     <w:next w:val="Normal"/>
-    <w:link w:val="Heading2Char"/>
+    <w:link w:val="Overskrift2Tegn"/>
     <w:uiPriority w:val="9"/>
     <w:unhideWhenUsed/>
     <w:qFormat/>
@@ -6523,11 +7113,11 @@
       <w:szCs w:val="32"/>
     </w:rPr>
   </w:style>
-  <w:style w:type="paragraph" w:styleId="Heading3">
+  <w:style w:type="paragraph" w:styleId="Overskrift3">
     <w:name w:val="heading 3"/>
     <w:basedOn w:val="Normal"/>
     <w:next w:val="Normal"/>
-    <w:link w:val="Heading3Char"/>
+    <w:link w:val="Overskrift3Tegn"/>
     <w:uiPriority w:val="9"/>
     <w:unhideWhenUsed/>
     <w:qFormat/>
@@ -6545,11 +7135,11 @@
       <w:szCs w:val="28"/>
     </w:rPr>
   </w:style>
-  <w:style w:type="paragraph" w:styleId="Heading4">
+  <w:style w:type="paragraph" w:styleId="Overskrift4">
     <w:name w:val="heading 4"/>
     <w:basedOn w:val="Normal"/>
     <w:next w:val="Normal"/>
-    <w:link w:val="Heading4Char"/>
+    <w:link w:val="Overskrift4Tegn"/>
     <w:uiPriority w:val="9"/>
     <w:semiHidden/>
     <w:unhideWhenUsed/>
@@ -6568,11 +7158,11 @@
       <w:color w:val="0F4761" w:themeColor="accent1" w:themeShade="BF"/>
     </w:rPr>
   </w:style>
-  <w:style w:type="paragraph" w:styleId="Heading5">
+  <w:style w:type="paragraph" w:styleId="Overskrift5">
     <w:name w:val="heading 5"/>
     <w:basedOn w:val="Normal"/>
     <w:next w:val="Normal"/>
-    <w:link w:val="Heading5Char"/>
+    <w:link w:val="Overskrift5Tegn"/>
     <w:uiPriority w:val="9"/>
     <w:semiHidden/>
     <w:unhideWhenUsed/>
@@ -6589,11 +7179,11 @@
       <w:color w:val="0F4761" w:themeColor="accent1" w:themeShade="BF"/>
     </w:rPr>
   </w:style>
-  <w:style w:type="paragraph" w:styleId="Heading6">
+  <w:style w:type="paragraph" w:styleId="Overskrift6">
     <w:name w:val="heading 6"/>
     <w:basedOn w:val="Normal"/>
     <w:next w:val="Normal"/>
-    <w:link w:val="Heading6Char"/>
+    <w:link w:val="Overskrift6Tegn"/>
     <w:uiPriority w:val="9"/>
     <w:semiHidden/>
     <w:unhideWhenUsed/>
@@ -6612,11 +7202,11 @@
       <w:color w:val="595959" w:themeColor="text1" w:themeTint="A6"/>
     </w:rPr>
   </w:style>
-  <w:style w:type="paragraph" w:styleId="Heading7">
+  <w:style w:type="paragraph" w:styleId="Overskrift7">
     <w:name w:val="heading 7"/>
     <w:basedOn w:val="Normal"/>
     <w:next w:val="Normal"/>
-    <w:link w:val="Heading7Char"/>
+    <w:link w:val="Overskrift7Tegn"/>
     <w:uiPriority w:val="9"/>
     <w:semiHidden/>
     <w:unhideWhenUsed/>
@@ -6633,11 +7223,11 @@
       <w:color w:val="595959" w:themeColor="text1" w:themeTint="A6"/>
     </w:rPr>
   </w:style>
-  <w:style w:type="paragraph" w:styleId="Heading8">
+  <w:style w:type="paragraph" w:styleId="Overskrift8">
     <w:name w:val="heading 8"/>
     <w:basedOn w:val="Normal"/>
     <w:next w:val="Normal"/>
-    <w:link w:val="Heading8Char"/>
+    <w:link w:val="Overskrift8Tegn"/>
     <w:uiPriority w:val="9"/>
     <w:semiHidden/>
     <w:unhideWhenUsed/>
@@ -6656,11 +7246,11 @@
       <w:color w:val="272727" w:themeColor="text1" w:themeTint="D8"/>
     </w:rPr>
   </w:style>
-  <w:style w:type="paragraph" w:styleId="Heading9">
+  <w:style w:type="paragraph" w:styleId="Overskrift9">
     <w:name w:val="heading 9"/>
     <w:basedOn w:val="Normal"/>
     <w:next w:val="Normal"/>
-    <w:link w:val="Heading9Char"/>
+    <w:link w:val="Overskrift9Tegn"/>
     <w:uiPriority w:val="9"/>
     <w:semiHidden/>
     <w:unhideWhenUsed/>
@@ -6677,13 +7267,12 @@
       <w:color w:val="272727" w:themeColor="text1" w:themeTint="D8"/>
     </w:rPr>
   </w:style>
-  <w:style w:type="character" w:default="1" w:styleId="DefaultParagraphFont">
+  <w:style w:type="character" w:default="1" w:styleId="Standardskrifttypeiafsnit">
     <w:name w:val="Default Paragraph Font"/>
     <w:uiPriority w:val="1"/>
-    <w:semiHidden/>
     <w:unhideWhenUsed/>
   </w:style>
-  <w:style w:type="table" w:default="1" w:styleId="TableNormal">
+  <w:style w:type="table" w:default="1" w:styleId="Tabel-Normal">
     <w:name w:val="Normal Table"/>
     <w:uiPriority w:val="99"/>
     <w:semiHidden/>
@@ -6698,16 +7287,16 @@
       </w:tblCellMar>
     </w:tblPr>
   </w:style>
-  <w:style w:type="numbering" w:default="1" w:styleId="NoList">
+  <w:style w:type="numbering" w:default="1" w:styleId="Ingenoversigt">
     <w:name w:val="No List"/>
     <w:uiPriority w:val="99"/>
     <w:semiHidden/>
     <w:unhideWhenUsed/>
   </w:style>
-  <w:style w:type="character" w:customStyle="1" w:styleId="Heading1Char">
-    <w:name w:val="Heading 1 Char"/>
-    <w:basedOn w:val="DefaultParagraphFont"/>
-    <w:link w:val="Heading1"/>
+  <w:style w:type="character" w:customStyle="1" w:styleId="Overskrift1Tegn">
+    <w:name w:val="Overskrift 1 Tegn"/>
+    <w:basedOn w:val="Standardskrifttypeiafsnit"/>
+    <w:link w:val="Overskrift1"/>
     <w:uiPriority w:val="9"/>
     <w:rsid w:val="0096029D"/>
     <w:rPr>
@@ -6717,10 +7306,10 @@
       <w:szCs w:val="40"/>
     </w:rPr>
   </w:style>
-  <w:style w:type="character" w:customStyle="1" w:styleId="Heading2Char">
-    <w:name w:val="Heading 2 Char"/>
-    <w:basedOn w:val="DefaultParagraphFont"/>
-    <w:link w:val="Heading2"/>
+  <w:style w:type="character" w:customStyle="1" w:styleId="Overskrift2Tegn">
+    <w:name w:val="Overskrift 2 Tegn"/>
+    <w:basedOn w:val="Standardskrifttypeiafsnit"/>
+    <w:link w:val="Overskrift2"/>
     <w:uiPriority w:val="9"/>
     <w:rsid w:val="0096029D"/>
     <w:rPr>
@@ -6730,10 +7319,10 @@
       <w:szCs w:val="32"/>
     </w:rPr>
   </w:style>
-  <w:style w:type="character" w:customStyle="1" w:styleId="Heading3Char">
-    <w:name w:val="Heading 3 Char"/>
-    <w:basedOn w:val="DefaultParagraphFont"/>
-    <w:link w:val="Heading3"/>
+  <w:style w:type="character" w:customStyle="1" w:styleId="Overskrift3Tegn">
+    <w:name w:val="Overskrift 3 Tegn"/>
+    <w:basedOn w:val="Standardskrifttypeiafsnit"/>
+    <w:link w:val="Overskrift3"/>
     <w:uiPriority w:val="9"/>
     <w:rsid w:val="0096029D"/>
     <w:rPr>
@@ -6743,10 +7332,10 @@
       <w:szCs w:val="28"/>
     </w:rPr>
   </w:style>
-  <w:style w:type="character" w:customStyle="1" w:styleId="Heading4Char">
-    <w:name w:val="Heading 4 Char"/>
-    <w:basedOn w:val="DefaultParagraphFont"/>
-    <w:link w:val="Heading4"/>
+  <w:style w:type="character" w:customStyle="1" w:styleId="Overskrift4Tegn">
+    <w:name w:val="Overskrift 4 Tegn"/>
+    <w:basedOn w:val="Standardskrifttypeiafsnit"/>
+    <w:link w:val="Overskrift4"/>
     <w:uiPriority w:val="9"/>
     <w:semiHidden/>
     <w:rsid w:val="0096029D"/>
@@ -6757,10 +7346,10 @@
       <w:color w:val="0F4761" w:themeColor="accent1" w:themeShade="BF"/>
     </w:rPr>
   </w:style>
-  <w:style w:type="character" w:customStyle="1" w:styleId="Heading5Char">
-    <w:name w:val="Heading 5 Char"/>
-    <w:basedOn w:val="DefaultParagraphFont"/>
-    <w:link w:val="Heading5"/>
+  <w:style w:type="character" w:customStyle="1" w:styleId="Overskrift5Tegn">
+    <w:name w:val="Overskrift 5 Tegn"/>
+    <w:basedOn w:val="Standardskrifttypeiafsnit"/>
+    <w:link w:val="Overskrift5"/>
     <w:uiPriority w:val="9"/>
     <w:semiHidden/>
     <w:rsid w:val="0096029D"/>
@@ -6769,10 +7358,10 @@
       <w:color w:val="0F4761" w:themeColor="accent1" w:themeShade="BF"/>
     </w:rPr>
   </w:style>
-  <w:style w:type="character" w:customStyle="1" w:styleId="Heading6Char">
-    <w:name w:val="Heading 6 Char"/>
-    <w:basedOn w:val="DefaultParagraphFont"/>
-    <w:link w:val="Heading6"/>
+  <w:style w:type="character" w:customStyle="1" w:styleId="Overskrift6Tegn">
+    <w:name w:val="Overskrift 6 Tegn"/>
+    <w:basedOn w:val="Standardskrifttypeiafsnit"/>
+    <w:link w:val="Overskrift6"/>
     <w:uiPriority w:val="9"/>
     <w:semiHidden/>
     <w:rsid w:val="0096029D"/>
@@ -6783,10 +7372,10 @@
       <w:color w:val="595959" w:themeColor="text1" w:themeTint="A6"/>
     </w:rPr>
   </w:style>
-  <w:style w:type="character" w:customStyle="1" w:styleId="Heading7Char">
-    <w:name w:val="Heading 7 Char"/>
-    <w:basedOn w:val="DefaultParagraphFont"/>
-    <w:link w:val="Heading7"/>
+  <w:style w:type="character" w:customStyle="1" w:styleId="Overskrift7Tegn">
+    <w:name w:val="Overskrift 7 Tegn"/>
+    <w:basedOn w:val="Standardskrifttypeiafsnit"/>
+    <w:link w:val="Overskrift7"/>
     <w:uiPriority w:val="9"/>
     <w:semiHidden/>
     <w:rsid w:val="0096029D"/>
@@ -6795,10 +7384,10 @@
       <w:color w:val="595959" w:themeColor="text1" w:themeTint="A6"/>
     </w:rPr>
   </w:style>
-  <w:style w:type="character" w:customStyle="1" w:styleId="Heading8Char">
-    <w:name w:val="Heading 8 Char"/>
-    <w:basedOn w:val="DefaultParagraphFont"/>
-    <w:link w:val="Heading8"/>
+  <w:style w:type="character" w:customStyle="1" w:styleId="Overskrift8Tegn">
+    <w:name w:val="Overskrift 8 Tegn"/>
+    <w:basedOn w:val="Standardskrifttypeiafsnit"/>
+    <w:link w:val="Overskrift8"/>
     <w:uiPriority w:val="9"/>
     <w:semiHidden/>
     <w:rsid w:val="0096029D"/>
@@ -6809,10 +7398,10 @@
       <w:color w:val="272727" w:themeColor="text1" w:themeTint="D8"/>
     </w:rPr>
   </w:style>
-  <w:style w:type="character" w:customStyle="1" w:styleId="Heading9Char">
-    <w:name w:val="Heading 9 Char"/>
-    <w:basedOn w:val="DefaultParagraphFont"/>
-    <w:link w:val="Heading9"/>
+  <w:style w:type="character" w:customStyle="1" w:styleId="Overskrift9Tegn">
+    <w:name w:val="Overskrift 9 Tegn"/>
+    <w:basedOn w:val="Standardskrifttypeiafsnit"/>
+    <w:link w:val="Overskrift9"/>
     <w:uiPriority w:val="9"/>
     <w:semiHidden/>
     <w:rsid w:val="0096029D"/>
@@ -6821,11 +7410,11 @@
       <w:color w:val="272727" w:themeColor="text1" w:themeTint="D8"/>
     </w:rPr>
   </w:style>
-  <w:style w:type="paragraph" w:styleId="Title">
+  <w:style w:type="paragraph" w:styleId="Titel">
     <w:name w:val="Title"/>
     <w:basedOn w:val="Normal"/>
     <w:next w:val="Normal"/>
-    <w:link w:val="TitleChar"/>
+    <w:link w:val="TitelTegn"/>
     <w:uiPriority w:val="10"/>
     <w:qFormat/>
     <w:rsid w:val="0096029D"/>
@@ -6841,10 +7430,10 @@
       <w:szCs w:val="56"/>
     </w:rPr>
   </w:style>
-  <w:style w:type="character" w:customStyle="1" w:styleId="TitleChar">
-    <w:name w:val="Title Char"/>
-    <w:basedOn w:val="DefaultParagraphFont"/>
-    <w:link w:val="Title"/>
+  <w:style w:type="character" w:customStyle="1" w:styleId="TitelTegn">
+    <w:name w:val="Titel Tegn"/>
+    <w:basedOn w:val="Standardskrifttypeiafsnit"/>
+    <w:link w:val="Titel"/>
     <w:uiPriority w:val="10"/>
     <w:rsid w:val="0096029D"/>
     <w:rPr>
@@ -6855,11 +7444,11 @@
       <w:szCs w:val="56"/>
     </w:rPr>
   </w:style>
-  <w:style w:type="paragraph" w:styleId="Subtitle">
+  <w:style w:type="paragraph" w:styleId="Undertitel">
     <w:name w:val="Subtitle"/>
     <w:basedOn w:val="Normal"/>
     <w:next w:val="Normal"/>
-    <w:link w:val="SubtitleChar"/>
+    <w:link w:val="UndertitelTegn"/>
     <w:uiPriority w:val="11"/>
     <w:qFormat/>
     <w:rsid w:val="0096029D"/>
@@ -6876,10 +7465,10 @@
       <w:szCs w:val="28"/>
     </w:rPr>
   </w:style>
-  <w:style w:type="character" w:customStyle="1" w:styleId="SubtitleChar">
-    <w:name w:val="Subtitle Char"/>
-    <w:basedOn w:val="DefaultParagraphFont"/>
-    <w:link w:val="Subtitle"/>
+  <w:style w:type="character" w:customStyle="1" w:styleId="UndertitelTegn">
+    <w:name w:val="Undertitel Tegn"/>
+    <w:basedOn w:val="Standardskrifttypeiafsnit"/>
+    <w:link w:val="Undertitel"/>
     <w:uiPriority w:val="11"/>
     <w:rsid w:val="0096029D"/>
     <w:rPr>
@@ -6890,11 +7479,11 @@
       <w:szCs w:val="28"/>
     </w:rPr>
   </w:style>
-  <w:style w:type="paragraph" w:styleId="Quote">
+  <w:style w:type="paragraph" w:styleId="Citat">
     <w:name w:val="Quote"/>
     <w:basedOn w:val="Normal"/>
     <w:next w:val="Normal"/>
-    <w:link w:val="QuoteChar"/>
+    <w:link w:val="CitatTegn"/>
     <w:uiPriority w:val="29"/>
     <w:qFormat/>
     <w:rsid w:val="0096029D"/>
@@ -6908,10 +7497,10 @@
       <w:color w:val="404040" w:themeColor="text1" w:themeTint="BF"/>
     </w:rPr>
   </w:style>
-  <w:style w:type="character" w:customStyle="1" w:styleId="QuoteChar">
-    <w:name w:val="Quote Char"/>
-    <w:basedOn w:val="DefaultParagraphFont"/>
-    <w:link w:val="Quote"/>
+  <w:style w:type="character" w:customStyle="1" w:styleId="CitatTegn">
+    <w:name w:val="Citat Tegn"/>
+    <w:basedOn w:val="Standardskrifttypeiafsnit"/>
+    <w:link w:val="Citat"/>
     <w:uiPriority w:val="29"/>
     <w:rsid w:val="0096029D"/>
     <w:rPr>
@@ -6920,7 +7509,7 @@
       <w:color w:val="404040" w:themeColor="text1" w:themeTint="BF"/>
     </w:rPr>
   </w:style>
-  <w:style w:type="paragraph" w:styleId="ListParagraph">
+  <w:style w:type="paragraph" w:styleId="Listeafsnit">
     <w:name w:val="List Paragraph"/>
     <w:basedOn w:val="Normal"/>
     <w:uiPriority w:val="34"/>
@@ -6931,9 +7520,9 @@
       <w:contextualSpacing/>
     </w:pPr>
   </w:style>
-  <w:style w:type="character" w:styleId="IntenseEmphasis">
+  <w:style w:type="character" w:styleId="Kraftigfremhvning">
     <w:name w:val="Intense Emphasis"/>
-    <w:basedOn w:val="DefaultParagraphFont"/>
+    <w:basedOn w:val="Standardskrifttypeiafsnit"/>
     <w:uiPriority w:val="21"/>
     <w:qFormat/>
     <w:rsid w:val="0096029D"/>
@@ -6943,11 +7532,11 @@
       <w:color w:val="0F4761" w:themeColor="accent1" w:themeShade="BF"/>
     </w:rPr>
   </w:style>
-  <w:style w:type="paragraph" w:styleId="IntenseQuote">
+  <w:style w:type="paragraph" w:styleId="Strktcitat">
     <w:name w:val="Intense Quote"/>
     <w:basedOn w:val="Normal"/>
     <w:next w:val="Normal"/>
-    <w:link w:val="IntenseQuoteChar"/>
+    <w:link w:val="StrktcitatTegn"/>
     <w:uiPriority w:val="30"/>
     <w:qFormat/>
     <w:rsid w:val="0096029D"/>
@@ -6966,10 +7555,10 @@
       <w:color w:val="0F4761" w:themeColor="accent1" w:themeShade="BF"/>
     </w:rPr>
   </w:style>
-  <w:style w:type="character" w:customStyle="1" w:styleId="IntenseQuoteChar">
-    <w:name w:val="Intense Quote Char"/>
-    <w:basedOn w:val="DefaultParagraphFont"/>
-    <w:link w:val="IntenseQuote"/>
+  <w:style w:type="character" w:customStyle="1" w:styleId="StrktcitatTegn">
+    <w:name w:val="Stærkt citat Tegn"/>
+    <w:basedOn w:val="Standardskrifttypeiafsnit"/>
+    <w:link w:val="Strktcitat"/>
     <w:uiPriority w:val="30"/>
     <w:rsid w:val="0096029D"/>
     <w:rPr>
@@ -6978,9 +7567,9 @@
       <w:color w:val="0F4761" w:themeColor="accent1" w:themeShade="BF"/>
     </w:rPr>
   </w:style>
-  <w:style w:type="character" w:styleId="IntenseReference">
+  <w:style w:type="character" w:styleId="Kraftighenvisning">
     <w:name w:val="Intense Reference"/>
-    <w:basedOn w:val="DefaultParagraphFont"/>
+    <w:basedOn w:val="Standardskrifttypeiafsnit"/>
     <w:uiPriority w:val="32"/>
     <w:qFormat/>
     <w:rsid w:val="0096029D"/>
@@ -6994,7 +7583,7 @@
   </w:style>
   <w:style w:type="character" w:styleId="Hyperlink">
     <w:name w:val="Hyperlink"/>
-    <w:basedOn w:val="DefaultParagraphFont"/>
+    <w:basedOn w:val="Standardskrifttypeiafsnit"/>
     <w:uiPriority w:val="99"/>
     <w:unhideWhenUsed/>
     <w:rsid w:val="003F2998"/>
@@ -7003,9 +7592,9 @@
       <w:u w:val="single"/>
     </w:rPr>
   </w:style>
-  <w:style w:type="character" w:styleId="UnresolvedMention">
+  <w:style w:type="character" w:styleId="Ulstomtale">
     <w:name w:val="Unresolved Mention"/>
-    <w:basedOn w:val="DefaultParagraphFont"/>
+    <w:basedOn w:val="Standardskrifttypeiafsnit"/>
     <w:uiPriority w:val="99"/>
     <w:semiHidden/>
     <w:unhideWhenUsed/>

</xml_diff>